<commit_message>
feat(ai-engine): add deterministic analysis workers
</commit_message>
<xml_diff>
--- a/docs/ATEP_Volume_IX_AI_Test_Engineer_Engineering_Workbook.docx
+++ b/docs/ATEP_Volume_IX_AI_Test_Engineer_Engineering_Workbook.docx
@@ -19,12 +19,12 @@
         <w:rPr>
           <w:b/>
         </w:rPr>
-        <w:t>Version 0.1.0  Provider Neutral Foundation</w:t>
+        <w:t>Version 0.2.0  Deterministic Analysis Workers</w:t>
       </w:r>
     </w:p>
     <w:p>
       <w:r>
-        <w:t>This workbook records the first governed AI boundary for ATEP. IX-1 captures analysis intent without invoking a model, requiring a paid service, downloading model weights, or using a GPU.</w:t>
+        <w:t>This workbook records the governed AI boundary and deterministic analysis worker for ATEP. IX-1 captures analysis intent and IX-2 produces structured advisory results without a paid service, model download, network call, or GPU.</w:t>
       </w:r>
     </w:p>
     <w:tbl>
@@ -96,7 +96,7 @@
           </w:tcPr>
           <w:p>
             <w:r>
-              <w:t>IX-1 implemented</w:t>
+              <w:t>IX-1 and IX-2 implemented</w:t>
             </w:r>
           </w:p>
         </w:tc>
@@ -141,7 +141,7 @@
           </w:tcPr>
           <w:p>
             <w:r>
-              <w:t>Migration</w:t>
+              <w:t>Migrations</w:t>
             </w:r>
           </w:p>
         </w:tc>
@@ -152,7 +152,7 @@
           </w:tcPr>
           <w:p>
             <w:r>
-              <w:t>0057_ai_analysis_foundation</w:t>
+              <w:t>0057 foundation and 0059 workers</w:t>
             </w:r>
           </w:p>
         </w:tc>
@@ -181,7 +181,7 @@
           </w:tcPr>
           <w:p>
             <w:r>
-              <w:t>IX-2 deterministic local analysis workers</w:t>
+              <w:t>IX-3 log intelligence</w:t>
             </w:r>
           </w:p>
         </w:tc>
@@ -198,7 +198,7 @@
     </w:p>
     <w:p>
       <w:r>
-        <w:t>FastAPI accepts bounded provider-neutral requests. A domain service applies idempotency and data-classification policy. PostgreSQL preserves queued intent, while RBAC, audit, and outbox evidence provide a traceable boundary. Model execution deliberately follows in IX-2.</w:t>
+        <w:t>FastAPI accepts bounded provider-neutral requests. A domain service applies idempotency and data-classification policy. PostgreSQL preserves queued intent, while RBAC, audit, and outbox evidence provide a traceable boundary. A synchronous application worker uses versioned local rules behind the same interface reserved for future adapters.</w:t>
       </w:r>
     </w:p>
     <w:tbl>
@@ -326,7 +326,7 @@
           </w:tcPr>
           <w:p>
             <w:r>
-              <w:t>Immutable request intent and status</w:t>
+              <w:t>Immutable request intent, attempts, results, and lifecycle</w:t>
             </w:r>
           </w:p>
         </w:tc>
@@ -343,7 +343,7 @@
           </w:tcPr>
           <w:p>
             <w:r>
-              <w:t>Future worker</w:t>
+              <w:t>Local worker</w:t>
             </w:r>
           </w:p>
         </w:tc>
@@ -355,7 +355,34 @@
           </w:tcPr>
           <w:p>
             <w:r>
-              <w:t>Local rules first, optional provider adapters later</w:t>
+              <w:t>Deterministic versioned rules and safe failure handling</w:t>
+            </w:r>
+          </w:p>
+        </w:tc>
+      </w:tr>
+      <w:tr>
+        <w:trPr>
+          <w:cantSplit/>
+        </w:trPr>
+        <w:tc>
+          <w:tcPr>
+            <w:tcW w:type="dxa" w:w="2448"/>
+            <w:vAlign w:val="center"/>
+          </w:tcPr>
+          <w:p>
+            <w:r>
+              <w:t>Adapter boundary</w:t>
+            </w:r>
+          </w:p>
+        </w:tc>
+        <w:tc>
+          <w:tcPr>
+            <w:tcW w:type="dxa" w:w="7344"/>
+            <w:vAlign w:val="center"/>
+          </w:tcPr>
+          <w:p>
+            <w:r>
+              <w:t>Common interface with unknown providers disabled</w:t>
             </w:r>
           </w:p>
         </w:tc>
@@ -765,7 +792,7 @@
           </w:tcPr>
           <w:p>
             <w:r>
-              <w:t>IX-1 creates queued requests; IX-2 owns execution and results</w:t>
+              <w:t>Queued, running, succeeded, or failed with three attempts maximum</w:t>
             </w:r>
           </w:p>
         </w:tc>
@@ -777,7 +804,295 @@
         <w:pStyle w:val="Heading1"/>
       </w:pPr>
       <w:r>
-        <w:t>4 Verification Catalogue</w:t>
+        <w:t>4 Deterministic Worker</w:t>
+      </w:r>
+    </w:p>
+    <w:p>
+      <w:r>
+        <w:t>The local-rules-v1 adapter evaluates only structured facts supplied in the governed request. It identifies DTC presence, positive failure counts, and failed performance thresholds. A no-match result states that no deterministic signal was found instead of inventing a conclusion.</w:t>
+      </w:r>
+    </w:p>
+    <w:tbl>
+      <w:tblPr>
+        <w:tblStyle w:val="TableGrid"/>
+        <w:tblW w:type="auto" w:w="0"/>
+        <w:tblLook w:firstColumn="1" w:firstRow="1" w:lastColumn="0" w:lastRow="0" w:noHBand="0" w:noVBand="1" w:val="04A0"/>
+      </w:tblPr>
+      <w:tblGrid>
+        <w:gridCol w:w="3360"/>
+        <w:gridCol w:w="3360"/>
+        <w:gridCol w:w="3360"/>
+      </w:tblGrid>
+      <w:tr>
+        <w:trPr>
+          <w:tblHeader w:val="true"/>
+        </w:trPr>
+        <w:tc>
+          <w:tcPr>
+            <w:tcW w:type="dxa" w:w="2232"/>
+            <w:shd w:fill="1F4E78"/>
+            <w:vAlign w:val="center"/>
+          </w:tcPr>
+          <w:p>
+            <w:r>
+              <w:rPr>
+                <w:b/>
+                <w:color w:val="FFFFFF"/>
+              </w:rPr>
+              <w:t>Control</w:t>
+            </w:r>
+          </w:p>
+        </w:tc>
+        <w:tc>
+          <w:tcPr>
+            <w:tcW w:type="dxa" w:w="2952"/>
+            <w:shd w:fill="1F4E78"/>
+            <w:vAlign w:val="center"/>
+          </w:tcPr>
+          <w:p>
+            <w:r>
+              <w:rPr>
+                <w:b/>
+                <w:color w:val="FFFFFF"/>
+              </w:rPr>
+              <w:t>Bound</w:t>
+            </w:r>
+          </w:p>
+        </w:tc>
+        <w:tc>
+          <w:tcPr>
+            <w:tcW w:type="dxa" w:w="4608"/>
+            <w:shd w:fill="1F4E78"/>
+            <w:vAlign w:val="center"/>
+          </w:tcPr>
+          <w:p>
+            <w:r>
+              <w:rPr>
+                <w:b/>
+                <w:color w:val="FFFFFF"/>
+              </w:rPr>
+              <w:t>Engineering purpose</w:t>
+            </w:r>
+          </w:p>
+        </w:tc>
+      </w:tr>
+      <w:tr>
+        <w:trPr>
+          <w:cantSplit/>
+        </w:trPr>
+        <w:tc>
+          <w:tcPr>
+            <w:tcW w:type="dxa" w:w="2232"/>
+            <w:vAlign w:val="center"/>
+          </w:tcPr>
+          <w:p>
+            <w:r>
+              <w:t>Attempts</w:t>
+            </w:r>
+          </w:p>
+        </w:tc>
+        <w:tc>
+          <w:tcPr>
+            <w:tcW w:type="dxa" w:w="2952"/>
+            <w:vAlign w:val="center"/>
+          </w:tcPr>
+          <w:p>
+            <w:r>
+              <w:t>Three per request</w:t>
+            </w:r>
+          </w:p>
+        </w:tc>
+        <w:tc>
+          <w:tcPr>
+            <w:tcW w:type="dxa" w:w="4608"/>
+            <w:vAlign w:val="center"/>
+          </w:tcPr>
+          <w:p>
+            <w:r>
+              <w:t>Bound retries and resource exposure</w:t>
+            </w:r>
+          </w:p>
+        </w:tc>
+      </w:tr>
+      <w:tr>
+        <w:trPr>
+          <w:cantSplit/>
+        </w:trPr>
+        <w:tc>
+          <w:tcPr>
+            <w:tcW w:type="dxa" w:w="2232"/>
+            <w:vAlign w:val="center"/>
+            <w:shd w:fill="EAF1F8"/>
+          </w:tcPr>
+          <w:p>
+            <w:r>
+              <w:t>Execution identity</w:t>
+            </w:r>
+          </w:p>
+        </w:tc>
+        <w:tc>
+          <w:tcPr>
+            <w:tcW w:type="dxa" w:w="2952"/>
+            <w:vAlign w:val="center"/>
+            <w:shd w:fill="EAF1F8"/>
+          </w:tcPr>
+          <w:p>
+            <w:r>
+              <w:t>Idempotent</w:t>
+            </w:r>
+          </w:p>
+        </w:tc>
+        <w:tc>
+          <w:tcPr>
+            <w:tcW w:type="dxa" w:w="4608"/>
+            <w:vAlign w:val="center"/>
+            <w:shd w:fill="EAF1F8"/>
+          </w:tcPr>
+          <w:p>
+            <w:r>
+              <w:t>Make worker delivery retry safe</w:t>
+            </w:r>
+          </w:p>
+        </w:tc>
+      </w:tr>
+      <w:tr>
+        <w:trPr>
+          <w:cantSplit/>
+        </w:trPr>
+        <w:tc>
+          <w:tcPr>
+            <w:tcW w:type="dxa" w:w="2232"/>
+            <w:vAlign w:val="center"/>
+          </w:tcPr>
+          <w:p>
+            <w:r>
+              <w:t>Evidence</w:t>
+            </w:r>
+          </w:p>
+        </w:tc>
+        <w:tc>
+          <w:tcPr>
+            <w:tcW w:type="dxa" w:w="2952"/>
+            <w:vAlign w:val="center"/>
+          </w:tcPr>
+          <w:p>
+            <w:r>
+              <w:t>Request references only</w:t>
+            </w:r>
+          </w:p>
+        </w:tc>
+        <w:tc>
+          <w:tcPr>
+            <w:tcW w:type="dxa" w:w="4608"/>
+            <w:vAlign w:val="center"/>
+          </w:tcPr>
+          <w:p>
+            <w:r>
+              <w:t>Keep conclusions reviewable</w:t>
+            </w:r>
+          </w:p>
+        </w:tc>
+      </w:tr>
+      <w:tr>
+        <w:trPr>
+          <w:cantSplit/>
+        </w:trPr>
+        <w:tc>
+          <w:tcPr>
+            <w:tcW w:type="dxa" w:w="2232"/>
+            <w:vAlign w:val="center"/>
+            <w:shd w:fill="EAF1F8"/>
+          </w:tcPr>
+          <w:p>
+            <w:r>
+              <w:t>Failure</w:t>
+            </w:r>
+          </w:p>
+        </w:tc>
+        <w:tc>
+          <w:tcPr>
+            <w:tcW w:type="dxa" w:w="2952"/>
+            <w:vAlign w:val="center"/>
+            <w:shd w:fill="EAF1F8"/>
+          </w:tcPr>
+          <w:p>
+            <w:r>
+              <w:t>Stable adapter_failure</w:t>
+            </w:r>
+          </w:p>
+        </w:tc>
+        <w:tc>
+          <w:tcPr>
+            <w:tcW w:type="dxa" w:w="4608"/>
+            <w:vAlign w:val="center"/>
+            <w:shd w:fill="EAF1F8"/>
+          </w:tcPr>
+          <w:p>
+            <w:r>
+              <w:t>Avoid leaking internal exception details</w:t>
+            </w:r>
+          </w:p>
+        </w:tc>
+      </w:tr>
+      <w:tr>
+        <w:trPr>
+          <w:cantSplit/>
+        </w:trPr>
+        <w:tc>
+          <w:tcPr>
+            <w:tcW w:type="dxa" w:w="2232"/>
+            <w:vAlign w:val="center"/>
+          </w:tcPr>
+          <w:p>
+            <w:r>
+              <w:t>Authority</w:t>
+            </w:r>
+          </w:p>
+        </w:tc>
+        <w:tc>
+          <w:tcPr>
+            <w:tcW w:type="dxa" w:w="2952"/>
+            <w:vAlign w:val="center"/>
+          </w:tcPr>
+          <w:p>
+            <w:r>
+              <w:t>Advisory output</w:t>
+            </w:r>
+          </w:p>
+        </w:tc>
+        <w:tc>
+          <w:tcPr>
+            <w:tcW w:type="dxa" w:w="4608"/>
+            <w:vAlign w:val="center"/>
+          </w:tcPr>
+          <w:p>
+            <w:r>
+              <w:t>Prevent direct state mutation</w:t>
+            </w:r>
+          </w:p>
+        </w:tc>
+      </w:tr>
+    </w:tbl>
+    <w:p/>
+    <w:p>
+      <w:pPr>
+        <w:pStyle w:val="Heading1"/>
+      </w:pPr>
+      <w:r>
+        <w:t>5 Provider Policy and Cost</w:t>
+      </w:r>
+    </w:p>
+    <w:p>
+      <w:r>
+        <w:t>Only local-rules is enabled. Unknown providers are rejected before execution. Future external adapters must satisfy the request provider policy and data classification; restricted data can never leave the local boundary. IX-2 requires no API key, model, cloud account, network access, paid service, or GPU.</w:t>
+      </w:r>
+    </w:p>
+    <w:p>
+      <w:pPr>
+        <w:pStyle w:val="Heading1"/>
+      </w:pPr>
+      <w:r>
+        <w:t>6 Verification Catalogue</w:t>
       </w:r>
     </w:p>
     <w:tbl>
@@ -1022,6 +1337,118 @@
           </w:p>
         </w:tc>
       </w:tr>
+      <w:tr>
+        <w:trPr>
+          <w:cantSplit/>
+        </w:trPr>
+        <w:tc>
+          <w:tcPr>
+            <w:tcW w:type="dxa" w:w="2016"/>
+            <w:vAlign w:val="center"/>
+            <w:shd w:fill="EAF1F8"/>
+          </w:tcPr>
+          <w:p>
+            <w:r>
+              <w:t>AI-T-008 to 009</w:t>
+            </w:r>
+          </w:p>
+        </w:tc>
+        <w:tc>
+          <w:tcPr>
+            <w:tcW w:type="dxa" w:w="7776"/>
+            <w:vAlign w:val="center"/>
+            <w:shd w:fill="EAF1F8"/>
+          </w:tcPr>
+          <w:p>
+            <w:r>
+              <w:t>Verify deterministic rules and complete lifecycle</w:t>
+            </w:r>
+          </w:p>
+        </w:tc>
+      </w:tr>
+      <w:tr>
+        <w:trPr>
+          <w:cantSplit/>
+        </w:trPr>
+        <w:tc>
+          <w:tcPr>
+            <w:tcW w:type="dxa" w:w="2016"/>
+            <w:vAlign w:val="center"/>
+          </w:tcPr>
+          <w:p>
+            <w:r>
+              <w:t>AI-T-010 to 011</w:t>
+            </w:r>
+          </w:p>
+        </w:tc>
+        <w:tc>
+          <w:tcPr>
+            <w:tcW w:type="dxa" w:w="7776"/>
+            <w:vAlign w:val="center"/>
+          </w:tcPr>
+          <w:p>
+            <w:r>
+              <w:t>Verify retries, replay, adapter policy, and conflicts</w:t>
+            </w:r>
+          </w:p>
+        </w:tc>
+      </w:tr>
+      <w:tr>
+        <w:trPr>
+          <w:cantSplit/>
+        </w:trPr>
+        <w:tc>
+          <w:tcPr>
+            <w:tcW w:type="dxa" w:w="2016"/>
+            <w:vAlign w:val="center"/>
+            <w:shd w:fill="EAF1F8"/>
+          </w:tcPr>
+          <w:p>
+            <w:r>
+              <w:t>AI-T-012 to 013</w:t>
+            </w:r>
+          </w:p>
+        </w:tc>
+        <w:tc>
+          <w:tcPr>
+            <w:tcW w:type="dxa" w:w="7776"/>
+            <w:vAlign w:val="center"/>
+            <w:shd w:fill="EAF1F8"/>
+          </w:tcPr>
+          <w:p>
+            <w:r>
+              <w:t>Verify cited output, minimized evidence, API, and RBAC</w:t>
+            </w:r>
+          </w:p>
+        </w:tc>
+      </w:tr>
+      <w:tr>
+        <w:trPr>
+          <w:cantSplit/>
+        </w:trPr>
+        <w:tc>
+          <w:tcPr>
+            <w:tcW w:type="dxa" w:w="2016"/>
+            <w:vAlign w:val="center"/>
+          </w:tcPr>
+          <w:p>
+            <w:r>
+              <w:t>AI-T-014</w:t>
+            </w:r>
+          </w:p>
+        </w:tc>
+        <w:tc>
+          <w:tcPr>
+            <w:tcW w:type="dxa" w:w="7776"/>
+            <w:vAlign w:val="center"/>
+          </w:tcPr>
+          <w:p>
+            <w:r>
+              <w:t>Apply migration 0059 through hosted Docker integration</w:t>
+            </w:r>
+          </w:p>
+        </w:tc>
+      </w:tr>
     </w:tbl>
     <w:p/>
     <w:p>
@@ -1029,7 +1456,7 @@
         <w:pStyle w:val="Heading1"/>
       </w:pPr>
       <w:r>
-        <w:t>5 Risks and Next Development</w:t>
+        <w:t>7 Risks and Next Development</w:t>
       </w:r>
     </w:p>
     <w:tbl>
@@ -1186,7 +1613,7 @@
           </w:tcPr>
           <w:p>
             <w:r>
-              <w:t>No model or GPU in IX-1</w:t>
+              <w:t>No model or GPU in IX-1 or IX-2</w:t>
             </w:r>
           </w:p>
         </w:tc>
@@ -1218,11 +1645,67 @@
           </w:p>
         </w:tc>
       </w:tr>
+      <w:tr>
+        <w:trPr>
+          <w:cantSplit/>
+        </w:trPr>
+        <w:tc>
+          <w:tcPr>
+            <w:tcW w:type="dxa" w:w="3168"/>
+            <w:vAlign w:val="center"/>
+            <w:shd w:fill="EAF1F8"/>
+          </w:tcPr>
+          <w:p>
+            <w:r>
+              <w:t>Unbounded retries</w:t>
+            </w:r>
+          </w:p>
+        </w:tc>
+        <w:tc>
+          <w:tcPr>
+            <w:tcW w:type="dxa" w:w="6624"/>
+            <w:vAlign w:val="center"/>
+            <w:shd w:fill="EAF1F8"/>
+          </w:tcPr>
+          <w:p>
+            <w:r>
+              <w:t>Three immutable attempts maximum</w:t>
+            </w:r>
+          </w:p>
+        </w:tc>
+      </w:tr>
+      <w:tr>
+        <w:trPr>
+          <w:cantSplit/>
+        </w:trPr>
+        <w:tc>
+          <w:tcPr>
+            <w:tcW w:type="dxa" w:w="3168"/>
+            <w:vAlign w:val="center"/>
+          </w:tcPr>
+          <w:p>
+            <w:r>
+              <w:t>Worker exception leakage</w:t>
+            </w:r>
+          </w:p>
+        </w:tc>
+        <w:tc>
+          <w:tcPr>
+            <w:tcW w:type="dxa" w:w="6624"/>
+            <w:vAlign w:val="center"/>
+          </w:tcPr>
+          <w:p>
+            <w:r>
+              <w:t>Stable error code without exception text</w:t>
+            </w:r>
+          </w:p>
+        </w:tc>
+      </w:tr>
     </w:tbl>
     <w:p/>
     <w:p>
       <w:r>
-        <w:t>IX-2 will add deterministic local rules, worker lifecycle, retries, and result contracts before any optional LLM adapter. This order keeps the platform testable, free to run, and provider neutral.</w:t>
+        <w:t>IX-3 will add bounded log parsing, clustering, event timelines, anomaly evidence, and grounded failure explanations. It will preserve the local-first, provider-neutral, advisory-only boundary established here.</w:t>
       </w:r>
     </w:p>
     <w:sectPr>

</xml_diff>

<commit_message>
feat(ai-engine): add deterministic analysis workers (#99)
</commit_message>
<xml_diff>
--- a/docs/ATEP_Volume_IX_AI_Test_Engineer_Engineering_Workbook.docx
+++ b/docs/ATEP_Volume_IX_AI_Test_Engineer_Engineering_Workbook.docx
@@ -19,12 +19,12 @@
         <w:rPr>
           <w:b/>
         </w:rPr>
-        <w:t>Version 0.1.0  Provider Neutral Foundation</w:t>
+        <w:t>Version 0.2.0  Deterministic Analysis Workers</w:t>
       </w:r>
     </w:p>
     <w:p>
       <w:r>
-        <w:t>This workbook records the first governed AI boundary for ATEP. IX-1 captures analysis intent without invoking a model, requiring a paid service, downloading model weights, or using a GPU.</w:t>
+        <w:t>This workbook records the governed AI boundary and deterministic analysis worker for ATEP. IX-1 captures analysis intent and IX-2 produces structured advisory results without a paid service, model download, network call, or GPU.</w:t>
       </w:r>
     </w:p>
     <w:tbl>
@@ -96,7 +96,7 @@
           </w:tcPr>
           <w:p>
             <w:r>
-              <w:t>IX-1 implemented</w:t>
+              <w:t>IX-1 and IX-2 implemented</w:t>
             </w:r>
           </w:p>
         </w:tc>
@@ -141,7 +141,7 @@
           </w:tcPr>
           <w:p>
             <w:r>
-              <w:t>Migration</w:t>
+              <w:t>Migrations</w:t>
             </w:r>
           </w:p>
         </w:tc>
@@ -152,7 +152,7 @@
           </w:tcPr>
           <w:p>
             <w:r>
-              <w:t>0057_ai_analysis_foundation</w:t>
+              <w:t>0057 foundation and 0059 workers</w:t>
             </w:r>
           </w:p>
         </w:tc>
@@ -181,7 +181,7 @@
           </w:tcPr>
           <w:p>
             <w:r>
-              <w:t>IX-2 deterministic local analysis workers</w:t>
+              <w:t>IX-3 log intelligence</w:t>
             </w:r>
           </w:p>
         </w:tc>
@@ -198,7 +198,7 @@
     </w:p>
     <w:p>
       <w:r>
-        <w:t>FastAPI accepts bounded provider-neutral requests. A domain service applies idempotency and data-classification policy. PostgreSQL preserves queued intent, while RBAC, audit, and outbox evidence provide a traceable boundary. Model execution deliberately follows in IX-2.</w:t>
+        <w:t>FastAPI accepts bounded provider-neutral requests. A domain service applies idempotency and data-classification policy. PostgreSQL preserves queued intent, while RBAC, audit, and outbox evidence provide a traceable boundary. A synchronous application worker uses versioned local rules behind the same interface reserved for future adapters.</w:t>
       </w:r>
     </w:p>
     <w:tbl>
@@ -326,7 +326,7 @@
           </w:tcPr>
           <w:p>
             <w:r>
-              <w:t>Immutable request intent and status</w:t>
+              <w:t>Immutable request intent, attempts, results, and lifecycle</w:t>
             </w:r>
           </w:p>
         </w:tc>
@@ -343,7 +343,7 @@
           </w:tcPr>
           <w:p>
             <w:r>
-              <w:t>Future worker</w:t>
+              <w:t>Local worker</w:t>
             </w:r>
           </w:p>
         </w:tc>
@@ -355,7 +355,34 @@
           </w:tcPr>
           <w:p>
             <w:r>
-              <w:t>Local rules first, optional provider adapters later</w:t>
+              <w:t>Deterministic versioned rules and safe failure handling</w:t>
+            </w:r>
+          </w:p>
+        </w:tc>
+      </w:tr>
+      <w:tr>
+        <w:trPr>
+          <w:cantSplit/>
+        </w:trPr>
+        <w:tc>
+          <w:tcPr>
+            <w:tcW w:type="dxa" w:w="2448"/>
+            <w:vAlign w:val="center"/>
+          </w:tcPr>
+          <w:p>
+            <w:r>
+              <w:t>Adapter boundary</w:t>
+            </w:r>
+          </w:p>
+        </w:tc>
+        <w:tc>
+          <w:tcPr>
+            <w:tcW w:type="dxa" w:w="7344"/>
+            <w:vAlign w:val="center"/>
+          </w:tcPr>
+          <w:p>
+            <w:r>
+              <w:t>Common interface with unknown providers disabled</w:t>
             </w:r>
           </w:p>
         </w:tc>
@@ -765,7 +792,7 @@
           </w:tcPr>
           <w:p>
             <w:r>
-              <w:t>IX-1 creates queued requests; IX-2 owns execution and results</w:t>
+              <w:t>Queued, running, succeeded, or failed with three attempts maximum</w:t>
             </w:r>
           </w:p>
         </w:tc>
@@ -777,7 +804,295 @@
         <w:pStyle w:val="Heading1"/>
       </w:pPr>
       <w:r>
-        <w:t>4 Verification Catalogue</w:t>
+        <w:t>4 Deterministic Worker</w:t>
+      </w:r>
+    </w:p>
+    <w:p>
+      <w:r>
+        <w:t>The local-rules-v1 adapter evaluates only structured facts supplied in the governed request. It identifies DTC presence, positive failure counts, and failed performance thresholds. A no-match result states that no deterministic signal was found instead of inventing a conclusion.</w:t>
+      </w:r>
+    </w:p>
+    <w:tbl>
+      <w:tblPr>
+        <w:tblStyle w:val="TableGrid"/>
+        <w:tblW w:type="auto" w:w="0"/>
+        <w:tblLook w:firstColumn="1" w:firstRow="1" w:lastColumn="0" w:lastRow="0" w:noHBand="0" w:noVBand="1" w:val="04A0"/>
+      </w:tblPr>
+      <w:tblGrid>
+        <w:gridCol w:w="3360"/>
+        <w:gridCol w:w="3360"/>
+        <w:gridCol w:w="3360"/>
+      </w:tblGrid>
+      <w:tr>
+        <w:trPr>
+          <w:tblHeader w:val="true"/>
+        </w:trPr>
+        <w:tc>
+          <w:tcPr>
+            <w:tcW w:type="dxa" w:w="2232"/>
+            <w:shd w:fill="1F4E78"/>
+            <w:vAlign w:val="center"/>
+          </w:tcPr>
+          <w:p>
+            <w:r>
+              <w:rPr>
+                <w:b/>
+                <w:color w:val="FFFFFF"/>
+              </w:rPr>
+              <w:t>Control</w:t>
+            </w:r>
+          </w:p>
+        </w:tc>
+        <w:tc>
+          <w:tcPr>
+            <w:tcW w:type="dxa" w:w="2952"/>
+            <w:shd w:fill="1F4E78"/>
+            <w:vAlign w:val="center"/>
+          </w:tcPr>
+          <w:p>
+            <w:r>
+              <w:rPr>
+                <w:b/>
+                <w:color w:val="FFFFFF"/>
+              </w:rPr>
+              <w:t>Bound</w:t>
+            </w:r>
+          </w:p>
+        </w:tc>
+        <w:tc>
+          <w:tcPr>
+            <w:tcW w:type="dxa" w:w="4608"/>
+            <w:shd w:fill="1F4E78"/>
+            <w:vAlign w:val="center"/>
+          </w:tcPr>
+          <w:p>
+            <w:r>
+              <w:rPr>
+                <w:b/>
+                <w:color w:val="FFFFFF"/>
+              </w:rPr>
+              <w:t>Engineering purpose</w:t>
+            </w:r>
+          </w:p>
+        </w:tc>
+      </w:tr>
+      <w:tr>
+        <w:trPr>
+          <w:cantSplit/>
+        </w:trPr>
+        <w:tc>
+          <w:tcPr>
+            <w:tcW w:type="dxa" w:w="2232"/>
+            <w:vAlign w:val="center"/>
+          </w:tcPr>
+          <w:p>
+            <w:r>
+              <w:t>Attempts</w:t>
+            </w:r>
+          </w:p>
+        </w:tc>
+        <w:tc>
+          <w:tcPr>
+            <w:tcW w:type="dxa" w:w="2952"/>
+            <w:vAlign w:val="center"/>
+          </w:tcPr>
+          <w:p>
+            <w:r>
+              <w:t>Three per request</w:t>
+            </w:r>
+          </w:p>
+        </w:tc>
+        <w:tc>
+          <w:tcPr>
+            <w:tcW w:type="dxa" w:w="4608"/>
+            <w:vAlign w:val="center"/>
+          </w:tcPr>
+          <w:p>
+            <w:r>
+              <w:t>Bound retries and resource exposure</w:t>
+            </w:r>
+          </w:p>
+        </w:tc>
+      </w:tr>
+      <w:tr>
+        <w:trPr>
+          <w:cantSplit/>
+        </w:trPr>
+        <w:tc>
+          <w:tcPr>
+            <w:tcW w:type="dxa" w:w="2232"/>
+            <w:vAlign w:val="center"/>
+            <w:shd w:fill="EAF1F8"/>
+          </w:tcPr>
+          <w:p>
+            <w:r>
+              <w:t>Execution identity</w:t>
+            </w:r>
+          </w:p>
+        </w:tc>
+        <w:tc>
+          <w:tcPr>
+            <w:tcW w:type="dxa" w:w="2952"/>
+            <w:vAlign w:val="center"/>
+            <w:shd w:fill="EAF1F8"/>
+          </w:tcPr>
+          <w:p>
+            <w:r>
+              <w:t>Idempotent</w:t>
+            </w:r>
+          </w:p>
+        </w:tc>
+        <w:tc>
+          <w:tcPr>
+            <w:tcW w:type="dxa" w:w="4608"/>
+            <w:vAlign w:val="center"/>
+            <w:shd w:fill="EAF1F8"/>
+          </w:tcPr>
+          <w:p>
+            <w:r>
+              <w:t>Make worker delivery retry safe</w:t>
+            </w:r>
+          </w:p>
+        </w:tc>
+      </w:tr>
+      <w:tr>
+        <w:trPr>
+          <w:cantSplit/>
+        </w:trPr>
+        <w:tc>
+          <w:tcPr>
+            <w:tcW w:type="dxa" w:w="2232"/>
+            <w:vAlign w:val="center"/>
+          </w:tcPr>
+          <w:p>
+            <w:r>
+              <w:t>Evidence</w:t>
+            </w:r>
+          </w:p>
+        </w:tc>
+        <w:tc>
+          <w:tcPr>
+            <w:tcW w:type="dxa" w:w="2952"/>
+            <w:vAlign w:val="center"/>
+          </w:tcPr>
+          <w:p>
+            <w:r>
+              <w:t>Request references only</w:t>
+            </w:r>
+          </w:p>
+        </w:tc>
+        <w:tc>
+          <w:tcPr>
+            <w:tcW w:type="dxa" w:w="4608"/>
+            <w:vAlign w:val="center"/>
+          </w:tcPr>
+          <w:p>
+            <w:r>
+              <w:t>Keep conclusions reviewable</w:t>
+            </w:r>
+          </w:p>
+        </w:tc>
+      </w:tr>
+      <w:tr>
+        <w:trPr>
+          <w:cantSplit/>
+        </w:trPr>
+        <w:tc>
+          <w:tcPr>
+            <w:tcW w:type="dxa" w:w="2232"/>
+            <w:vAlign w:val="center"/>
+            <w:shd w:fill="EAF1F8"/>
+          </w:tcPr>
+          <w:p>
+            <w:r>
+              <w:t>Failure</w:t>
+            </w:r>
+          </w:p>
+        </w:tc>
+        <w:tc>
+          <w:tcPr>
+            <w:tcW w:type="dxa" w:w="2952"/>
+            <w:vAlign w:val="center"/>
+            <w:shd w:fill="EAF1F8"/>
+          </w:tcPr>
+          <w:p>
+            <w:r>
+              <w:t>Stable adapter_failure</w:t>
+            </w:r>
+          </w:p>
+        </w:tc>
+        <w:tc>
+          <w:tcPr>
+            <w:tcW w:type="dxa" w:w="4608"/>
+            <w:vAlign w:val="center"/>
+            <w:shd w:fill="EAF1F8"/>
+          </w:tcPr>
+          <w:p>
+            <w:r>
+              <w:t>Avoid leaking internal exception details</w:t>
+            </w:r>
+          </w:p>
+        </w:tc>
+      </w:tr>
+      <w:tr>
+        <w:trPr>
+          <w:cantSplit/>
+        </w:trPr>
+        <w:tc>
+          <w:tcPr>
+            <w:tcW w:type="dxa" w:w="2232"/>
+            <w:vAlign w:val="center"/>
+          </w:tcPr>
+          <w:p>
+            <w:r>
+              <w:t>Authority</w:t>
+            </w:r>
+          </w:p>
+        </w:tc>
+        <w:tc>
+          <w:tcPr>
+            <w:tcW w:type="dxa" w:w="2952"/>
+            <w:vAlign w:val="center"/>
+          </w:tcPr>
+          <w:p>
+            <w:r>
+              <w:t>Advisory output</w:t>
+            </w:r>
+          </w:p>
+        </w:tc>
+        <w:tc>
+          <w:tcPr>
+            <w:tcW w:type="dxa" w:w="4608"/>
+            <w:vAlign w:val="center"/>
+          </w:tcPr>
+          <w:p>
+            <w:r>
+              <w:t>Prevent direct state mutation</w:t>
+            </w:r>
+          </w:p>
+        </w:tc>
+      </w:tr>
+    </w:tbl>
+    <w:p/>
+    <w:p>
+      <w:pPr>
+        <w:pStyle w:val="Heading1"/>
+      </w:pPr>
+      <w:r>
+        <w:t>5 Provider Policy and Cost</w:t>
+      </w:r>
+    </w:p>
+    <w:p>
+      <w:r>
+        <w:t>Only local-rules is enabled. Unknown providers are rejected before execution. Future external adapters must satisfy the request provider policy and data classification; restricted data can never leave the local boundary. IX-2 requires no API key, model, cloud account, network access, paid service, or GPU.</w:t>
+      </w:r>
+    </w:p>
+    <w:p>
+      <w:pPr>
+        <w:pStyle w:val="Heading1"/>
+      </w:pPr>
+      <w:r>
+        <w:t>6 Verification Catalogue</w:t>
       </w:r>
     </w:p>
     <w:tbl>
@@ -1022,6 +1337,118 @@
           </w:p>
         </w:tc>
       </w:tr>
+      <w:tr>
+        <w:trPr>
+          <w:cantSplit/>
+        </w:trPr>
+        <w:tc>
+          <w:tcPr>
+            <w:tcW w:type="dxa" w:w="2016"/>
+            <w:vAlign w:val="center"/>
+            <w:shd w:fill="EAF1F8"/>
+          </w:tcPr>
+          <w:p>
+            <w:r>
+              <w:t>AI-T-008 to 009</w:t>
+            </w:r>
+          </w:p>
+        </w:tc>
+        <w:tc>
+          <w:tcPr>
+            <w:tcW w:type="dxa" w:w="7776"/>
+            <w:vAlign w:val="center"/>
+            <w:shd w:fill="EAF1F8"/>
+          </w:tcPr>
+          <w:p>
+            <w:r>
+              <w:t>Verify deterministic rules and complete lifecycle</w:t>
+            </w:r>
+          </w:p>
+        </w:tc>
+      </w:tr>
+      <w:tr>
+        <w:trPr>
+          <w:cantSplit/>
+        </w:trPr>
+        <w:tc>
+          <w:tcPr>
+            <w:tcW w:type="dxa" w:w="2016"/>
+            <w:vAlign w:val="center"/>
+          </w:tcPr>
+          <w:p>
+            <w:r>
+              <w:t>AI-T-010 to 011</w:t>
+            </w:r>
+          </w:p>
+        </w:tc>
+        <w:tc>
+          <w:tcPr>
+            <w:tcW w:type="dxa" w:w="7776"/>
+            <w:vAlign w:val="center"/>
+          </w:tcPr>
+          <w:p>
+            <w:r>
+              <w:t>Verify retries, replay, adapter policy, and conflicts</w:t>
+            </w:r>
+          </w:p>
+        </w:tc>
+      </w:tr>
+      <w:tr>
+        <w:trPr>
+          <w:cantSplit/>
+        </w:trPr>
+        <w:tc>
+          <w:tcPr>
+            <w:tcW w:type="dxa" w:w="2016"/>
+            <w:vAlign w:val="center"/>
+            <w:shd w:fill="EAF1F8"/>
+          </w:tcPr>
+          <w:p>
+            <w:r>
+              <w:t>AI-T-012 to 013</w:t>
+            </w:r>
+          </w:p>
+        </w:tc>
+        <w:tc>
+          <w:tcPr>
+            <w:tcW w:type="dxa" w:w="7776"/>
+            <w:vAlign w:val="center"/>
+            <w:shd w:fill="EAF1F8"/>
+          </w:tcPr>
+          <w:p>
+            <w:r>
+              <w:t>Verify cited output, minimized evidence, API, and RBAC</w:t>
+            </w:r>
+          </w:p>
+        </w:tc>
+      </w:tr>
+      <w:tr>
+        <w:trPr>
+          <w:cantSplit/>
+        </w:trPr>
+        <w:tc>
+          <w:tcPr>
+            <w:tcW w:type="dxa" w:w="2016"/>
+            <w:vAlign w:val="center"/>
+          </w:tcPr>
+          <w:p>
+            <w:r>
+              <w:t>AI-T-014</w:t>
+            </w:r>
+          </w:p>
+        </w:tc>
+        <w:tc>
+          <w:tcPr>
+            <w:tcW w:type="dxa" w:w="7776"/>
+            <w:vAlign w:val="center"/>
+          </w:tcPr>
+          <w:p>
+            <w:r>
+              <w:t>Apply migration 0059 through hosted Docker integration</w:t>
+            </w:r>
+          </w:p>
+        </w:tc>
+      </w:tr>
     </w:tbl>
     <w:p/>
     <w:p>
@@ -1029,7 +1456,7 @@
         <w:pStyle w:val="Heading1"/>
       </w:pPr>
       <w:r>
-        <w:t>5 Risks and Next Development</w:t>
+        <w:t>7 Risks and Next Development</w:t>
       </w:r>
     </w:p>
     <w:tbl>
@@ -1186,7 +1613,7 @@
           </w:tcPr>
           <w:p>
             <w:r>
-              <w:t>No model or GPU in IX-1</w:t>
+              <w:t>No model or GPU in IX-1 or IX-2</w:t>
             </w:r>
           </w:p>
         </w:tc>
@@ -1218,11 +1645,67 @@
           </w:p>
         </w:tc>
       </w:tr>
+      <w:tr>
+        <w:trPr>
+          <w:cantSplit/>
+        </w:trPr>
+        <w:tc>
+          <w:tcPr>
+            <w:tcW w:type="dxa" w:w="3168"/>
+            <w:vAlign w:val="center"/>
+            <w:shd w:fill="EAF1F8"/>
+          </w:tcPr>
+          <w:p>
+            <w:r>
+              <w:t>Unbounded retries</w:t>
+            </w:r>
+          </w:p>
+        </w:tc>
+        <w:tc>
+          <w:tcPr>
+            <w:tcW w:type="dxa" w:w="6624"/>
+            <w:vAlign w:val="center"/>
+            <w:shd w:fill="EAF1F8"/>
+          </w:tcPr>
+          <w:p>
+            <w:r>
+              <w:t>Three immutable attempts maximum</w:t>
+            </w:r>
+          </w:p>
+        </w:tc>
+      </w:tr>
+      <w:tr>
+        <w:trPr>
+          <w:cantSplit/>
+        </w:trPr>
+        <w:tc>
+          <w:tcPr>
+            <w:tcW w:type="dxa" w:w="3168"/>
+            <w:vAlign w:val="center"/>
+          </w:tcPr>
+          <w:p>
+            <w:r>
+              <w:t>Worker exception leakage</w:t>
+            </w:r>
+          </w:p>
+        </w:tc>
+        <w:tc>
+          <w:tcPr>
+            <w:tcW w:type="dxa" w:w="6624"/>
+            <w:vAlign w:val="center"/>
+          </w:tcPr>
+          <w:p>
+            <w:r>
+              <w:t>Stable error code without exception text</w:t>
+            </w:r>
+          </w:p>
+        </w:tc>
+      </w:tr>
     </w:tbl>
     <w:p/>
     <w:p>
       <w:r>
-        <w:t>IX-2 will add deterministic local rules, worker lifecycle, retries, and result contracts before any optional LLM adapter. This order keeps the platform testable, free to run, and provider neutral.</w:t>
+        <w:t>IX-3 will add bounded log parsing, clustering, event timelines, anomaly evidence, and grounded failure explanations. It will preserve the local-first, provider-neutral, advisory-only boundary established here.</w:t>
       </w:r>
     </w:p>
     <w:sectPr>

</xml_diff>

<commit_message>
feat(ai-engine): add deterministic log intelligence
</commit_message>
<xml_diff>
--- a/docs/ATEP_Volume_IX_AI_Test_Engineer_Engineering_Workbook.docx
+++ b/docs/ATEP_Volume_IX_AI_Test_Engineer_Engineering_Workbook.docx
@@ -19,12 +19,12 @@
         <w:rPr>
           <w:b/>
         </w:rPr>
-        <w:t>Version 0.2.0  Deterministic Analysis Workers</w:t>
+        <w:t>Version 0.3.0  Deterministic Log Intelligence</w:t>
       </w:r>
     </w:p>
     <w:p>
       <w:r>
-        <w:t>This workbook records the governed AI boundary and deterministic analysis worker for ATEP. IX-1 captures analysis intent and IX-2 produces structured advisory results without a paid service, model download, network call, or GPU.</w:t>
+        <w:t>This workbook records the governed AI boundary and deterministic analysis worker for ATEP. IX-1 captures analysis intent, IX-2 produces structured advisory results, and IX-3 converts bounded logs into sanitized timelines and anomaly evidence without a paid service, model download, network call, or GPU.</w:t>
       </w:r>
     </w:p>
     <w:tbl>
@@ -96,7 +96,7 @@
           </w:tcPr>
           <w:p>
             <w:r>
-              <w:t>IX-1 and IX-2 implemented</w:t>
+              <w:t>IX-1 through IX-3 implemented</w:t>
             </w:r>
           </w:p>
         </w:tc>
@@ -152,7 +152,7 @@
           </w:tcPr>
           <w:p>
             <w:r>
-              <w:t>0057 foundation and 0059 workers</w:t>
+              <w:t>0057 foundation, 0059 workers, 0060 log intelligence</w:t>
             </w:r>
           </w:p>
         </w:tc>
@@ -181,7 +181,7 @@
           </w:tcPr>
           <w:p>
             <w:r>
-              <w:t>IX-3 log intelligence</w:t>
+              <w:t>IX-4 reviewed test generation</w:t>
             </w:r>
           </w:p>
         </w:tc>
@@ -383,6 +383,35 @@
           <w:p>
             <w:r>
               <w:t>Common interface with unknown providers disabled</w:t>
+            </w:r>
+          </w:p>
+        </w:tc>
+      </w:tr>
+      <w:tr>
+        <w:trPr>
+          <w:cantSplit/>
+        </w:trPr>
+        <w:tc>
+          <w:tcPr>
+            <w:tcW w:type="dxa" w:w="2448"/>
+            <w:vAlign w:val="center"/>
+            <w:shd w:fill="EAF1F8"/>
+          </w:tcPr>
+          <w:p>
+            <w:r>
+              <w:t>Log intelligence</w:t>
+            </w:r>
+          </w:p>
+        </w:tc>
+        <w:tc>
+          <w:tcPr>
+            <w:tcW w:type="dxa" w:w="7344"/>
+            <w:vAlign w:val="center"/>
+            <w:shd w:fill="EAF1F8"/>
+          </w:tcPr>
+          <w:p>
+            <w:r>
+              <w:t>Sanitization, timeline, clustering, anomalies, and explanation</w:t>
             </w:r>
           </w:p>
         </w:tc>
@@ -1092,7 +1121,287 @@
         <w:pStyle w:val="Heading1"/>
       </w:pPr>
       <w:r>
-        <w:t>6 Verification Catalogue</w:t>
+        <w:t>6 Log Intelligence</w:t>
+      </w:r>
+    </w:p>
+    <w:p>
+      <w:r>
+        <w:t>IX-3 accepts up to 500 timestamped lines, sanitizes sensitive values before persistence, orders timezone-aware events, and clusters messages after replacing volatile identifiers and numbers. Severe levels and repeated ten-second bursts become deterministic signals.</w:t>
+      </w:r>
+    </w:p>
+    <w:tbl>
+      <w:tblPr>
+        <w:tblStyle w:val="TableGrid"/>
+        <w:tblW w:type="auto" w:w="0"/>
+        <w:tblLook w:firstColumn="1" w:firstRow="1" w:lastColumn="0" w:lastRow="0" w:noHBand="0" w:noVBand="1" w:val="04A0"/>
+      </w:tblPr>
+      <w:tblGrid>
+        <w:gridCol w:w="3360"/>
+        <w:gridCol w:w="3360"/>
+        <w:gridCol w:w="3360"/>
+      </w:tblGrid>
+      <w:tr>
+        <w:trPr>
+          <w:tblHeader w:val="true"/>
+        </w:trPr>
+        <w:tc>
+          <w:tcPr>
+            <w:tcW w:type="dxa" w:w="2160"/>
+            <w:shd w:fill="1F4E78"/>
+            <w:vAlign w:val="center"/>
+          </w:tcPr>
+          <w:p>
+            <w:r>
+              <w:rPr>
+                <w:b/>
+                <w:color w:val="FFFFFF"/>
+              </w:rPr>
+              <w:t>Control</w:t>
+            </w:r>
+          </w:p>
+        </w:tc>
+        <w:tc>
+          <w:tcPr>
+            <w:tcW w:type="dxa" w:w="3096"/>
+            <w:shd w:fill="1F4E78"/>
+            <w:vAlign w:val="center"/>
+          </w:tcPr>
+          <w:p>
+            <w:r>
+              <w:rPr>
+                <w:b/>
+                <w:color w:val="FFFFFF"/>
+              </w:rPr>
+              <w:t>Bound</w:t>
+            </w:r>
+          </w:p>
+        </w:tc>
+        <w:tc>
+          <w:tcPr>
+            <w:tcW w:type="dxa" w:w="4536"/>
+            <w:shd w:fill="1F4E78"/>
+            <w:vAlign w:val="center"/>
+          </w:tcPr>
+          <w:p>
+            <w:r>
+              <w:rPr>
+                <w:b/>
+                <w:color w:val="FFFFFF"/>
+              </w:rPr>
+              <w:t>Engineering purpose</w:t>
+            </w:r>
+          </w:p>
+        </w:tc>
+      </w:tr>
+      <w:tr>
+        <w:trPr>
+          <w:cantSplit/>
+        </w:trPr>
+        <w:tc>
+          <w:tcPr>
+            <w:tcW w:type="dxa" w:w="2160"/>
+            <w:vAlign w:val="center"/>
+          </w:tcPr>
+          <w:p>
+            <w:r>
+              <w:t>Batch</w:t>
+            </w:r>
+          </w:p>
+        </w:tc>
+        <w:tc>
+          <w:tcPr>
+            <w:tcW w:type="dxa" w:w="3096"/>
+            <w:vAlign w:val="center"/>
+          </w:tcPr>
+          <w:p>
+            <w:r>
+              <w:t>500 lines and 256000 bytes</w:t>
+            </w:r>
+          </w:p>
+        </w:tc>
+        <w:tc>
+          <w:tcPr>
+            <w:tcW w:type="dxa" w:w="4536"/>
+            <w:vAlign w:val="center"/>
+          </w:tcPr>
+          <w:p>
+            <w:r>
+              <w:t>Bound memory and CPU exposure</w:t>
+            </w:r>
+          </w:p>
+        </w:tc>
+      </w:tr>
+      <w:tr>
+        <w:trPr>
+          <w:cantSplit/>
+        </w:trPr>
+        <w:tc>
+          <w:tcPr>
+            <w:tcW w:type="dxa" w:w="2160"/>
+            <w:vAlign w:val="center"/>
+            <w:shd w:fill="EAF1F8"/>
+          </w:tcPr>
+          <w:p>
+            <w:r>
+              <w:t>Timeline</w:t>
+            </w:r>
+          </w:p>
+        </w:tc>
+        <w:tc>
+          <w:tcPr>
+            <w:tcW w:type="dxa" w:w="3096"/>
+            <w:vAlign w:val="center"/>
+            <w:shd w:fill="EAF1F8"/>
+          </w:tcPr>
+          <w:p>
+            <w:r>
+              <w:t>Seven days</w:t>
+            </w:r>
+          </w:p>
+        </w:tc>
+        <w:tc>
+          <w:tcPr>
+            <w:tcW w:type="dxa" w:w="4536"/>
+            <w:vAlign w:val="center"/>
+            <w:shd w:fill="EAF1F8"/>
+          </w:tcPr>
+          <w:p>
+            <w:r>
+              <w:t>Prevent misleading unbounded correlation</w:t>
+            </w:r>
+          </w:p>
+        </w:tc>
+      </w:tr>
+      <w:tr>
+        <w:trPr>
+          <w:cantSplit/>
+        </w:trPr>
+        <w:tc>
+          <w:tcPr>
+            <w:tcW w:type="dxa" w:w="2160"/>
+            <w:vAlign w:val="center"/>
+          </w:tcPr>
+          <w:p>
+            <w:r>
+              <w:t>Sanitization</w:t>
+            </w:r>
+          </w:p>
+        </w:tc>
+        <w:tc>
+          <w:tcPr>
+            <w:tcW w:type="dxa" w:w="3096"/>
+            <w:vAlign w:val="center"/>
+          </w:tcPr>
+          <w:p>
+            <w:r>
+              <w:t>Credentials, email, and VIN</w:t>
+            </w:r>
+          </w:p>
+        </w:tc>
+        <w:tc>
+          <w:tcPr>
+            <w:tcW w:type="dxa" w:w="4536"/>
+            <w:vAlign w:val="center"/>
+          </w:tcPr>
+          <w:p>
+            <w:r>
+              <w:t>Reduce sensitive-data persistence</w:t>
+            </w:r>
+          </w:p>
+        </w:tc>
+      </w:tr>
+      <w:tr>
+        <w:trPr>
+          <w:cantSplit/>
+        </w:trPr>
+        <w:tc>
+          <w:tcPr>
+            <w:tcW w:type="dxa" w:w="2160"/>
+            <w:vAlign w:val="center"/>
+            <w:shd w:fill="EAF1F8"/>
+          </w:tcPr>
+          <w:p>
+            <w:r>
+              <w:t>Clustering</w:t>
+            </w:r>
+          </w:p>
+        </w:tc>
+        <w:tc>
+          <w:tcPr>
+            <w:tcW w:type="dxa" w:w="3096"/>
+            <w:vAlign w:val="center"/>
+            <w:shd w:fill="EAF1F8"/>
+          </w:tcPr>
+          <w:p>
+            <w:r>
+              <w:t>Normalized message fingerprint</w:t>
+            </w:r>
+          </w:p>
+        </w:tc>
+        <w:tc>
+          <w:tcPr>
+            <w:tcW w:type="dxa" w:w="4536"/>
+            <w:vAlign w:val="center"/>
+            <w:shd w:fill="EAF1F8"/>
+          </w:tcPr>
+          <w:p>
+            <w:r>
+              <w:t>Group changing IDs and values</w:t>
+            </w:r>
+          </w:p>
+        </w:tc>
+      </w:tr>
+      <w:tr>
+        <w:trPr>
+          <w:cantSplit/>
+        </w:trPr>
+        <w:tc>
+          <w:tcPr>
+            <w:tcW w:type="dxa" w:w="2160"/>
+            <w:vAlign w:val="center"/>
+          </w:tcPr>
+          <w:p>
+            <w:r>
+              <w:t>Explanation</w:t>
+            </w:r>
+          </w:p>
+        </w:tc>
+        <w:tc>
+          <w:tcPr>
+            <w:tcW w:type="dxa" w:w="3096"/>
+            <w:vAlign w:val="center"/>
+          </w:tcPr>
+          <w:p>
+            <w:r>
+              <w:t>Line numbers and evidence refs</w:t>
+            </w:r>
+          </w:p>
+        </w:tc>
+        <w:tc>
+          <w:tcPr>
+            <w:tcW w:type="dxa" w:w="4536"/>
+            <w:vAlign w:val="center"/>
+          </w:tcPr>
+          <w:p>
+            <w:r>
+              <w:t>Keep findings reviewable</w:t>
+            </w:r>
+          </w:p>
+        </w:tc>
+      </w:tr>
+    </w:tbl>
+    <w:p/>
+    <w:p>
+      <w:r>
+        <w:t>Unsupported lines are counted without preserving their content. Explanations describe observed structure, severity, and proximity and explicitly avoid claiming causality.</w:t>
+      </w:r>
+    </w:p>
+    <w:p>
+      <w:pPr>
+        <w:pStyle w:val="Heading1"/>
+      </w:pPr>
+      <w:r>
+        <w:t>7 Verification Catalogue</w:t>
       </w:r>
     </w:p>
     <w:tbl>
@@ -1449,6 +1758,118 @@
           </w:p>
         </w:tc>
       </w:tr>
+      <w:tr>
+        <w:trPr>
+          <w:cantSplit/>
+        </w:trPr>
+        <w:tc>
+          <w:tcPr>
+            <w:tcW w:type="dxa" w:w="2016"/>
+            <w:vAlign w:val="center"/>
+            <w:shd w:fill="EAF1F8"/>
+          </w:tcPr>
+          <w:p>
+            <w:r>
+              <w:t>AI-T-015 to 017</w:t>
+            </w:r>
+          </w:p>
+        </w:tc>
+        <w:tc>
+          <w:tcPr>
+            <w:tcW w:type="dxa" w:w="7776"/>
+            <w:vAlign w:val="center"/>
+            <w:shd w:fill="EAF1F8"/>
+          </w:tcPr>
+          <w:p>
+            <w:r>
+              <w:t>Verify parsing, sanitization, ordering, and clustering</w:t>
+            </w:r>
+          </w:p>
+        </w:tc>
+      </w:tr>
+      <w:tr>
+        <w:trPr>
+          <w:cantSplit/>
+        </w:trPr>
+        <w:tc>
+          <w:tcPr>
+            <w:tcW w:type="dxa" w:w="2016"/>
+            <w:vAlign w:val="center"/>
+          </w:tcPr>
+          <w:p>
+            <w:r>
+              <w:t>AI-T-018 to 019</w:t>
+            </w:r>
+          </w:p>
+        </w:tc>
+        <w:tc>
+          <w:tcPr>
+            <w:tcW w:type="dxa" w:w="7776"/>
+            <w:vAlign w:val="center"/>
+          </w:tcPr>
+          <w:p>
+            <w:r>
+              <w:t>Verify anomaly evidence and grounded explanations</w:t>
+            </w:r>
+          </w:p>
+        </w:tc>
+      </w:tr>
+      <w:tr>
+        <w:trPr>
+          <w:cantSplit/>
+        </w:trPr>
+        <w:tc>
+          <w:tcPr>
+            <w:tcW w:type="dxa" w:w="2016"/>
+            <w:vAlign w:val="center"/>
+            <w:shd w:fill="EAF1F8"/>
+          </w:tcPr>
+          <w:p>
+            <w:r>
+              <w:t>AI-T-020 to 021</w:t>
+            </w:r>
+          </w:p>
+        </w:tc>
+        <w:tc>
+          <w:tcPr>
+            <w:tcW w:type="dxa" w:w="7776"/>
+            <w:vAlign w:val="center"/>
+            <w:shd w:fill="EAF1F8"/>
+          </w:tcPr>
+          <w:p>
+            <w:r>
+              <w:t>Verify bounds, replay, APIs, RBAC, and minimized events</w:t>
+            </w:r>
+          </w:p>
+        </w:tc>
+      </w:tr>
+      <w:tr>
+        <w:trPr>
+          <w:cantSplit/>
+        </w:trPr>
+        <w:tc>
+          <w:tcPr>
+            <w:tcW w:type="dxa" w:w="2016"/>
+            <w:vAlign w:val="center"/>
+          </w:tcPr>
+          <w:p>
+            <w:r>
+              <w:t>AI-T-022</w:t>
+            </w:r>
+          </w:p>
+        </w:tc>
+        <w:tc>
+          <w:tcPr>
+            <w:tcW w:type="dxa" w:w="7776"/>
+            <w:vAlign w:val="center"/>
+          </w:tcPr>
+          <w:p>
+            <w:r>
+              <w:t>Apply migration 0060 through hosted Docker integration</w:t>
+            </w:r>
+          </w:p>
+        </w:tc>
+      </w:tr>
     </w:tbl>
     <w:p/>
     <w:p>
@@ -1456,7 +1877,7 @@
         <w:pStyle w:val="Heading1"/>
       </w:pPr>
       <w:r>
-        <w:t>7 Risks and Next Development</w:t>
+        <w:t>8 Risks and Next Development</w:t>
       </w:r>
     </w:p>
     <w:tbl>
@@ -1613,7 +2034,7 @@
           </w:tcPr>
           <w:p>
             <w:r>
-              <w:t>No model or GPU in IX-1 or IX-2</w:t>
+              <w:t>No model or GPU in IX-1 through IX-3</w:t>
             </w:r>
           </w:p>
         </w:tc>
@@ -1701,11 +2122,67 @@
           </w:p>
         </w:tc>
       </w:tr>
+      <w:tr>
+        <w:trPr>
+          <w:cantSplit/>
+        </w:trPr>
+        <w:tc>
+          <w:tcPr>
+            <w:tcW w:type="dxa" w:w="3168"/>
+            <w:vAlign w:val="center"/>
+            <w:shd w:fill="EAF1F8"/>
+          </w:tcPr>
+          <w:p>
+            <w:r>
+              <w:t>Sensitive log values</w:t>
+            </w:r>
+          </w:p>
+        </w:tc>
+        <w:tc>
+          <w:tcPr>
+            <w:tcW w:type="dxa" w:w="6624"/>
+            <w:vAlign w:val="center"/>
+            <w:shd w:fill="EAF1F8"/>
+          </w:tcPr>
+          <w:p>
+            <w:r>
+              <w:t>Sanitize before persistence and omit rejected text</w:t>
+            </w:r>
+          </w:p>
+        </w:tc>
+      </w:tr>
+      <w:tr>
+        <w:trPr>
+          <w:cantSplit/>
+        </w:trPr>
+        <w:tc>
+          <w:tcPr>
+            <w:tcW w:type="dxa" w:w="3168"/>
+            <w:vAlign w:val="center"/>
+          </w:tcPr>
+          <w:p>
+            <w:r>
+              <w:t>False causal claim</w:t>
+            </w:r>
+          </w:p>
+        </w:tc>
+        <w:tc>
+          <w:tcPr>
+            <w:tcW w:type="dxa" w:w="6624"/>
+            <w:vAlign w:val="center"/>
+          </w:tcPr>
+          <w:p>
+            <w:r>
+              <w:t>Report signals, citations, and explicit limitations</w:t>
+            </w:r>
+          </w:p>
+        </w:tc>
+      </w:tr>
     </w:tbl>
     <w:p/>
     <w:p>
       <w:r>
-        <w:t>IX-3 will add bounded log parsing, clustering, event timelines, anomaly evidence, and grounded failure explanations. It will preserve the local-first, provider-neutral, advisory-only boundary established here.</w:t>
+        <w:t>IX-4 will add requirement-aware test suggestions with human review, rejection evidence, and controlled promotion into the catalog. Generated content will remain inactive until an authorized reviewer accepts it.</w:t>
       </w:r>
     </w:p>
     <w:sectPr>

</xml_diff>

<commit_message>
feat(ai-engine): add deterministic log intelligence (#100)
</commit_message>
<xml_diff>
--- a/docs/ATEP_Volume_IX_AI_Test_Engineer_Engineering_Workbook.docx
+++ b/docs/ATEP_Volume_IX_AI_Test_Engineer_Engineering_Workbook.docx
@@ -19,12 +19,12 @@
         <w:rPr>
           <w:b/>
         </w:rPr>
-        <w:t>Version 0.2.0  Deterministic Analysis Workers</w:t>
+        <w:t>Version 0.3.0  Deterministic Log Intelligence</w:t>
       </w:r>
     </w:p>
     <w:p>
       <w:r>
-        <w:t>This workbook records the governed AI boundary and deterministic analysis worker for ATEP. IX-1 captures analysis intent and IX-2 produces structured advisory results without a paid service, model download, network call, or GPU.</w:t>
+        <w:t>This workbook records the governed AI boundary and deterministic analysis worker for ATEP. IX-1 captures analysis intent, IX-2 produces structured advisory results, and IX-3 converts bounded logs into sanitized timelines and anomaly evidence without a paid service, model download, network call, or GPU.</w:t>
       </w:r>
     </w:p>
     <w:tbl>
@@ -96,7 +96,7 @@
           </w:tcPr>
           <w:p>
             <w:r>
-              <w:t>IX-1 and IX-2 implemented</w:t>
+              <w:t>IX-1 through IX-3 implemented</w:t>
             </w:r>
           </w:p>
         </w:tc>
@@ -152,7 +152,7 @@
           </w:tcPr>
           <w:p>
             <w:r>
-              <w:t>0057 foundation and 0059 workers</w:t>
+              <w:t>0057 foundation, 0059 workers, 0060 log intelligence</w:t>
             </w:r>
           </w:p>
         </w:tc>
@@ -181,7 +181,7 @@
           </w:tcPr>
           <w:p>
             <w:r>
-              <w:t>IX-3 log intelligence</w:t>
+              <w:t>IX-4 reviewed test generation</w:t>
             </w:r>
           </w:p>
         </w:tc>
@@ -383,6 +383,35 @@
           <w:p>
             <w:r>
               <w:t>Common interface with unknown providers disabled</w:t>
+            </w:r>
+          </w:p>
+        </w:tc>
+      </w:tr>
+      <w:tr>
+        <w:trPr>
+          <w:cantSplit/>
+        </w:trPr>
+        <w:tc>
+          <w:tcPr>
+            <w:tcW w:type="dxa" w:w="2448"/>
+            <w:vAlign w:val="center"/>
+            <w:shd w:fill="EAF1F8"/>
+          </w:tcPr>
+          <w:p>
+            <w:r>
+              <w:t>Log intelligence</w:t>
+            </w:r>
+          </w:p>
+        </w:tc>
+        <w:tc>
+          <w:tcPr>
+            <w:tcW w:type="dxa" w:w="7344"/>
+            <w:vAlign w:val="center"/>
+            <w:shd w:fill="EAF1F8"/>
+          </w:tcPr>
+          <w:p>
+            <w:r>
+              <w:t>Sanitization, timeline, clustering, anomalies, and explanation</w:t>
             </w:r>
           </w:p>
         </w:tc>
@@ -1092,7 +1121,287 @@
         <w:pStyle w:val="Heading1"/>
       </w:pPr>
       <w:r>
-        <w:t>6 Verification Catalogue</w:t>
+        <w:t>6 Log Intelligence</w:t>
+      </w:r>
+    </w:p>
+    <w:p>
+      <w:r>
+        <w:t>IX-3 accepts up to 500 timestamped lines, sanitizes sensitive values before persistence, orders timezone-aware events, and clusters messages after replacing volatile identifiers and numbers. Severe levels and repeated ten-second bursts become deterministic signals.</w:t>
+      </w:r>
+    </w:p>
+    <w:tbl>
+      <w:tblPr>
+        <w:tblStyle w:val="TableGrid"/>
+        <w:tblW w:type="auto" w:w="0"/>
+        <w:tblLook w:firstColumn="1" w:firstRow="1" w:lastColumn="0" w:lastRow="0" w:noHBand="0" w:noVBand="1" w:val="04A0"/>
+      </w:tblPr>
+      <w:tblGrid>
+        <w:gridCol w:w="3360"/>
+        <w:gridCol w:w="3360"/>
+        <w:gridCol w:w="3360"/>
+      </w:tblGrid>
+      <w:tr>
+        <w:trPr>
+          <w:tblHeader w:val="true"/>
+        </w:trPr>
+        <w:tc>
+          <w:tcPr>
+            <w:tcW w:type="dxa" w:w="2160"/>
+            <w:shd w:fill="1F4E78"/>
+            <w:vAlign w:val="center"/>
+          </w:tcPr>
+          <w:p>
+            <w:r>
+              <w:rPr>
+                <w:b/>
+                <w:color w:val="FFFFFF"/>
+              </w:rPr>
+              <w:t>Control</w:t>
+            </w:r>
+          </w:p>
+        </w:tc>
+        <w:tc>
+          <w:tcPr>
+            <w:tcW w:type="dxa" w:w="3096"/>
+            <w:shd w:fill="1F4E78"/>
+            <w:vAlign w:val="center"/>
+          </w:tcPr>
+          <w:p>
+            <w:r>
+              <w:rPr>
+                <w:b/>
+                <w:color w:val="FFFFFF"/>
+              </w:rPr>
+              <w:t>Bound</w:t>
+            </w:r>
+          </w:p>
+        </w:tc>
+        <w:tc>
+          <w:tcPr>
+            <w:tcW w:type="dxa" w:w="4536"/>
+            <w:shd w:fill="1F4E78"/>
+            <w:vAlign w:val="center"/>
+          </w:tcPr>
+          <w:p>
+            <w:r>
+              <w:rPr>
+                <w:b/>
+                <w:color w:val="FFFFFF"/>
+              </w:rPr>
+              <w:t>Engineering purpose</w:t>
+            </w:r>
+          </w:p>
+        </w:tc>
+      </w:tr>
+      <w:tr>
+        <w:trPr>
+          <w:cantSplit/>
+        </w:trPr>
+        <w:tc>
+          <w:tcPr>
+            <w:tcW w:type="dxa" w:w="2160"/>
+            <w:vAlign w:val="center"/>
+          </w:tcPr>
+          <w:p>
+            <w:r>
+              <w:t>Batch</w:t>
+            </w:r>
+          </w:p>
+        </w:tc>
+        <w:tc>
+          <w:tcPr>
+            <w:tcW w:type="dxa" w:w="3096"/>
+            <w:vAlign w:val="center"/>
+          </w:tcPr>
+          <w:p>
+            <w:r>
+              <w:t>500 lines and 256000 bytes</w:t>
+            </w:r>
+          </w:p>
+        </w:tc>
+        <w:tc>
+          <w:tcPr>
+            <w:tcW w:type="dxa" w:w="4536"/>
+            <w:vAlign w:val="center"/>
+          </w:tcPr>
+          <w:p>
+            <w:r>
+              <w:t>Bound memory and CPU exposure</w:t>
+            </w:r>
+          </w:p>
+        </w:tc>
+      </w:tr>
+      <w:tr>
+        <w:trPr>
+          <w:cantSplit/>
+        </w:trPr>
+        <w:tc>
+          <w:tcPr>
+            <w:tcW w:type="dxa" w:w="2160"/>
+            <w:vAlign w:val="center"/>
+            <w:shd w:fill="EAF1F8"/>
+          </w:tcPr>
+          <w:p>
+            <w:r>
+              <w:t>Timeline</w:t>
+            </w:r>
+          </w:p>
+        </w:tc>
+        <w:tc>
+          <w:tcPr>
+            <w:tcW w:type="dxa" w:w="3096"/>
+            <w:vAlign w:val="center"/>
+            <w:shd w:fill="EAF1F8"/>
+          </w:tcPr>
+          <w:p>
+            <w:r>
+              <w:t>Seven days</w:t>
+            </w:r>
+          </w:p>
+        </w:tc>
+        <w:tc>
+          <w:tcPr>
+            <w:tcW w:type="dxa" w:w="4536"/>
+            <w:vAlign w:val="center"/>
+            <w:shd w:fill="EAF1F8"/>
+          </w:tcPr>
+          <w:p>
+            <w:r>
+              <w:t>Prevent misleading unbounded correlation</w:t>
+            </w:r>
+          </w:p>
+        </w:tc>
+      </w:tr>
+      <w:tr>
+        <w:trPr>
+          <w:cantSplit/>
+        </w:trPr>
+        <w:tc>
+          <w:tcPr>
+            <w:tcW w:type="dxa" w:w="2160"/>
+            <w:vAlign w:val="center"/>
+          </w:tcPr>
+          <w:p>
+            <w:r>
+              <w:t>Sanitization</w:t>
+            </w:r>
+          </w:p>
+        </w:tc>
+        <w:tc>
+          <w:tcPr>
+            <w:tcW w:type="dxa" w:w="3096"/>
+            <w:vAlign w:val="center"/>
+          </w:tcPr>
+          <w:p>
+            <w:r>
+              <w:t>Credentials, email, and VIN</w:t>
+            </w:r>
+          </w:p>
+        </w:tc>
+        <w:tc>
+          <w:tcPr>
+            <w:tcW w:type="dxa" w:w="4536"/>
+            <w:vAlign w:val="center"/>
+          </w:tcPr>
+          <w:p>
+            <w:r>
+              <w:t>Reduce sensitive-data persistence</w:t>
+            </w:r>
+          </w:p>
+        </w:tc>
+      </w:tr>
+      <w:tr>
+        <w:trPr>
+          <w:cantSplit/>
+        </w:trPr>
+        <w:tc>
+          <w:tcPr>
+            <w:tcW w:type="dxa" w:w="2160"/>
+            <w:vAlign w:val="center"/>
+            <w:shd w:fill="EAF1F8"/>
+          </w:tcPr>
+          <w:p>
+            <w:r>
+              <w:t>Clustering</w:t>
+            </w:r>
+          </w:p>
+        </w:tc>
+        <w:tc>
+          <w:tcPr>
+            <w:tcW w:type="dxa" w:w="3096"/>
+            <w:vAlign w:val="center"/>
+            <w:shd w:fill="EAF1F8"/>
+          </w:tcPr>
+          <w:p>
+            <w:r>
+              <w:t>Normalized message fingerprint</w:t>
+            </w:r>
+          </w:p>
+        </w:tc>
+        <w:tc>
+          <w:tcPr>
+            <w:tcW w:type="dxa" w:w="4536"/>
+            <w:vAlign w:val="center"/>
+            <w:shd w:fill="EAF1F8"/>
+          </w:tcPr>
+          <w:p>
+            <w:r>
+              <w:t>Group changing IDs and values</w:t>
+            </w:r>
+          </w:p>
+        </w:tc>
+      </w:tr>
+      <w:tr>
+        <w:trPr>
+          <w:cantSplit/>
+        </w:trPr>
+        <w:tc>
+          <w:tcPr>
+            <w:tcW w:type="dxa" w:w="2160"/>
+            <w:vAlign w:val="center"/>
+          </w:tcPr>
+          <w:p>
+            <w:r>
+              <w:t>Explanation</w:t>
+            </w:r>
+          </w:p>
+        </w:tc>
+        <w:tc>
+          <w:tcPr>
+            <w:tcW w:type="dxa" w:w="3096"/>
+            <w:vAlign w:val="center"/>
+          </w:tcPr>
+          <w:p>
+            <w:r>
+              <w:t>Line numbers and evidence refs</w:t>
+            </w:r>
+          </w:p>
+        </w:tc>
+        <w:tc>
+          <w:tcPr>
+            <w:tcW w:type="dxa" w:w="4536"/>
+            <w:vAlign w:val="center"/>
+          </w:tcPr>
+          <w:p>
+            <w:r>
+              <w:t>Keep findings reviewable</w:t>
+            </w:r>
+          </w:p>
+        </w:tc>
+      </w:tr>
+    </w:tbl>
+    <w:p/>
+    <w:p>
+      <w:r>
+        <w:t>Unsupported lines are counted without preserving their content. Explanations describe observed structure, severity, and proximity and explicitly avoid claiming causality.</w:t>
+      </w:r>
+    </w:p>
+    <w:p>
+      <w:pPr>
+        <w:pStyle w:val="Heading1"/>
+      </w:pPr>
+      <w:r>
+        <w:t>7 Verification Catalogue</w:t>
       </w:r>
     </w:p>
     <w:tbl>
@@ -1449,6 +1758,118 @@
           </w:p>
         </w:tc>
       </w:tr>
+      <w:tr>
+        <w:trPr>
+          <w:cantSplit/>
+        </w:trPr>
+        <w:tc>
+          <w:tcPr>
+            <w:tcW w:type="dxa" w:w="2016"/>
+            <w:vAlign w:val="center"/>
+            <w:shd w:fill="EAF1F8"/>
+          </w:tcPr>
+          <w:p>
+            <w:r>
+              <w:t>AI-T-015 to 017</w:t>
+            </w:r>
+          </w:p>
+        </w:tc>
+        <w:tc>
+          <w:tcPr>
+            <w:tcW w:type="dxa" w:w="7776"/>
+            <w:vAlign w:val="center"/>
+            <w:shd w:fill="EAF1F8"/>
+          </w:tcPr>
+          <w:p>
+            <w:r>
+              <w:t>Verify parsing, sanitization, ordering, and clustering</w:t>
+            </w:r>
+          </w:p>
+        </w:tc>
+      </w:tr>
+      <w:tr>
+        <w:trPr>
+          <w:cantSplit/>
+        </w:trPr>
+        <w:tc>
+          <w:tcPr>
+            <w:tcW w:type="dxa" w:w="2016"/>
+            <w:vAlign w:val="center"/>
+          </w:tcPr>
+          <w:p>
+            <w:r>
+              <w:t>AI-T-018 to 019</w:t>
+            </w:r>
+          </w:p>
+        </w:tc>
+        <w:tc>
+          <w:tcPr>
+            <w:tcW w:type="dxa" w:w="7776"/>
+            <w:vAlign w:val="center"/>
+          </w:tcPr>
+          <w:p>
+            <w:r>
+              <w:t>Verify anomaly evidence and grounded explanations</w:t>
+            </w:r>
+          </w:p>
+        </w:tc>
+      </w:tr>
+      <w:tr>
+        <w:trPr>
+          <w:cantSplit/>
+        </w:trPr>
+        <w:tc>
+          <w:tcPr>
+            <w:tcW w:type="dxa" w:w="2016"/>
+            <w:vAlign w:val="center"/>
+            <w:shd w:fill="EAF1F8"/>
+          </w:tcPr>
+          <w:p>
+            <w:r>
+              <w:t>AI-T-020 to 021</w:t>
+            </w:r>
+          </w:p>
+        </w:tc>
+        <w:tc>
+          <w:tcPr>
+            <w:tcW w:type="dxa" w:w="7776"/>
+            <w:vAlign w:val="center"/>
+            <w:shd w:fill="EAF1F8"/>
+          </w:tcPr>
+          <w:p>
+            <w:r>
+              <w:t>Verify bounds, replay, APIs, RBAC, and minimized events</w:t>
+            </w:r>
+          </w:p>
+        </w:tc>
+      </w:tr>
+      <w:tr>
+        <w:trPr>
+          <w:cantSplit/>
+        </w:trPr>
+        <w:tc>
+          <w:tcPr>
+            <w:tcW w:type="dxa" w:w="2016"/>
+            <w:vAlign w:val="center"/>
+          </w:tcPr>
+          <w:p>
+            <w:r>
+              <w:t>AI-T-022</w:t>
+            </w:r>
+          </w:p>
+        </w:tc>
+        <w:tc>
+          <w:tcPr>
+            <w:tcW w:type="dxa" w:w="7776"/>
+            <w:vAlign w:val="center"/>
+          </w:tcPr>
+          <w:p>
+            <w:r>
+              <w:t>Apply migration 0060 through hosted Docker integration</w:t>
+            </w:r>
+          </w:p>
+        </w:tc>
+      </w:tr>
     </w:tbl>
     <w:p/>
     <w:p>
@@ -1456,7 +1877,7 @@
         <w:pStyle w:val="Heading1"/>
       </w:pPr>
       <w:r>
-        <w:t>7 Risks and Next Development</w:t>
+        <w:t>8 Risks and Next Development</w:t>
       </w:r>
     </w:p>
     <w:tbl>
@@ -1613,7 +2034,7 @@
           </w:tcPr>
           <w:p>
             <w:r>
-              <w:t>No model or GPU in IX-1 or IX-2</w:t>
+              <w:t>No model or GPU in IX-1 through IX-3</w:t>
             </w:r>
           </w:p>
         </w:tc>
@@ -1701,11 +2122,67 @@
           </w:p>
         </w:tc>
       </w:tr>
+      <w:tr>
+        <w:trPr>
+          <w:cantSplit/>
+        </w:trPr>
+        <w:tc>
+          <w:tcPr>
+            <w:tcW w:type="dxa" w:w="3168"/>
+            <w:vAlign w:val="center"/>
+            <w:shd w:fill="EAF1F8"/>
+          </w:tcPr>
+          <w:p>
+            <w:r>
+              <w:t>Sensitive log values</w:t>
+            </w:r>
+          </w:p>
+        </w:tc>
+        <w:tc>
+          <w:tcPr>
+            <w:tcW w:type="dxa" w:w="6624"/>
+            <w:vAlign w:val="center"/>
+            <w:shd w:fill="EAF1F8"/>
+          </w:tcPr>
+          <w:p>
+            <w:r>
+              <w:t>Sanitize before persistence and omit rejected text</w:t>
+            </w:r>
+          </w:p>
+        </w:tc>
+      </w:tr>
+      <w:tr>
+        <w:trPr>
+          <w:cantSplit/>
+        </w:trPr>
+        <w:tc>
+          <w:tcPr>
+            <w:tcW w:type="dxa" w:w="3168"/>
+            <w:vAlign w:val="center"/>
+          </w:tcPr>
+          <w:p>
+            <w:r>
+              <w:t>False causal claim</w:t>
+            </w:r>
+          </w:p>
+        </w:tc>
+        <w:tc>
+          <w:tcPr>
+            <w:tcW w:type="dxa" w:w="6624"/>
+            <w:vAlign w:val="center"/>
+          </w:tcPr>
+          <w:p>
+            <w:r>
+              <w:t>Report signals, citations, and explicit limitations</w:t>
+            </w:r>
+          </w:p>
+        </w:tc>
+      </w:tr>
     </w:tbl>
     <w:p/>
     <w:p>
       <w:r>
-        <w:t>IX-3 will add bounded log parsing, clustering, event timelines, anomaly evidence, and grounded failure explanations. It will preserve the local-first, provider-neutral, advisory-only boundary established here.</w:t>
+        <w:t>IX-4 will add requirement-aware test suggestions with human review, rejection evidence, and controlled promotion into the catalog. Generated content will remain inactive until an authorized reviewer accepts it.</w:t>
       </w:r>
     </w:p>
     <w:sectPr>

</xml_diff>

<commit_message>
feat(ai-engine): add governed test suggestions
</commit_message>
<xml_diff>
--- a/docs/ATEP_Volume_IX_AI_Test_Engineer_Engineering_Workbook.docx
+++ b/docs/ATEP_Volume_IX_AI_Test_Engineer_Engineering_Workbook.docx
@@ -19,12 +19,12 @@
         <w:rPr>
           <w:b/>
         </w:rPr>
-        <w:t>Version 0.3.0  Deterministic Log Intelligence</w:t>
+        <w:t>Version 0.4.0  Governed Test Suggestions</w:t>
       </w:r>
     </w:p>
     <w:p>
       <w:r>
-        <w:t>This workbook records the governed AI boundary and deterministic analysis worker for ATEP. IX-1 captures analysis intent, IX-2 produces structured advisory results, and IX-3 converts bounded logs into sanitized timelines and anomaly evidence without a paid service, model download, network call, or GPU.</w:t>
+        <w:t>This workbook records the governed AI boundary and deterministic analysis worker for ATEP. IX-1 captures analysis intent, IX-2 produces structured advisory results, and IX-3 converts bounded logs into sanitized timelines and anomaly evidence, while IX-4 adds reviewed test suggestions without a paid service, model download, network call, or GPU.</w:t>
       </w:r>
     </w:p>
     <w:tbl>
@@ -96,7 +96,7 @@
           </w:tcPr>
           <w:p>
             <w:r>
-              <w:t>IX-1 through IX-3 implemented</w:t>
+              <w:t>IX-1 through IX-4 implemented</w:t>
             </w:r>
           </w:p>
         </w:tc>
@@ -152,7 +152,7 @@
           </w:tcPr>
           <w:p>
             <w:r>
-              <w:t>0057 foundation, 0059 workers, 0060 log intelligence</w:t>
+              <w:t>0057 foundation, 0059 workers, 0060 logs, 0061 suggestions</w:t>
             </w:r>
           </w:p>
         </w:tc>
@@ -181,7 +181,7 @@
           </w:tcPr>
           <w:p>
             <w:r>
-              <w:t>IX-4 reviewed test generation</w:t>
+              <w:t>IX-5 root cause and risk</w:t>
             </w:r>
           </w:p>
         </w:tc>
@@ -412,6 +412,33 @@
           <w:p>
             <w:r>
               <w:t>Sanitization, timeline, clustering, anomalies, and explanation</w:t>
+            </w:r>
+          </w:p>
+        </w:tc>
+      </w:tr>
+      <w:tr>
+        <w:trPr>
+          <w:cantSplit/>
+        </w:trPr>
+        <w:tc>
+          <w:tcPr>
+            <w:tcW w:type="dxa" w:w="2448"/>
+            <w:vAlign w:val="center"/>
+          </w:tcPr>
+          <w:p>
+            <w:r>
+              <w:t>Test generation</w:t>
+            </w:r>
+          </w:p>
+        </w:tc>
+        <w:tc>
+          <w:tcPr>
+            <w:tcW w:type="dxa" w:w="7344"/>
+            <w:vAlign w:val="center"/>
+          </w:tcPr>
+          <w:p>
+            <w:r>
+              <w:t>Requirement-aware draft, human review, and catalog promotion</w:t>
             </w:r>
           </w:p>
         </w:tc>
@@ -1401,7 +1428,282 @@
         <w:pStyle w:val="Heading1"/>
       </w:pPr>
       <w:r>
-        <w:t>7 Verification Catalogue</w:t>
+        <w:t>7 Governed Test Generation</w:t>
+      </w:r>
+    </w:p>
+    <w:p>
+      <w:r>
+        <w:t>IX-4 creates deterministic catalog-compatible drafts from bounded requirement and evidence references. Review and promotion are separate versioned actions. Rejection preserves the reviewer and reason; approval alone does not create or activate a catalog resource.</w:t>
+      </w:r>
+    </w:p>
+    <w:tbl>
+      <w:tblPr>
+        <w:tblStyle w:val="TableGrid"/>
+        <w:tblW w:type="auto" w:w="0"/>
+        <w:tblLook w:firstColumn="1" w:firstRow="1" w:lastColumn="0" w:lastRow="0" w:noHBand="0" w:noVBand="1" w:val="04A0"/>
+      </w:tblPr>
+      <w:tblGrid>
+        <w:gridCol w:w="3360"/>
+        <w:gridCol w:w="3360"/>
+        <w:gridCol w:w="3360"/>
+      </w:tblGrid>
+      <w:tr>
+        <w:trPr>
+          <w:tblHeader w:val="true"/>
+        </w:trPr>
+        <w:tc>
+          <w:tcPr>
+            <w:tcW w:type="dxa" w:w="2160"/>
+            <w:shd w:fill="1F4E78"/>
+            <w:vAlign w:val="center"/>
+          </w:tcPr>
+          <w:p>
+            <w:r>
+              <w:rPr>
+                <w:b/>
+                <w:color w:val="FFFFFF"/>
+              </w:rPr>
+              <w:t>Control</w:t>
+            </w:r>
+          </w:p>
+        </w:tc>
+        <w:tc>
+          <w:tcPr>
+            <w:tcW w:type="dxa" w:w="3096"/>
+            <w:shd w:fill="1F4E78"/>
+            <w:vAlign w:val="center"/>
+          </w:tcPr>
+          <w:p>
+            <w:r>
+              <w:rPr>
+                <w:b/>
+                <w:color w:val="FFFFFF"/>
+              </w:rPr>
+              <w:t>Rule</w:t>
+            </w:r>
+          </w:p>
+        </w:tc>
+        <w:tc>
+          <w:tcPr>
+            <w:tcW w:type="dxa" w:w="4536"/>
+            <w:shd w:fill="1F4E78"/>
+            <w:vAlign w:val="center"/>
+          </w:tcPr>
+          <w:p>
+            <w:r>
+              <w:rPr>
+                <w:b/>
+                <w:color w:val="FFFFFF"/>
+              </w:rPr>
+              <w:t>Engineering purpose</w:t>
+            </w:r>
+          </w:p>
+        </w:tc>
+      </w:tr>
+      <w:tr>
+        <w:trPr>
+          <w:cantSplit/>
+        </w:trPr>
+        <w:tc>
+          <w:tcPr>
+            <w:tcW w:type="dxa" w:w="2160"/>
+            <w:vAlign w:val="center"/>
+          </w:tcPr>
+          <w:p>
+            <w:r>
+              <w:t>Requirements</w:t>
+            </w:r>
+          </w:p>
+        </w:tc>
+        <w:tc>
+          <w:tcPr>
+            <w:tcW w:type="dxa" w:w="3096"/>
+            <w:vAlign w:val="center"/>
+          </w:tcPr>
+          <w:p>
+            <w:r>
+              <w:t>At least one bounded reference</w:t>
+            </w:r>
+          </w:p>
+        </w:tc>
+        <w:tc>
+          <w:tcPr>
+            <w:tcW w:type="dxa" w:w="4536"/>
+            <w:vAlign w:val="center"/>
+          </w:tcPr>
+          <w:p>
+            <w:r>
+              <w:t>Preserve traceability</w:t>
+            </w:r>
+          </w:p>
+        </w:tc>
+      </w:tr>
+      <w:tr>
+        <w:trPr>
+          <w:cantSplit/>
+        </w:trPr>
+        <w:tc>
+          <w:tcPr>
+            <w:tcW w:type="dxa" w:w="2160"/>
+            <w:vAlign w:val="center"/>
+            <w:shd w:fill="EAF1F8"/>
+          </w:tcPr>
+          <w:p>
+            <w:r>
+              <w:t>Review</w:t>
+            </w:r>
+          </w:p>
+        </w:tc>
+        <w:tc>
+          <w:tcPr>
+            <w:tcW w:type="dxa" w:w="3096"/>
+            <w:vAlign w:val="center"/>
+            <w:shd w:fill="EAF1F8"/>
+          </w:tcPr>
+          <w:p>
+            <w:r>
+              <w:t>Explicit approval or rejection</w:t>
+            </w:r>
+          </w:p>
+        </w:tc>
+        <w:tc>
+          <w:tcPr>
+            <w:tcW w:type="dxa" w:w="4536"/>
+            <w:vAlign w:val="center"/>
+            <w:shd w:fill="EAF1F8"/>
+          </w:tcPr>
+          <w:p>
+            <w:r>
+              <w:t>Retain human authority</w:t>
+            </w:r>
+          </w:p>
+        </w:tc>
+      </w:tr>
+      <w:tr>
+        <w:trPr>
+          <w:cantSplit/>
+        </w:trPr>
+        <w:tc>
+          <w:tcPr>
+            <w:tcW w:type="dxa" w:w="2160"/>
+            <w:vAlign w:val="center"/>
+          </w:tcPr>
+          <w:p>
+            <w:r>
+              <w:t>Concurrency</w:t>
+            </w:r>
+          </w:p>
+        </w:tc>
+        <w:tc>
+          <w:tcPr>
+            <w:tcW w:type="dxa" w:w="3096"/>
+            <w:vAlign w:val="center"/>
+          </w:tcPr>
+          <w:p>
+            <w:r>
+              <w:t>Expected version</w:t>
+            </w:r>
+          </w:p>
+        </w:tc>
+        <w:tc>
+          <w:tcPr>
+            <w:tcW w:type="dxa" w:w="4536"/>
+            <w:vAlign w:val="center"/>
+          </w:tcPr>
+          <w:p>
+            <w:r>
+              <w:t>Reject stale decisions</w:t>
+            </w:r>
+          </w:p>
+        </w:tc>
+      </w:tr>
+      <w:tr>
+        <w:trPr>
+          <w:cantSplit/>
+        </w:trPr>
+        <w:tc>
+          <w:tcPr>
+            <w:tcW w:type="dxa" w:w="2160"/>
+            <w:vAlign w:val="center"/>
+            <w:shd w:fill="EAF1F8"/>
+          </w:tcPr>
+          <w:p>
+            <w:r>
+              <w:t>Promotion</w:t>
+            </w:r>
+          </w:p>
+        </w:tc>
+        <w:tc>
+          <w:tcPr>
+            <w:tcW w:type="dxa" w:w="3096"/>
+            <w:vAlign w:val="center"/>
+            <w:shd w:fill="EAF1F8"/>
+          </w:tcPr>
+          <w:p>
+            <w:r>
+              <w:t>Approved suggestions only</w:t>
+            </w:r>
+          </w:p>
+        </w:tc>
+        <w:tc>
+          <w:tcPr>
+            <w:tcW w:type="dxa" w:w="4536"/>
+            <w:vAlign w:val="center"/>
+            <w:shd w:fill="EAF1F8"/>
+          </w:tcPr>
+          <w:p>
+            <w:r>
+              <w:t>Prevent draft bypass</w:t>
+            </w:r>
+          </w:p>
+        </w:tc>
+      </w:tr>
+      <w:tr>
+        <w:trPr>
+          <w:cantSplit/>
+        </w:trPr>
+        <w:tc>
+          <w:tcPr>
+            <w:tcW w:type="dxa" w:w="2160"/>
+            <w:vAlign w:val="center"/>
+          </w:tcPr>
+          <w:p>
+            <w:r>
+              <w:t>Catalog state</w:t>
+            </w:r>
+          </w:p>
+        </w:tc>
+        <w:tc>
+          <w:tcPr>
+            <w:tcW w:type="dxa" w:w="3096"/>
+            <w:vAlign w:val="center"/>
+          </w:tcPr>
+          <w:p>
+            <w:r>
+              <w:t>Definition remains draft</w:t>
+            </w:r>
+          </w:p>
+        </w:tc>
+        <w:tc>
+          <w:tcPr>
+            <w:tcW w:type="dxa" w:w="4536"/>
+            <w:vAlign w:val="center"/>
+          </w:tcPr>
+          <w:p>
+            <w:r>
+              <w:t>Prevent automatic execution</w:t>
+            </w:r>
+          </w:p>
+        </w:tc>
+      </w:tr>
+    </w:tbl>
+    <w:p/>
+    <w:p>
+      <w:pPr>
+        <w:pStyle w:val="Heading1"/>
+      </w:pPr>
+      <w:r>
+        <w:t>8 Verification Catalogue</w:t>
       </w:r>
     </w:p>
     <w:tbl>
@@ -1870,6 +2172,91 @@
           </w:p>
         </w:tc>
       </w:tr>
+      <w:tr>
+        <w:trPr>
+          <w:cantSplit/>
+        </w:trPr>
+        <w:tc>
+          <w:tcPr>
+            <w:tcW w:type="dxa" w:w="2016"/>
+            <w:vAlign w:val="center"/>
+            <w:shd w:fill="EAF1F8"/>
+          </w:tcPr>
+          <w:p>
+            <w:r>
+              <w:t>AI-T-023 to 025</w:t>
+            </w:r>
+          </w:p>
+        </w:tc>
+        <w:tc>
+          <w:tcPr>
+            <w:tcW w:type="dxa" w:w="7776"/>
+            <w:vAlign w:val="center"/>
+            <w:shd w:fill="EAF1F8"/>
+          </w:tcPr>
+          <w:p>
+            <w:r>
+              <w:t>Verify generation bounds, replay, review, and rejection evidence</w:t>
+            </w:r>
+          </w:p>
+        </w:tc>
+      </w:tr>
+      <w:tr>
+        <w:trPr>
+          <w:cantSplit/>
+        </w:trPr>
+        <w:tc>
+          <w:tcPr>
+            <w:tcW w:type="dxa" w:w="2016"/>
+            <w:vAlign w:val="center"/>
+          </w:tcPr>
+          <w:p>
+            <w:r>
+              <w:t>AI-T-026 to 029</w:t>
+            </w:r>
+          </w:p>
+        </w:tc>
+        <w:tc>
+          <w:tcPr>
+            <w:tcW w:type="dxa" w:w="7776"/>
+            <w:vAlign w:val="center"/>
+          </w:tcPr>
+          <w:p>
+            <w:r>
+              <w:t>Verify promotion gate, draft catalog state, APIs, and RBAC</w:t>
+            </w:r>
+          </w:p>
+        </w:tc>
+      </w:tr>
+      <w:tr>
+        <w:trPr>
+          <w:cantSplit/>
+        </w:trPr>
+        <w:tc>
+          <w:tcPr>
+            <w:tcW w:type="dxa" w:w="2016"/>
+            <w:vAlign w:val="center"/>
+            <w:shd w:fill="EAF1F8"/>
+          </w:tcPr>
+          <w:p>
+            <w:r>
+              <w:t>AI-T-030</w:t>
+            </w:r>
+          </w:p>
+        </w:tc>
+        <w:tc>
+          <w:tcPr>
+            <w:tcW w:type="dxa" w:w="7776"/>
+            <w:vAlign w:val="center"/>
+            <w:shd w:fill="EAF1F8"/>
+          </w:tcPr>
+          <w:p>
+            <w:r>
+              <w:t>Apply migration 0061 through hosted Docker integration</w:t>
+            </w:r>
+          </w:p>
+        </w:tc>
+      </w:tr>
     </w:tbl>
     <w:p/>
     <w:p>
@@ -1877,7 +2264,7 @@
         <w:pStyle w:val="Heading1"/>
       </w:pPr>
       <w:r>
-        <w:t>8 Risks and Next Development</w:t>
+        <w:t>9 Risks and Next Development</w:t>
       </w:r>
     </w:p>
     <w:tbl>
@@ -2034,7 +2421,7 @@
           </w:tcPr>
           <w:p>
             <w:r>
-              <w:t>No model or GPU in IX-1 through IX-3</w:t>
+              <w:t>No model or GPU in IX-1 through IX-4</w:t>
             </w:r>
           </w:p>
         </w:tc>
@@ -2178,13 +2565,37 @@
           </w:p>
         </w:tc>
       </w:tr>
+      <w:tr>
+        <w:trPr>
+          <w:cantSplit/>
+        </w:trPr>
+        <w:tc>
+          <w:tcPr>
+            <w:tcW w:type="dxa" w:w="3168"/>
+            <w:vAlign w:val="center"/>
+            <w:shd w:fill="EAF1F8"/>
+          </w:tcPr>
+          <w:p>
+            <w:r>
+              <w:t>Unsafe generated test</w:t>
+            </w:r>
+          </w:p>
+        </w:tc>
+        <w:tc>
+          <w:tcPr>
+            <w:tcW w:type="dxa" w:w="6624"/>
+            <w:vAlign w:val="center"/>
+            <w:shd w:fill="EAF1F8"/>
+          </w:tcPr>
+          <w:p>
+            <w:r>
+              <w:t>Human review and inactive catalog promotion</w:t>
+            </w:r>
+          </w:p>
+        </w:tc>
+      </w:tr>
     </w:tbl>
     <w:p/>
-    <w:p>
-      <w:r>
-        <w:t>IX-4 will add requirement-aware test suggestions with human review, rejection evidence, and controlled promotion into the catalog. Generated content will remain inactive until an authorized reviewer accepts it.</w:t>
-      </w:r>
-    </w:p>
     <w:sectPr>
       <w:pgSz w:w="12240" w:h="15840"/>
       <w:pgMar w:top="1008" w:right="1080" w:bottom="1008" w:left="1080" w:header="720" w:footer="720" w:gutter="0"/>
@@ -2560,7 +2971,7 @@
     <w:rsid w:val="00FC693F"/>
     <w:rPr>
       <w:rFonts w:ascii="Aptos" w:hAnsi="Aptos"/>
-      <w:sz w:val="21"/>
+      <w:sz w:val="20"/>
     </w:rPr>
   </w:style>
   <w:style w:type="paragraph" w:styleId="Header">

</xml_diff>

<commit_message>
feat(ai-engine): add governed test suggestions (#101)
</commit_message>
<xml_diff>
--- a/docs/ATEP_Volume_IX_AI_Test_Engineer_Engineering_Workbook.docx
+++ b/docs/ATEP_Volume_IX_AI_Test_Engineer_Engineering_Workbook.docx
@@ -19,12 +19,12 @@
         <w:rPr>
           <w:b/>
         </w:rPr>
-        <w:t>Version 0.3.0  Deterministic Log Intelligence</w:t>
+        <w:t>Version 0.4.0  Governed Test Suggestions</w:t>
       </w:r>
     </w:p>
     <w:p>
       <w:r>
-        <w:t>This workbook records the governed AI boundary and deterministic analysis worker for ATEP. IX-1 captures analysis intent, IX-2 produces structured advisory results, and IX-3 converts bounded logs into sanitized timelines and anomaly evidence without a paid service, model download, network call, or GPU.</w:t>
+        <w:t>This workbook records the governed AI boundary and deterministic analysis worker for ATEP. IX-1 captures analysis intent, IX-2 produces structured advisory results, and IX-3 converts bounded logs into sanitized timelines and anomaly evidence, while IX-4 adds reviewed test suggestions without a paid service, model download, network call, or GPU.</w:t>
       </w:r>
     </w:p>
     <w:tbl>
@@ -96,7 +96,7 @@
           </w:tcPr>
           <w:p>
             <w:r>
-              <w:t>IX-1 through IX-3 implemented</w:t>
+              <w:t>IX-1 through IX-4 implemented</w:t>
             </w:r>
           </w:p>
         </w:tc>
@@ -152,7 +152,7 @@
           </w:tcPr>
           <w:p>
             <w:r>
-              <w:t>0057 foundation, 0059 workers, 0060 log intelligence</w:t>
+              <w:t>0057 foundation, 0059 workers, 0060 logs, 0061 suggestions</w:t>
             </w:r>
           </w:p>
         </w:tc>
@@ -181,7 +181,7 @@
           </w:tcPr>
           <w:p>
             <w:r>
-              <w:t>IX-4 reviewed test generation</w:t>
+              <w:t>IX-5 root cause and risk</w:t>
             </w:r>
           </w:p>
         </w:tc>
@@ -412,6 +412,33 @@
           <w:p>
             <w:r>
               <w:t>Sanitization, timeline, clustering, anomalies, and explanation</w:t>
+            </w:r>
+          </w:p>
+        </w:tc>
+      </w:tr>
+      <w:tr>
+        <w:trPr>
+          <w:cantSplit/>
+        </w:trPr>
+        <w:tc>
+          <w:tcPr>
+            <w:tcW w:type="dxa" w:w="2448"/>
+            <w:vAlign w:val="center"/>
+          </w:tcPr>
+          <w:p>
+            <w:r>
+              <w:t>Test generation</w:t>
+            </w:r>
+          </w:p>
+        </w:tc>
+        <w:tc>
+          <w:tcPr>
+            <w:tcW w:type="dxa" w:w="7344"/>
+            <w:vAlign w:val="center"/>
+          </w:tcPr>
+          <w:p>
+            <w:r>
+              <w:t>Requirement-aware draft, human review, and catalog promotion</w:t>
             </w:r>
           </w:p>
         </w:tc>
@@ -1401,7 +1428,282 @@
         <w:pStyle w:val="Heading1"/>
       </w:pPr>
       <w:r>
-        <w:t>7 Verification Catalogue</w:t>
+        <w:t>7 Governed Test Generation</w:t>
+      </w:r>
+    </w:p>
+    <w:p>
+      <w:r>
+        <w:t>IX-4 creates deterministic catalog-compatible drafts from bounded requirement and evidence references. Review and promotion are separate versioned actions. Rejection preserves the reviewer and reason; approval alone does not create or activate a catalog resource.</w:t>
+      </w:r>
+    </w:p>
+    <w:tbl>
+      <w:tblPr>
+        <w:tblStyle w:val="TableGrid"/>
+        <w:tblW w:type="auto" w:w="0"/>
+        <w:tblLook w:firstColumn="1" w:firstRow="1" w:lastColumn="0" w:lastRow="0" w:noHBand="0" w:noVBand="1" w:val="04A0"/>
+      </w:tblPr>
+      <w:tblGrid>
+        <w:gridCol w:w="3360"/>
+        <w:gridCol w:w="3360"/>
+        <w:gridCol w:w="3360"/>
+      </w:tblGrid>
+      <w:tr>
+        <w:trPr>
+          <w:tblHeader w:val="true"/>
+        </w:trPr>
+        <w:tc>
+          <w:tcPr>
+            <w:tcW w:type="dxa" w:w="2160"/>
+            <w:shd w:fill="1F4E78"/>
+            <w:vAlign w:val="center"/>
+          </w:tcPr>
+          <w:p>
+            <w:r>
+              <w:rPr>
+                <w:b/>
+                <w:color w:val="FFFFFF"/>
+              </w:rPr>
+              <w:t>Control</w:t>
+            </w:r>
+          </w:p>
+        </w:tc>
+        <w:tc>
+          <w:tcPr>
+            <w:tcW w:type="dxa" w:w="3096"/>
+            <w:shd w:fill="1F4E78"/>
+            <w:vAlign w:val="center"/>
+          </w:tcPr>
+          <w:p>
+            <w:r>
+              <w:rPr>
+                <w:b/>
+                <w:color w:val="FFFFFF"/>
+              </w:rPr>
+              <w:t>Rule</w:t>
+            </w:r>
+          </w:p>
+        </w:tc>
+        <w:tc>
+          <w:tcPr>
+            <w:tcW w:type="dxa" w:w="4536"/>
+            <w:shd w:fill="1F4E78"/>
+            <w:vAlign w:val="center"/>
+          </w:tcPr>
+          <w:p>
+            <w:r>
+              <w:rPr>
+                <w:b/>
+                <w:color w:val="FFFFFF"/>
+              </w:rPr>
+              <w:t>Engineering purpose</w:t>
+            </w:r>
+          </w:p>
+        </w:tc>
+      </w:tr>
+      <w:tr>
+        <w:trPr>
+          <w:cantSplit/>
+        </w:trPr>
+        <w:tc>
+          <w:tcPr>
+            <w:tcW w:type="dxa" w:w="2160"/>
+            <w:vAlign w:val="center"/>
+          </w:tcPr>
+          <w:p>
+            <w:r>
+              <w:t>Requirements</w:t>
+            </w:r>
+          </w:p>
+        </w:tc>
+        <w:tc>
+          <w:tcPr>
+            <w:tcW w:type="dxa" w:w="3096"/>
+            <w:vAlign w:val="center"/>
+          </w:tcPr>
+          <w:p>
+            <w:r>
+              <w:t>At least one bounded reference</w:t>
+            </w:r>
+          </w:p>
+        </w:tc>
+        <w:tc>
+          <w:tcPr>
+            <w:tcW w:type="dxa" w:w="4536"/>
+            <w:vAlign w:val="center"/>
+          </w:tcPr>
+          <w:p>
+            <w:r>
+              <w:t>Preserve traceability</w:t>
+            </w:r>
+          </w:p>
+        </w:tc>
+      </w:tr>
+      <w:tr>
+        <w:trPr>
+          <w:cantSplit/>
+        </w:trPr>
+        <w:tc>
+          <w:tcPr>
+            <w:tcW w:type="dxa" w:w="2160"/>
+            <w:vAlign w:val="center"/>
+            <w:shd w:fill="EAF1F8"/>
+          </w:tcPr>
+          <w:p>
+            <w:r>
+              <w:t>Review</w:t>
+            </w:r>
+          </w:p>
+        </w:tc>
+        <w:tc>
+          <w:tcPr>
+            <w:tcW w:type="dxa" w:w="3096"/>
+            <w:vAlign w:val="center"/>
+            <w:shd w:fill="EAF1F8"/>
+          </w:tcPr>
+          <w:p>
+            <w:r>
+              <w:t>Explicit approval or rejection</w:t>
+            </w:r>
+          </w:p>
+        </w:tc>
+        <w:tc>
+          <w:tcPr>
+            <w:tcW w:type="dxa" w:w="4536"/>
+            <w:vAlign w:val="center"/>
+            <w:shd w:fill="EAF1F8"/>
+          </w:tcPr>
+          <w:p>
+            <w:r>
+              <w:t>Retain human authority</w:t>
+            </w:r>
+          </w:p>
+        </w:tc>
+      </w:tr>
+      <w:tr>
+        <w:trPr>
+          <w:cantSplit/>
+        </w:trPr>
+        <w:tc>
+          <w:tcPr>
+            <w:tcW w:type="dxa" w:w="2160"/>
+            <w:vAlign w:val="center"/>
+          </w:tcPr>
+          <w:p>
+            <w:r>
+              <w:t>Concurrency</w:t>
+            </w:r>
+          </w:p>
+        </w:tc>
+        <w:tc>
+          <w:tcPr>
+            <w:tcW w:type="dxa" w:w="3096"/>
+            <w:vAlign w:val="center"/>
+          </w:tcPr>
+          <w:p>
+            <w:r>
+              <w:t>Expected version</w:t>
+            </w:r>
+          </w:p>
+        </w:tc>
+        <w:tc>
+          <w:tcPr>
+            <w:tcW w:type="dxa" w:w="4536"/>
+            <w:vAlign w:val="center"/>
+          </w:tcPr>
+          <w:p>
+            <w:r>
+              <w:t>Reject stale decisions</w:t>
+            </w:r>
+          </w:p>
+        </w:tc>
+      </w:tr>
+      <w:tr>
+        <w:trPr>
+          <w:cantSplit/>
+        </w:trPr>
+        <w:tc>
+          <w:tcPr>
+            <w:tcW w:type="dxa" w:w="2160"/>
+            <w:vAlign w:val="center"/>
+            <w:shd w:fill="EAF1F8"/>
+          </w:tcPr>
+          <w:p>
+            <w:r>
+              <w:t>Promotion</w:t>
+            </w:r>
+          </w:p>
+        </w:tc>
+        <w:tc>
+          <w:tcPr>
+            <w:tcW w:type="dxa" w:w="3096"/>
+            <w:vAlign w:val="center"/>
+            <w:shd w:fill="EAF1F8"/>
+          </w:tcPr>
+          <w:p>
+            <w:r>
+              <w:t>Approved suggestions only</w:t>
+            </w:r>
+          </w:p>
+        </w:tc>
+        <w:tc>
+          <w:tcPr>
+            <w:tcW w:type="dxa" w:w="4536"/>
+            <w:vAlign w:val="center"/>
+            <w:shd w:fill="EAF1F8"/>
+          </w:tcPr>
+          <w:p>
+            <w:r>
+              <w:t>Prevent draft bypass</w:t>
+            </w:r>
+          </w:p>
+        </w:tc>
+      </w:tr>
+      <w:tr>
+        <w:trPr>
+          <w:cantSplit/>
+        </w:trPr>
+        <w:tc>
+          <w:tcPr>
+            <w:tcW w:type="dxa" w:w="2160"/>
+            <w:vAlign w:val="center"/>
+          </w:tcPr>
+          <w:p>
+            <w:r>
+              <w:t>Catalog state</w:t>
+            </w:r>
+          </w:p>
+        </w:tc>
+        <w:tc>
+          <w:tcPr>
+            <w:tcW w:type="dxa" w:w="3096"/>
+            <w:vAlign w:val="center"/>
+          </w:tcPr>
+          <w:p>
+            <w:r>
+              <w:t>Definition remains draft</w:t>
+            </w:r>
+          </w:p>
+        </w:tc>
+        <w:tc>
+          <w:tcPr>
+            <w:tcW w:type="dxa" w:w="4536"/>
+            <w:vAlign w:val="center"/>
+          </w:tcPr>
+          <w:p>
+            <w:r>
+              <w:t>Prevent automatic execution</w:t>
+            </w:r>
+          </w:p>
+        </w:tc>
+      </w:tr>
+    </w:tbl>
+    <w:p/>
+    <w:p>
+      <w:pPr>
+        <w:pStyle w:val="Heading1"/>
+      </w:pPr>
+      <w:r>
+        <w:t>8 Verification Catalogue</w:t>
       </w:r>
     </w:p>
     <w:tbl>
@@ -1870,6 +2172,91 @@
           </w:p>
         </w:tc>
       </w:tr>
+      <w:tr>
+        <w:trPr>
+          <w:cantSplit/>
+        </w:trPr>
+        <w:tc>
+          <w:tcPr>
+            <w:tcW w:type="dxa" w:w="2016"/>
+            <w:vAlign w:val="center"/>
+            <w:shd w:fill="EAF1F8"/>
+          </w:tcPr>
+          <w:p>
+            <w:r>
+              <w:t>AI-T-023 to 025</w:t>
+            </w:r>
+          </w:p>
+        </w:tc>
+        <w:tc>
+          <w:tcPr>
+            <w:tcW w:type="dxa" w:w="7776"/>
+            <w:vAlign w:val="center"/>
+            <w:shd w:fill="EAF1F8"/>
+          </w:tcPr>
+          <w:p>
+            <w:r>
+              <w:t>Verify generation bounds, replay, review, and rejection evidence</w:t>
+            </w:r>
+          </w:p>
+        </w:tc>
+      </w:tr>
+      <w:tr>
+        <w:trPr>
+          <w:cantSplit/>
+        </w:trPr>
+        <w:tc>
+          <w:tcPr>
+            <w:tcW w:type="dxa" w:w="2016"/>
+            <w:vAlign w:val="center"/>
+          </w:tcPr>
+          <w:p>
+            <w:r>
+              <w:t>AI-T-026 to 029</w:t>
+            </w:r>
+          </w:p>
+        </w:tc>
+        <w:tc>
+          <w:tcPr>
+            <w:tcW w:type="dxa" w:w="7776"/>
+            <w:vAlign w:val="center"/>
+          </w:tcPr>
+          <w:p>
+            <w:r>
+              <w:t>Verify promotion gate, draft catalog state, APIs, and RBAC</w:t>
+            </w:r>
+          </w:p>
+        </w:tc>
+      </w:tr>
+      <w:tr>
+        <w:trPr>
+          <w:cantSplit/>
+        </w:trPr>
+        <w:tc>
+          <w:tcPr>
+            <w:tcW w:type="dxa" w:w="2016"/>
+            <w:vAlign w:val="center"/>
+            <w:shd w:fill="EAF1F8"/>
+          </w:tcPr>
+          <w:p>
+            <w:r>
+              <w:t>AI-T-030</w:t>
+            </w:r>
+          </w:p>
+        </w:tc>
+        <w:tc>
+          <w:tcPr>
+            <w:tcW w:type="dxa" w:w="7776"/>
+            <w:vAlign w:val="center"/>
+            <w:shd w:fill="EAF1F8"/>
+          </w:tcPr>
+          <w:p>
+            <w:r>
+              <w:t>Apply migration 0061 through hosted Docker integration</w:t>
+            </w:r>
+          </w:p>
+        </w:tc>
+      </w:tr>
     </w:tbl>
     <w:p/>
     <w:p>
@@ -1877,7 +2264,7 @@
         <w:pStyle w:val="Heading1"/>
       </w:pPr>
       <w:r>
-        <w:t>8 Risks and Next Development</w:t>
+        <w:t>9 Risks and Next Development</w:t>
       </w:r>
     </w:p>
     <w:tbl>
@@ -2034,7 +2421,7 @@
           </w:tcPr>
           <w:p>
             <w:r>
-              <w:t>No model or GPU in IX-1 through IX-3</w:t>
+              <w:t>No model or GPU in IX-1 through IX-4</w:t>
             </w:r>
           </w:p>
         </w:tc>
@@ -2178,13 +2565,37 @@
           </w:p>
         </w:tc>
       </w:tr>
+      <w:tr>
+        <w:trPr>
+          <w:cantSplit/>
+        </w:trPr>
+        <w:tc>
+          <w:tcPr>
+            <w:tcW w:type="dxa" w:w="3168"/>
+            <w:vAlign w:val="center"/>
+            <w:shd w:fill="EAF1F8"/>
+          </w:tcPr>
+          <w:p>
+            <w:r>
+              <w:t>Unsafe generated test</w:t>
+            </w:r>
+          </w:p>
+        </w:tc>
+        <w:tc>
+          <w:tcPr>
+            <w:tcW w:type="dxa" w:w="6624"/>
+            <w:vAlign w:val="center"/>
+            <w:shd w:fill="EAF1F8"/>
+          </w:tcPr>
+          <w:p>
+            <w:r>
+              <w:t>Human review and inactive catalog promotion</w:t>
+            </w:r>
+          </w:p>
+        </w:tc>
+      </w:tr>
     </w:tbl>
     <w:p/>
-    <w:p>
-      <w:r>
-        <w:t>IX-4 will add requirement-aware test suggestions with human review, rejection evidence, and controlled promotion into the catalog. Generated content will remain inactive until an authorized reviewer accepts it.</w:t>
-      </w:r>
-    </w:p>
     <w:sectPr>
       <w:pgSz w:w="12240" w:h="15840"/>
       <w:pgMar w:top="1008" w:right="1080" w:bottom="1008" w:left="1080" w:header="720" w:footer="720" w:gutter="0"/>
@@ -2560,7 +2971,7 @@
     <w:rsid w:val="00FC693F"/>
     <w:rPr>
       <w:rFonts w:ascii="Aptos" w:hAnsi="Aptos"/>
-      <w:sz w:val="21"/>
+      <w:sz w:val="20"/>
     </w:rPr>
   </w:style>
   <w:style w:type="paragraph" w:styleId="Header">

</xml_diff>

<commit_message>
feat(ai-engine): add explainable root cause risk
</commit_message>
<xml_diff>
--- a/docs/ATEP_Volume_IX_AI_Test_Engineer_Engineering_Workbook.docx
+++ b/docs/ATEP_Volume_IX_AI_Test_Engineer_Engineering_Workbook.docx
@@ -19,12 +19,12 @@
         <w:rPr>
           <w:b/>
         </w:rPr>
-        <w:t>Version 0.4.0  Governed Test Suggestions</w:t>
+        <w:t>Version 0.5.0  Explainable Root Cause and Risk</w:t>
       </w:r>
     </w:p>
     <w:p>
       <w:r>
-        <w:t>This workbook records the governed AI boundary and deterministic analysis worker for ATEP. IX-1 captures analysis intent, IX-2 produces structured advisory results, and IX-3 converts bounded logs into sanitized timelines and anomaly evidence, while IX-4 adds reviewed test suggestions without a paid service, model download, network call, or GPU.</w:t>
+        <w:t>This workbook records the governed AI boundary and deterministic analysis worker for ATEP. IX-1 captures analysis intent, IX-2 produces structured advisory results, and IX-3 converts bounded logs into sanitized timelines and anomaly evidence, while IX-4 adds reviewed test suggestions, and IX-5 adds explainable risk evidence without a paid service, model download, network call, or GPU.</w:t>
       </w:r>
     </w:p>
     <w:tbl>
@@ -96,7 +96,7 @@
           </w:tcPr>
           <w:p>
             <w:r>
-              <w:t>IX-1 through IX-4 implemented</w:t>
+              <w:t>IX-1 through IX-5 implemented</w:t>
             </w:r>
           </w:p>
         </w:tc>
@@ -152,7 +152,7 @@
           </w:tcPr>
           <w:p>
             <w:r>
-              <w:t>0057 foundation, 0059 workers, 0060 logs, 0061 suggestions</w:t>
+              <w:t>0057 foundation through 0062 root cause and risk</w:t>
             </w:r>
           </w:p>
         </w:tc>
@@ -181,7 +181,7 @@
           </w:tcPr>
           <w:p>
             <w:r>
-              <w:t>IX-5 root cause and risk</w:t>
+              <w:t>IX-6 grounded internal chat</w:t>
             </w:r>
           </w:p>
         </w:tc>
@@ -439,6 +439,35 @@
           <w:p>
             <w:r>
               <w:t>Requirement-aware draft, human review, and catalog promotion</w:t>
+            </w:r>
+          </w:p>
+        </w:tc>
+      </w:tr>
+      <w:tr>
+        <w:trPr>
+          <w:cantSplit/>
+        </w:trPr>
+        <w:tc>
+          <w:tcPr>
+            <w:tcW w:type="dxa" w:w="2448"/>
+            <w:vAlign w:val="center"/>
+            <w:shd w:fill="EAF1F8"/>
+          </w:tcPr>
+          <w:p>
+            <w:r>
+              <w:t>Root cause and risk</w:t>
+            </w:r>
+          </w:p>
+        </w:tc>
+        <w:tc>
+          <w:tcPr>
+            <w:tcW w:type="dxa" w:w="7344"/>
+            <w:vAlign w:val="center"/>
+            <w:shd w:fill="EAF1F8"/>
+          </w:tcPr>
+          <w:p>
+            <w:r>
+              <w:t>Evidence ranking, risk score, and prediction evaluation</w:t>
             </w:r>
           </w:p>
         </w:tc>
@@ -1703,7 +1732,282 @@
         <w:pStyle w:val="Heading1"/>
       </w:pPr>
       <w:r>
-        <w:t>8 Verification Catalogue</w:t>
+        <w:t>8 Root Cause and Risk</w:t>
+      </w:r>
+    </w:p>
+    <w:p>
+      <w:r>
+        <w:t>IX-5 ranks bounded signals that cite only evidence governed by the request. A transparent formula combines the highest hypothesis support, severity impact, and inverse detectability. The result prioritizes investigation and never asserts causality.</w:t>
+      </w:r>
+    </w:p>
+    <w:tbl>
+      <w:tblPr>
+        <w:tblStyle w:val="TableGrid"/>
+        <w:tblW w:type="auto" w:w="0"/>
+        <w:tblLook w:firstColumn="1" w:firstRow="1" w:lastColumn="0" w:lastRow="0" w:noHBand="0" w:noVBand="1" w:val="04A0"/>
+      </w:tblPr>
+      <w:tblGrid>
+        <w:gridCol w:w="3360"/>
+        <w:gridCol w:w="3360"/>
+        <w:gridCol w:w="3360"/>
+      </w:tblGrid>
+      <w:tr>
+        <w:trPr>
+          <w:tblHeader w:val="true"/>
+        </w:trPr>
+        <w:tc>
+          <w:tcPr>
+            <w:tcW w:type="dxa" w:w="2160"/>
+            <w:shd w:fill="1F4E78"/>
+            <w:vAlign w:val="center"/>
+          </w:tcPr>
+          <w:p>
+            <w:r>
+              <w:rPr>
+                <w:b/>
+                <w:color w:val="FFFFFF"/>
+              </w:rPr>
+              <w:t>Control</w:t>
+            </w:r>
+          </w:p>
+        </w:tc>
+        <w:tc>
+          <w:tcPr>
+            <w:tcW w:type="dxa" w:w="3096"/>
+            <w:shd w:fill="1F4E78"/>
+            <w:vAlign w:val="center"/>
+          </w:tcPr>
+          <w:p>
+            <w:r>
+              <w:rPr>
+                <w:b/>
+                <w:color w:val="FFFFFF"/>
+              </w:rPr>
+              <w:t>Rule</w:t>
+            </w:r>
+          </w:p>
+        </w:tc>
+        <w:tc>
+          <w:tcPr>
+            <w:tcW w:type="dxa" w:w="4536"/>
+            <w:shd w:fill="1F4E78"/>
+            <w:vAlign w:val="center"/>
+          </w:tcPr>
+          <w:p>
+            <w:r>
+              <w:rPr>
+                <w:b/>
+                <w:color w:val="FFFFFF"/>
+              </w:rPr>
+              <w:t>Engineering purpose</w:t>
+            </w:r>
+          </w:p>
+        </w:tc>
+      </w:tr>
+      <w:tr>
+        <w:trPr>
+          <w:cantSplit/>
+        </w:trPr>
+        <w:tc>
+          <w:tcPr>
+            <w:tcW w:type="dxa" w:w="2160"/>
+            <w:vAlign w:val="center"/>
+          </w:tcPr>
+          <w:p>
+            <w:r>
+              <w:t>Signals</w:t>
+            </w:r>
+          </w:p>
+        </w:tc>
+        <w:tc>
+          <w:tcPr>
+            <w:tcW w:type="dxa" w:w="3096"/>
+            <w:vAlign w:val="center"/>
+          </w:tcPr>
+          <w:p>
+            <w:r>
+              <w:t>1 to 50 unique codes</w:t>
+            </w:r>
+          </w:p>
+        </w:tc>
+        <w:tc>
+          <w:tcPr>
+            <w:tcW w:type="dxa" w:w="4536"/>
+            <w:vAlign w:val="center"/>
+          </w:tcPr>
+          <w:p>
+            <w:r>
+              <w:t>Bound processing and ambiguity</w:t>
+            </w:r>
+          </w:p>
+        </w:tc>
+      </w:tr>
+      <w:tr>
+        <w:trPr>
+          <w:cantSplit/>
+        </w:trPr>
+        <w:tc>
+          <w:tcPr>
+            <w:tcW w:type="dxa" w:w="2160"/>
+            <w:vAlign w:val="center"/>
+            <w:shd w:fill="EAF1F8"/>
+          </w:tcPr>
+          <w:p>
+            <w:r>
+              <w:t>Evidence</w:t>
+            </w:r>
+          </w:p>
+        </w:tc>
+        <w:tc>
+          <w:tcPr>
+            <w:tcW w:type="dxa" w:w="3096"/>
+            <w:vAlign w:val="center"/>
+            <w:shd w:fill="EAF1F8"/>
+          </w:tcPr>
+          <w:p>
+            <w:r>
+              <w:t>Request references only</w:t>
+            </w:r>
+          </w:p>
+        </w:tc>
+        <w:tc>
+          <w:tcPr>
+            <w:tcW w:type="dxa" w:w="4536"/>
+            <w:vAlign w:val="center"/>
+            <w:shd w:fill="EAF1F8"/>
+          </w:tcPr>
+          <w:p>
+            <w:r>
+              <w:t>Prevent unsupported conclusions</w:t>
+            </w:r>
+          </w:p>
+        </w:tc>
+      </w:tr>
+      <w:tr>
+        <w:trPr>
+          <w:cantSplit/>
+        </w:trPr>
+        <w:tc>
+          <w:tcPr>
+            <w:tcW w:type="dxa" w:w="2160"/>
+            <w:vAlign w:val="center"/>
+          </w:tcPr>
+          <w:p>
+            <w:r>
+              <w:t>Risk</w:t>
+            </w:r>
+          </w:p>
+        </w:tc>
+        <w:tc>
+          <w:tcPr>
+            <w:tcW w:type="dxa" w:w="3096"/>
+            <w:vAlign w:val="center"/>
+          </w:tcPr>
+          <w:p>
+            <w:r>
+              <w:t>Fixed 0 to 100 formula</w:t>
+            </w:r>
+          </w:p>
+        </w:tc>
+        <w:tc>
+          <w:tcPr>
+            <w:tcW w:type="dxa" w:w="4536"/>
+            <w:vAlign w:val="center"/>
+          </w:tcPr>
+          <w:p>
+            <w:r>
+              <w:t>Make prioritization reproducible</w:t>
+            </w:r>
+          </w:p>
+        </w:tc>
+      </w:tr>
+      <w:tr>
+        <w:trPr>
+          <w:cantSplit/>
+        </w:trPr>
+        <w:tc>
+          <w:tcPr>
+            <w:tcW w:type="dxa" w:w="2160"/>
+            <w:vAlign w:val="center"/>
+            <w:shd w:fill="EAF1F8"/>
+          </w:tcPr>
+          <w:p>
+            <w:r>
+              <w:t>Outcome</w:t>
+            </w:r>
+          </w:p>
+        </w:tc>
+        <w:tc>
+          <w:tcPr>
+            <w:tcW w:type="dxa" w:w="3096"/>
+            <w:vAlign w:val="center"/>
+            <w:shd w:fill="EAF1F8"/>
+          </w:tcPr>
+          <w:p>
+            <w:r>
+              <w:t>Versioned observed evidence</w:t>
+            </w:r>
+          </w:p>
+        </w:tc>
+        <w:tc>
+          <w:tcPr>
+            <w:tcW w:type="dxa" w:w="4536"/>
+            <w:vAlign w:val="center"/>
+            <w:shd w:fill="EAF1F8"/>
+          </w:tcPr>
+          <w:p>
+            <w:r>
+              <w:t>Measure prediction quality</w:t>
+            </w:r>
+          </w:p>
+        </w:tc>
+      </w:tr>
+      <w:tr>
+        <w:trPr>
+          <w:cantSplit/>
+        </w:trPr>
+        <w:tc>
+          <w:tcPr>
+            <w:tcW w:type="dxa" w:w="2160"/>
+            <w:vAlign w:val="center"/>
+          </w:tcPr>
+          <w:p>
+            <w:r>
+              <w:t>Metrics</w:t>
+            </w:r>
+          </w:p>
+        </w:tc>
+        <w:tc>
+          <w:tcPr>
+            <w:tcW w:type="dxa" w:w="3096"/>
+            <w:vAlign w:val="center"/>
+          </w:tcPr>
+          <w:p>
+            <w:r>
+              <w:t>Accuracy and Brier score</w:t>
+            </w:r>
+          </w:p>
+        </w:tc>
+        <w:tc>
+          <w:tcPr>
+            <w:tcW w:type="dxa" w:w="4536"/>
+            <w:vAlign w:val="center"/>
+          </w:tcPr>
+          <w:p>
+            <w:r>
+              <w:t>Compare historical performance</w:t>
+            </w:r>
+          </w:p>
+        </w:tc>
+      </w:tr>
+    </w:tbl>
+    <w:p/>
+    <w:p>
+      <w:pPr>
+        <w:pStyle w:val="Heading1"/>
+      </w:pPr>
+      <w:r>
+        <w:t>9 Verification Catalogue</w:t>
       </w:r>
     </w:p>
     <w:tbl>
@@ -2257,6 +2561,89 @@
           </w:p>
         </w:tc>
       </w:tr>
+      <w:tr>
+        <w:trPr>
+          <w:cantSplit/>
+        </w:trPr>
+        <w:tc>
+          <w:tcPr>
+            <w:tcW w:type="dxa" w:w="2016"/>
+            <w:vAlign w:val="center"/>
+          </w:tcPr>
+          <w:p>
+            <w:r>
+              <w:t>AI-T-031 to 034</w:t>
+            </w:r>
+          </w:p>
+        </w:tc>
+        <w:tc>
+          <w:tcPr>
+            <w:tcW w:type="dxa" w:w="7776"/>
+            <w:vAlign w:val="center"/>
+          </w:tcPr>
+          <w:p>
+            <w:r>
+              <w:t>Verify signal policy, ranking, risk formula, and limitations</w:t>
+            </w:r>
+          </w:p>
+        </w:tc>
+      </w:tr>
+      <w:tr>
+        <w:trPr>
+          <w:cantSplit/>
+        </w:trPr>
+        <w:tc>
+          <w:tcPr>
+            <w:tcW w:type="dxa" w:w="2016"/>
+            <w:vAlign w:val="center"/>
+            <w:shd w:fill="EAF1F8"/>
+          </w:tcPr>
+          <w:p>
+            <w:r>
+              <w:t>AI-T-035 to 037</w:t>
+            </w:r>
+          </w:p>
+        </w:tc>
+        <w:tc>
+          <w:tcPr>
+            <w:tcW w:type="dxa" w:w="7776"/>
+            <w:vAlign w:val="center"/>
+            <w:shd w:fill="EAF1F8"/>
+          </w:tcPr>
+          <w:p>
+            <w:r>
+              <w:t>Verify evaluation, Brier score, metrics, APIs, and RBAC</w:t>
+            </w:r>
+          </w:p>
+        </w:tc>
+      </w:tr>
+      <w:tr>
+        <w:trPr>
+          <w:cantSplit/>
+        </w:trPr>
+        <w:tc>
+          <w:tcPr>
+            <w:tcW w:type="dxa" w:w="2016"/>
+            <w:vAlign w:val="center"/>
+          </w:tcPr>
+          <w:p>
+            <w:r>
+              <w:t>AI-T-038</w:t>
+            </w:r>
+          </w:p>
+        </w:tc>
+        <w:tc>
+          <w:tcPr>
+            <w:tcW w:type="dxa" w:w="7776"/>
+            <w:vAlign w:val="center"/>
+          </w:tcPr>
+          <w:p>
+            <w:r>
+              <w:t>Apply migration 0062 through hosted Docker integration</w:t>
+            </w:r>
+          </w:p>
+        </w:tc>
+      </w:tr>
     </w:tbl>
     <w:p/>
     <w:p>
@@ -2264,7 +2651,7 @@
         <w:pStyle w:val="Heading1"/>
       </w:pPr>
       <w:r>
-        <w:t>9 Risks and Next Development</w:t>
+        <w:t>10 Risks and Next Development</w:t>
       </w:r>
     </w:p>
     <w:tbl>
@@ -2421,7 +2808,7 @@
           </w:tcPr>
           <w:p>
             <w:r>
-              <w:t>No model or GPU in IX-1 through IX-4</w:t>
+              <w:t>No model or GPU in IX-1 through IX-5</w:t>
             </w:r>
           </w:p>
         </w:tc>
@@ -2590,6 +2977,62 @@
           <w:p>
             <w:r>
               <w:t>Human review and inactive catalog promotion</w:t>
+            </w:r>
+          </w:p>
+        </w:tc>
+      </w:tr>
+      <w:tr>
+        <w:trPr>
+          <w:cantSplit/>
+        </w:trPr>
+        <w:tc>
+          <w:tcPr>
+            <w:tcW w:type="dxa" w:w="3168"/>
+            <w:vAlign w:val="center"/>
+          </w:tcPr>
+          <w:p>
+            <w:r>
+              <w:t>False root cause</w:t>
+            </w:r>
+          </w:p>
+        </w:tc>
+        <w:tc>
+          <w:tcPr>
+            <w:tcW w:type="dxa" w:w="6624"/>
+            <w:vAlign w:val="center"/>
+          </w:tcPr>
+          <w:p>
+            <w:r>
+              <w:t>Rank associations with explicit causal limitations</w:t>
+            </w:r>
+          </w:p>
+        </w:tc>
+      </w:tr>
+      <w:tr>
+        <w:trPr>
+          <w:cantSplit/>
+        </w:trPr>
+        <w:tc>
+          <w:tcPr>
+            <w:tcW w:type="dxa" w:w="3168"/>
+            <w:vAlign w:val="center"/>
+            <w:shd w:fill="EAF1F8"/>
+          </w:tcPr>
+          <w:p>
+            <w:r>
+              <w:t>Misread risk score</w:t>
+            </w:r>
+          </w:p>
+        </w:tc>
+        <w:tc>
+          <w:tcPr>
+            <w:tcW w:type="dxa" w:w="6624"/>
+            <w:vAlign w:val="center"/>
+            <w:shd w:fill="EAF1F8"/>
+          </w:tcPr>
+          <w:p>
+            <w:r>
+              <w:t>Document fixed formula and non-probability meaning</w:t>
             </w:r>
           </w:p>
         </w:tc>

</xml_diff>

<commit_message>
feat(ai-engine): add explainable root cause risk (#102)
</commit_message>
<xml_diff>
--- a/docs/ATEP_Volume_IX_AI_Test_Engineer_Engineering_Workbook.docx
+++ b/docs/ATEP_Volume_IX_AI_Test_Engineer_Engineering_Workbook.docx
@@ -19,12 +19,12 @@
         <w:rPr>
           <w:b/>
         </w:rPr>
-        <w:t>Version 0.4.0  Governed Test Suggestions</w:t>
+        <w:t>Version 0.5.0  Explainable Root Cause and Risk</w:t>
       </w:r>
     </w:p>
     <w:p>
       <w:r>
-        <w:t>This workbook records the governed AI boundary and deterministic analysis worker for ATEP. IX-1 captures analysis intent, IX-2 produces structured advisory results, and IX-3 converts bounded logs into sanitized timelines and anomaly evidence, while IX-4 adds reviewed test suggestions without a paid service, model download, network call, or GPU.</w:t>
+        <w:t>This workbook records the governed AI boundary and deterministic analysis worker for ATEP. IX-1 captures analysis intent, IX-2 produces structured advisory results, and IX-3 converts bounded logs into sanitized timelines and anomaly evidence, while IX-4 adds reviewed test suggestions, and IX-5 adds explainable risk evidence without a paid service, model download, network call, or GPU.</w:t>
       </w:r>
     </w:p>
     <w:tbl>
@@ -96,7 +96,7 @@
           </w:tcPr>
           <w:p>
             <w:r>
-              <w:t>IX-1 through IX-4 implemented</w:t>
+              <w:t>IX-1 through IX-5 implemented</w:t>
             </w:r>
           </w:p>
         </w:tc>
@@ -152,7 +152,7 @@
           </w:tcPr>
           <w:p>
             <w:r>
-              <w:t>0057 foundation, 0059 workers, 0060 logs, 0061 suggestions</w:t>
+              <w:t>0057 foundation through 0062 root cause and risk</w:t>
             </w:r>
           </w:p>
         </w:tc>
@@ -181,7 +181,7 @@
           </w:tcPr>
           <w:p>
             <w:r>
-              <w:t>IX-5 root cause and risk</w:t>
+              <w:t>IX-6 grounded internal chat</w:t>
             </w:r>
           </w:p>
         </w:tc>
@@ -439,6 +439,35 @@
           <w:p>
             <w:r>
               <w:t>Requirement-aware draft, human review, and catalog promotion</w:t>
+            </w:r>
+          </w:p>
+        </w:tc>
+      </w:tr>
+      <w:tr>
+        <w:trPr>
+          <w:cantSplit/>
+        </w:trPr>
+        <w:tc>
+          <w:tcPr>
+            <w:tcW w:type="dxa" w:w="2448"/>
+            <w:vAlign w:val="center"/>
+            <w:shd w:fill="EAF1F8"/>
+          </w:tcPr>
+          <w:p>
+            <w:r>
+              <w:t>Root cause and risk</w:t>
+            </w:r>
+          </w:p>
+        </w:tc>
+        <w:tc>
+          <w:tcPr>
+            <w:tcW w:type="dxa" w:w="7344"/>
+            <w:vAlign w:val="center"/>
+            <w:shd w:fill="EAF1F8"/>
+          </w:tcPr>
+          <w:p>
+            <w:r>
+              <w:t>Evidence ranking, risk score, and prediction evaluation</w:t>
             </w:r>
           </w:p>
         </w:tc>
@@ -1703,7 +1732,282 @@
         <w:pStyle w:val="Heading1"/>
       </w:pPr>
       <w:r>
-        <w:t>8 Verification Catalogue</w:t>
+        <w:t>8 Root Cause and Risk</w:t>
+      </w:r>
+    </w:p>
+    <w:p>
+      <w:r>
+        <w:t>IX-5 ranks bounded signals that cite only evidence governed by the request. A transparent formula combines the highest hypothesis support, severity impact, and inverse detectability. The result prioritizes investigation and never asserts causality.</w:t>
+      </w:r>
+    </w:p>
+    <w:tbl>
+      <w:tblPr>
+        <w:tblStyle w:val="TableGrid"/>
+        <w:tblW w:type="auto" w:w="0"/>
+        <w:tblLook w:firstColumn="1" w:firstRow="1" w:lastColumn="0" w:lastRow="0" w:noHBand="0" w:noVBand="1" w:val="04A0"/>
+      </w:tblPr>
+      <w:tblGrid>
+        <w:gridCol w:w="3360"/>
+        <w:gridCol w:w="3360"/>
+        <w:gridCol w:w="3360"/>
+      </w:tblGrid>
+      <w:tr>
+        <w:trPr>
+          <w:tblHeader w:val="true"/>
+        </w:trPr>
+        <w:tc>
+          <w:tcPr>
+            <w:tcW w:type="dxa" w:w="2160"/>
+            <w:shd w:fill="1F4E78"/>
+            <w:vAlign w:val="center"/>
+          </w:tcPr>
+          <w:p>
+            <w:r>
+              <w:rPr>
+                <w:b/>
+                <w:color w:val="FFFFFF"/>
+              </w:rPr>
+              <w:t>Control</w:t>
+            </w:r>
+          </w:p>
+        </w:tc>
+        <w:tc>
+          <w:tcPr>
+            <w:tcW w:type="dxa" w:w="3096"/>
+            <w:shd w:fill="1F4E78"/>
+            <w:vAlign w:val="center"/>
+          </w:tcPr>
+          <w:p>
+            <w:r>
+              <w:rPr>
+                <w:b/>
+                <w:color w:val="FFFFFF"/>
+              </w:rPr>
+              <w:t>Rule</w:t>
+            </w:r>
+          </w:p>
+        </w:tc>
+        <w:tc>
+          <w:tcPr>
+            <w:tcW w:type="dxa" w:w="4536"/>
+            <w:shd w:fill="1F4E78"/>
+            <w:vAlign w:val="center"/>
+          </w:tcPr>
+          <w:p>
+            <w:r>
+              <w:rPr>
+                <w:b/>
+                <w:color w:val="FFFFFF"/>
+              </w:rPr>
+              <w:t>Engineering purpose</w:t>
+            </w:r>
+          </w:p>
+        </w:tc>
+      </w:tr>
+      <w:tr>
+        <w:trPr>
+          <w:cantSplit/>
+        </w:trPr>
+        <w:tc>
+          <w:tcPr>
+            <w:tcW w:type="dxa" w:w="2160"/>
+            <w:vAlign w:val="center"/>
+          </w:tcPr>
+          <w:p>
+            <w:r>
+              <w:t>Signals</w:t>
+            </w:r>
+          </w:p>
+        </w:tc>
+        <w:tc>
+          <w:tcPr>
+            <w:tcW w:type="dxa" w:w="3096"/>
+            <w:vAlign w:val="center"/>
+          </w:tcPr>
+          <w:p>
+            <w:r>
+              <w:t>1 to 50 unique codes</w:t>
+            </w:r>
+          </w:p>
+        </w:tc>
+        <w:tc>
+          <w:tcPr>
+            <w:tcW w:type="dxa" w:w="4536"/>
+            <w:vAlign w:val="center"/>
+          </w:tcPr>
+          <w:p>
+            <w:r>
+              <w:t>Bound processing and ambiguity</w:t>
+            </w:r>
+          </w:p>
+        </w:tc>
+      </w:tr>
+      <w:tr>
+        <w:trPr>
+          <w:cantSplit/>
+        </w:trPr>
+        <w:tc>
+          <w:tcPr>
+            <w:tcW w:type="dxa" w:w="2160"/>
+            <w:vAlign w:val="center"/>
+            <w:shd w:fill="EAF1F8"/>
+          </w:tcPr>
+          <w:p>
+            <w:r>
+              <w:t>Evidence</w:t>
+            </w:r>
+          </w:p>
+        </w:tc>
+        <w:tc>
+          <w:tcPr>
+            <w:tcW w:type="dxa" w:w="3096"/>
+            <w:vAlign w:val="center"/>
+            <w:shd w:fill="EAF1F8"/>
+          </w:tcPr>
+          <w:p>
+            <w:r>
+              <w:t>Request references only</w:t>
+            </w:r>
+          </w:p>
+        </w:tc>
+        <w:tc>
+          <w:tcPr>
+            <w:tcW w:type="dxa" w:w="4536"/>
+            <w:vAlign w:val="center"/>
+            <w:shd w:fill="EAF1F8"/>
+          </w:tcPr>
+          <w:p>
+            <w:r>
+              <w:t>Prevent unsupported conclusions</w:t>
+            </w:r>
+          </w:p>
+        </w:tc>
+      </w:tr>
+      <w:tr>
+        <w:trPr>
+          <w:cantSplit/>
+        </w:trPr>
+        <w:tc>
+          <w:tcPr>
+            <w:tcW w:type="dxa" w:w="2160"/>
+            <w:vAlign w:val="center"/>
+          </w:tcPr>
+          <w:p>
+            <w:r>
+              <w:t>Risk</w:t>
+            </w:r>
+          </w:p>
+        </w:tc>
+        <w:tc>
+          <w:tcPr>
+            <w:tcW w:type="dxa" w:w="3096"/>
+            <w:vAlign w:val="center"/>
+          </w:tcPr>
+          <w:p>
+            <w:r>
+              <w:t>Fixed 0 to 100 formula</w:t>
+            </w:r>
+          </w:p>
+        </w:tc>
+        <w:tc>
+          <w:tcPr>
+            <w:tcW w:type="dxa" w:w="4536"/>
+            <w:vAlign w:val="center"/>
+          </w:tcPr>
+          <w:p>
+            <w:r>
+              <w:t>Make prioritization reproducible</w:t>
+            </w:r>
+          </w:p>
+        </w:tc>
+      </w:tr>
+      <w:tr>
+        <w:trPr>
+          <w:cantSplit/>
+        </w:trPr>
+        <w:tc>
+          <w:tcPr>
+            <w:tcW w:type="dxa" w:w="2160"/>
+            <w:vAlign w:val="center"/>
+            <w:shd w:fill="EAF1F8"/>
+          </w:tcPr>
+          <w:p>
+            <w:r>
+              <w:t>Outcome</w:t>
+            </w:r>
+          </w:p>
+        </w:tc>
+        <w:tc>
+          <w:tcPr>
+            <w:tcW w:type="dxa" w:w="3096"/>
+            <w:vAlign w:val="center"/>
+            <w:shd w:fill="EAF1F8"/>
+          </w:tcPr>
+          <w:p>
+            <w:r>
+              <w:t>Versioned observed evidence</w:t>
+            </w:r>
+          </w:p>
+        </w:tc>
+        <w:tc>
+          <w:tcPr>
+            <w:tcW w:type="dxa" w:w="4536"/>
+            <w:vAlign w:val="center"/>
+            <w:shd w:fill="EAF1F8"/>
+          </w:tcPr>
+          <w:p>
+            <w:r>
+              <w:t>Measure prediction quality</w:t>
+            </w:r>
+          </w:p>
+        </w:tc>
+      </w:tr>
+      <w:tr>
+        <w:trPr>
+          <w:cantSplit/>
+        </w:trPr>
+        <w:tc>
+          <w:tcPr>
+            <w:tcW w:type="dxa" w:w="2160"/>
+            <w:vAlign w:val="center"/>
+          </w:tcPr>
+          <w:p>
+            <w:r>
+              <w:t>Metrics</w:t>
+            </w:r>
+          </w:p>
+        </w:tc>
+        <w:tc>
+          <w:tcPr>
+            <w:tcW w:type="dxa" w:w="3096"/>
+            <w:vAlign w:val="center"/>
+          </w:tcPr>
+          <w:p>
+            <w:r>
+              <w:t>Accuracy and Brier score</w:t>
+            </w:r>
+          </w:p>
+        </w:tc>
+        <w:tc>
+          <w:tcPr>
+            <w:tcW w:type="dxa" w:w="4536"/>
+            <w:vAlign w:val="center"/>
+          </w:tcPr>
+          <w:p>
+            <w:r>
+              <w:t>Compare historical performance</w:t>
+            </w:r>
+          </w:p>
+        </w:tc>
+      </w:tr>
+    </w:tbl>
+    <w:p/>
+    <w:p>
+      <w:pPr>
+        <w:pStyle w:val="Heading1"/>
+      </w:pPr>
+      <w:r>
+        <w:t>9 Verification Catalogue</w:t>
       </w:r>
     </w:p>
     <w:tbl>
@@ -2257,6 +2561,89 @@
           </w:p>
         </w:tc>
       </w:tr>
+      <w:tr>
+        <w:trPr>
+          <w:cantSplit/>
+        </w:trPr>
+        <w:tc>
+          <w:tcPr>
+            <w:tcW w:type="dxa" w:w="2016"/>
+            <w:vAlign w:val="center"/>
+          </w:tcPr>
+          <w:p>
+            <w:r>
+              <w:t>AI-T-031 to 034</w:t>
+            </w:r>
+          </w:p>
+        </w:tc>
+        <w:tc>
+          <w:tcPr>
+            <w:tcW w:type="dxa" w:w="7776"/>
+            <w:vAlign w:val="center"/>
+          </w:tcPr>
+          <w:p>
+            <w:r>
+              <w:t>Verify signal policy, ranking, risk formula, and limitations</w:t>
+            </w:r>
+          </w:p>
+        </w:tc>
+      </w:tr>
+      <w:tr>
+        <w:trPr>
+          <w:cantSplit/>
+        </w:trPr>
+        <w:tc>
+          <w:tcPr>
+            <w:tcW w:type="dxa" w:w="2016"/>
+            <w:vAlign w:val="center"/>
+            <w:shd w:fill="EAF1F8"/>
+          </w:tcPr>
+          <w:p>
+            <w:r>
+              <w:t>AI-T-035 to 037</w:t>
+            </w:r>
+          </w:p>
+        </w:tc>
+        <w:tc>
+          <w:tcPr>
+            <w:tcW w:type="dxa" w:w="7776"/>
+            <w:vAlign w:val="center"/>
+            <w:shd w:fill="EAF1F8"/>
+          </w:tcPr>
+          <w:p>
+            <w:r>
+              <w:t>Verify evaluation, Brier score, metrics, APIs, and RBAC</w:t>
+            </w:r>
+          </w:p>
+        </w:tc>
+      </w:tr>
+      <w:tr>
+        <w:trPr>
+          <w:cantSplit/>
+        </w:trPr>
+        <w:tc>
+          <w:tcPr>
+            <w:tcW w:type="dxa" w:w="2016"/>
+            <w:vAlign w:val="center"/>
+          </w:tcPr>
+          <w:p>
+            <w:r>
+              <w:t>AI-T-038</w:t>
+            </w:r>
+          </w:p>
+        </w:tc>
+        <w:tc>
+          <w:tcPr>
+            <w:tcW w:type="dxa" w:w="7776"/>
+            <w:vAlign w:val="center"/>
+          </w:tcPr>
+          <w:p>
+            <w:r>
+              <w:t>Apply migration 0062 through hosted Docker integration</w:t>
+            </w:r>
+          </w:p>
+        </w:tc>
+      </w:tr>
     </w:tbl>
     <w:p/>
     <w:p>
@@ -2264,7 +2651,7 @@
         <w:pStyle w:val="Heading1"/>
       </w:pPr>
       <w:r>
-        <w:t>9 Risks and Next Development</w:t>
+        <w:t>10 Risks and Next Development</w:t>
       </w:r>
     </w:p>
     <w:tbl>
@@ -2421,7 +2808,7 @@
           </w:tcPr>
           <w:p>
             <w:r>
-              <w:t>No model or GPU in IX-1 through IX-4</w:t>
+              <w:t>No model or GPU in IX-1 through IX-5</w:t>
             </w:r>
           </w:p>
         </w:tc>
@@ -2590,6 +2977,62 @@
           <w:p>
             <w:r>
               <w:t>Human review and inactive catalog promotion</w:t>
+            </w:r>
+          </w:p>
+        </w:tc>
+      </w:tr>
+      <w:tr>
+        <w:trPr>
+          <w:cantSplit/>
+        </w:trPr>
+        <w:tc>
+          <w:tcPr>
+            <w:tcW w:type="dxa" w:w="3168"/>
+            <w:vAlign w:val="center"/>
+          </w:tcPr>
+          <w:p>
+            <w:r>
+              <w:t>False root cause</w:t>
+            </w:r>
+          </w:p>
+        </w:tc>
+        <w:tc>
+          <w:tcPr>
+            <w:tcW w:type="dxa" w:w="6624"/>
+            <w:vAlign w:val="center"/>
+          </w:tcPr>
+          <w:p>
+            <w:r>
+              <w:t>Rank associations with explicit causal limitations</w:t>
+            </w:r>
+          </w:p>
+        </w:tc>
+      </w:tr>
+      <w:tr>
+        <w:trPr>
+          <w:cantSplit/>
+        </w:trPr>
+        <w:tc>
+          <w:tcPr>
+            <w:tcW w:type="dxa" w:w="3168"/>
+            <w:vAlign w:val="center"/>
+            <w:shd w:fill="EAF1F8"/>
+          </w:tcPr>
+          <w:p>
+            <w:r>
+              <w:t>Misread risk score</w:t>
+            </w:r>
+          </w:p>
+        </w:tc>
+        <w:tc>
+          <w:tcPr>
+            <w:tcW w:type="dxa" w:w="6624"/>
+            <w:vAlign w:val="center"/>
+            <w:shd w:fill="EAF1F8"/>
+          </w:tcPr>
+          <w:p>
+            <w:r>
+              <w:t>Document fixed formula and non-probability meaning</w:t>
             </w:r>
           </w:p>
         </w:tc>

</xml_diff>

<commit_message>
feat(ai-engine): add grounded internal chat
</commit_message>
<xml_diff>
--- a/docs/ATEP_Volume_IX_AI_Test_Engineer_Engineering_Workbook.docx
+++ b/docs/ATEP_Volume_IX_AI_Test_Engineer_Engineering_Workbook.docx
@@ -19,12 +19,12 @@
         <w:rPr>
           <w:b/>
         </w:rPr>
-        <w:t>Version 0.5.0  Explainable Root Cause and Risk</w:t>
+        <w:t>Version 0.6.0  Grounded Internal Chat</w:t>
       </w:r>
     </w:p>
     <w:p>
       <w:r>
-        <w:t>This workbook records the governed AI boundary and deterministic analysis worker for ATEP. IX-1 captures analysis intent, IX-2 produces structured advisory results, and IX-3 converts bounded logs into sanitized timelines and anomaly evidence, while IX-4 adds reviewed test suggestions, and IX-5 adds explainable risk evidence without a paid service, model download, network call, or GPU.</w:t>
+        <w:t>This workbook records the governed AI boundary and deterministic analysis worker for ATEP. IX-1 captures analysis intent, IX-2 produces structured advisory results, and IX-3 converts bounded logs into sanitized timelines and anomaly evidence, while IX-4 adds reviewed test suggestions, IX-5 adds explainable risk evidence, and IX-6 adds private grounded conversations without a paid service, model download, network call, or GPU.</w:t>
       </w:r>
     </w:p>
     <w:tbl>
@@ -96,7 +96,7 @@
           </w:tcPr>
           <w:p>
             <w:r>
-              <w:t>IX-1 through IX-5 implemented</w:t>
+              <w:t>IX-1 through IX-6 implemented</w:t>
             </w:r>
           </w:p>
         </w:tc>
@@ -152,7 +152,7 @@
           </w:tcPr>
           <w:p>
             <w:r>
-              <w:t>0057 foundation through 0062 root cause and risk</w:t>
+              <w:t>0057 foundation through 0063 grounded chat</w:t>
             </w:r>
           </w:p>
         </w:tc>
@@ -181,7 +181,7 @@
           </w:tcPr>
           <w:p>
             <w:r>
-              <w:t>IX-6 grounded internal chat</w:t>
+              <w:t>IX-7 cross-platform AI evidence</w:t>
             </w:r>
           </w:p>
         </w:tc>
@@ -468,6 +468,33 @@
           <w:p>
             <w:r>
               <w:t>Evidence ranking, risk score, and prediction evaluation</w:t>
+            </w:r>
+          </w:p>
+        </w:tc>
+      </w:tr>
+      <w:tr>
+        <w:trPr>
+          <w:cantSplit/>
+        </w:trPr>
+        <w:tc>
+          <w:tcPr>
+            <w:tcW w:type="dxa" w:w="2448"/>
+            <w:vAlign w:val="center"/>
+          </w:tcPr>
+          <w:p>
+            <w:r>
+              <w:t>Internal chat</w:t>
+            </w:r>
+          </w:p>
+        </w:tc>
+        <w:tc>
+          <w:tcPr>
+            <w:tcW w:type="dxa" w:w="7344"/>
+            <w:vAlign w:val="center"/>
+          </w:tcPr>
+          <w:p>
+            <w:r>
+              <w:t>Private cited exchanges with bounded retention</w:t>
             </w:r>
           </w:p>
         </w:tc>
@@ -2007,7 +2034,323 @@
         <w:pStyle w:val="Heading1"/>
       </w:pPr>
       <w:r>
-        <w:t>9 Verification Catalogue</w:t>
+        <w:t>9 Grounded Internal Chat</w:t>
+      </w:r>
+    </w:p>
+    <w:p>
+      <w:r>
+        <w:t>IX-6 binds each conversation to an analysis request and its owner. Answers cite only evidence governed by that request, identify the limits of citation and causality, and have no authority to mutate operational state. Sensitive values are sanitized before questions are persisted.</w:t>
+      </w:r>
+    </w:p>
+    <w:tbl>
+      <w:tblPr>
+        <w:tblStyle w:val="TableGrid"/>
+        <w:tblW w:type="auto" w:w="0"/>
+        <w:tblLook w:firstColumn="1" w:firstRow="1" w:lastColumn="0" w:lastRow="0" w:noHBand="0" w:noVBand="1" w:val="04A0"/>
+      </w:tblPr>
+      <w:tblGrid>
+        <w:gridCol w:w="3360"/>
+        <w:gridCol w:w="3360"/>
+        <w:gridCol w:w="3360"/>
+      </w:tblGrid>
+      <w:tr>
+        <w:trPr>
+          <w:tblHeader w:val="true"/>
+        </w:trPr>
+        <w:tc>
+          <w:tcPr>
+            <w:tcW w:type="dxa" w:w="2160"/>
+            <w:shd w:fill="1F4E78"/>
+            <w:vAlign w:val="center"/>
+          </w:tcPr>
+          <w:p>
+            <w:r>
+              <w:rPr>
+                <w:b/>
+                <w:color w:val="FFFFFF"/>
+              </w:rPr>
+              <w:t>Control</w:t>
+            </w:r>
+          </w:p>
+        </w:tc>
+        <w:tc>
+          <w:tcPr>
+            <w:tcW w:type="dxa" w:w="3096"/>
+            <w:shd w:fill="1F4E78"/>
+            <w:vAlign w:val="center"/>
+          </w:tcPr>
+          <w:p>
+            <w:r>
+              <w:rPr>
+                <w:b/>
+                <w:color w:val="FFFFFF"/>
+              </w:rPr>
+              <w:t>Rule</w:t>
+            </w:r>
+          </w:p>
+        </w:tc>
+        <w:tc>
+          <w:tcPr>
+            <w:tcW w:type="dxa" w:w="4536"/>
+            <w:shd w:fill="1F4E78"/>
+            <w:vAlign w:val="center"/>
+          </w:tcPr>
+          <w:p>
+            <w:r>
+              <w:rPr>
+                <w:b/>
+                <w:color w:val="FFFFFF"/>
+              </w:rPr>
+              <w:t>Engineering purpose</w:t>
+            </w:r>
+          </w:p>
+        </w:tc>
+      </w:tr>
+      <w:tr>
+        <w:trPr>
+          <w:cantSplit/>
+        </w:trPr>
+        <w:tc>
+          <w:tcPr>
+            <w:tcW w:type="dxa" w:w="2160"/>
+            <w:vAlign w:val="center"/>
+          </w:tcPr>
+          <w:p>
+            <w:r>
+              <w:t>Ownership</w:t>
+            </w:r>
+          </w:p>
+        </w:tc>
+        <w:tc>
+          <w:tcPr>
+            <w:tcW w:type="dxa" w:w="3096"/>
+            <w:vAlign w:val="center"/>
+          </w:tcPr>
+          <w:p>
+            <w:r>
+              <w:t>Request owner only</w:t>
+            </w:r>
+          </w:p>
+        </w:tc>
+        <w:tc>
+          <w:tcPr>
+            <w:tcW w:type="dxa" w:w="4536"/>
+            <w:vAlign w:val="center"/>
+          </w:tcPr>
+          <w:p>
+            <w:r>
+              <w:t>Prevent cross-user evidence disclosure</w:t>
+            </w:r>
+          </w:p>
+        </w:tc>
+      </w:tr>
+      <w:tr>
+        <w:trPr>
+          <w:cantSplit/>
+        </w:trPr>
+        <w:tc>
+          <w:tcPr>
+            <w:tcW w:type="dxa" w:w="2160"/>
+            <w:vAlign w:val="center"/>
+            <w:shd w:fill="EAF1F8"/>
+          </w:tcPr>
+          <w:p>
+            <w:r>
+              <w:t>Citations</w:t>
+            </w:r>
+          </w:p>
+        </w:tc>
+        <w:tc>
+          <w:tcPr>
+            <w:tcW w:type="dxa" w:w="3096"/>
+            <w:vAlign w:val="center"/>
+            <w:shd w:fill="EAF1F8"/>
+          </w:tcPr>
+          <w:p>
+            <w:r>
+              <w:t>One to ten governed refs</w:t>
+            </w:r>
+          </w:p>
+        </w:tc>
+        <w:tc>
+          <w:tcPr>
+            <w:tcW w:type="dxa" w:w="4536"/>
+            <w:vAlign w:val="center"/>
+            <w:shd w:fill="EAF1F8"/>
+          </w:tcPr>
+          <w:p>
+            <w:r>
+              <w:t>Reject unsupported grounding</w:t>
+            </w:r>
+          </w:p>
+        </w:tc>
+      </w:tr>
+      <w:tr>
+        <w:trPr>
+          <w:cantSplit/>
+        </w:trPr>
+        <w:tc>
+          <w:tcPr>
+            <w:tcW w:type="dxa" w:w="2160"/>
+            <w:vAlign w:val="center"/>
+          </w:tcPr>
+          <w:p>
+            <w:r>
+              <w:t>Conversation</w:t>
+            </w:r>
+          </w:p>
+        </w:tc>
+        <w:tc>
+          <w:tcPr>
+            <w:tcW w:type="dxa" w:w="3096"/>
+            <w:vAlign w:val="center"/>
+          </w:tcPr>
+          <w:p>
+            <w:r>
+              <w:t>50 exchanges maximum</w:t>
+            </w:r>
+          </w:p>
+        </w:tc>
+        <w:tc>
+          <w:tcPr>
+            <w:tcW w:type="dxa" w:w="4536"/>
+            <w:vAlign w:val="center"/>
+          </w:tcPr>
+          <w:p>
+            <w:r>
+              <w:t>Bound storage and processing</w:t>
+            </w:r>
+          </w:p>
+        </w:tc>
+      </w:tr>
+      <w:tr>
+        <w:trPr>
+          <w:cantSplit/>
+        </w:trPr>
+        <w:tc>
+          <w:tcPr>
+            <w:tcW w:type="dxa" w:w="2160"/>
+            <w:vAlign w:val="center"/>
+            <w:shd w:fill="EAF1F8"/>
+          </w:tcPr>
+          <w:p>
+            <w:r>
+              <w:t>Retention</w:t>
+            </w:r>
+          </w:p>
+        </w:tc>
+        <w:tc>
+          <w:tcPr>
+            <w:tcW w:type="dxa" w:w="3096"/>
+            <w:vAlign w:val="center"/>
+            <w:shd w:fill="EAF1F8"/>
+          </w:tcPr>
+          <w:p>
+            <w:r>
+              <w:t>One to 30 days</w:t>
+            </w:r>
+          </w:p>
+        </w:tc>
+        <w:tc>
+          <w:tcPr>
+            <w:tcW w:type="dxa" w:w="4536"/>
+            <w:vAlign w:val="center"/>
+            <w:shd w:fill="EAF1F8"/>
+          </w:tcPr>
+          <w:p>
+            <w:r>
+              <w:t>Limit stored conversational content</w:t>
+            </w:r>
+          </w:p>
+        </w:tc>
+      </w:tr>
+      <w:tr>
+        <w:trPr>
+          <w:cantSplit/>
+        </w:trPr>
+        <w:tc>
+          <w:tcPr>
+            <w:tcW w:type="dxa" w:w="2160"/>
+            <w:vAlign w:val="center"/>
+          </w:tcPr>
+          <w:p>
+            <w:r>
+              <w:t>Sanitization</w:t>
+            </w:r>
+          </w:p>
+        </w:tc>
+        <w:tc>
+          <w:tcPr>
+            <w:tcW w:type="dxa" w:w="3096"/>
+            <w:vAlign w:val="center"/>
+          </w:tcPr>
+          <w:p>
+            <w:r>
+              <w:t>Secrets, email, bearer, VIN</w:t>
+            </w:r>
+          </w:p>
+        </w:tc>
+        <w:tc>
+          <w:tcPr>
+            <w:tcW w:type="dxa" w:w="4536"/>
+            <w:vAlign w:val="center"/>
+          </w:tcPr>
+          <w:p>
+            <w:r>
+              <w:t>Reduce sensitive persistence</w:t>
+            </w:r>
+          </w:p>
+        </w:tc>
+      </w:tr>
+      <w:tr>
+        <w:trPr>
+          <w:cantSplit/>
+        </w:trPr>
+        <w:tc>
+          <w:tcPr>
+            <w:tcW w:type="dxa" w:w="2160"/>
+            <w:vAlign w:val="center"/>
+            <w:shd w:fill="EAF1F8"/>
+          </w:tcPr>
+          <w:p>
+            <w:r>
+              <w:t>Authority</w:t>
+            </w:r>
+          </w:p>
+        </w:tc>
+        <w:tc>
+          <w:tcPr>
+            <w:tcW w:type="dxa" w:w="3096"/>
+            <w:vAlign w:val="center"/>
+            <w:shd w:fill="EAF1F8"/>
+          </w:tcPr>
+          <w:p>
+            <w:r>
+              <w:t>Advisory and read-only</w:t>
+            </w:r>
+          </w:p>
+        </w:tc>
+        <w:tc>
+          <w:tcPr>
+            <w:tcW w:type="dxa" w:w="4536"/>
+            <w:vAlign w:val="center"/>
+            <w:shd w:fill="EAF1F8"/>
+          </w:tcPr>
+          <w:p>
+            <w:r>
+              <w:t>Prevent operational mutation</w:t>
+            </w:r>
+          </w:p>
+        </w:tc>
+      </w:tr>
+    </w:tbl>
+    <w:p/>
+    <w:p>
+      <w:pPr>
+        <w:pStyle w:val="Heading1"/>
+      </w:pPr>
+      <w:r>
+        <w:t>10 Verification Catalogue</w:t>
       </w:r>
     </w:p>
     <w:tbl>
@@ -2644,6 +2987,91 @@
           </w:p>
         </w:tc>
       </w:tr>
+      <w:tr>
+        <w:trPr>
+          <w:cantSplit/>
+        </w:trPr>
+        <w:tc>
+          <w:tcPr>
+            <w:tcW w:type="dxa" w:w="2016"/>
+            <w:vAlign w:val="center"/>
+            <w:shd w:fill="EAF1F8"/>
+          </w:tcPr>
+          <w:p>
+            <w:r>
+              <w:t>AI-T-039 to 042</w:t>
+            </w:r>
+          </w:p>
+        </w:tc>
+        <w:tc>
+          <w:tcPr>
+            <w:tcW w:type="dxa" w:w="7776"/>
+            <w:vAlign w:val="center"/>
+            <w:shd w:fill="EAF1F8"/>
+          </w:tcPr>
+          <w:p>
+            <w:r>
+              <w:t>Verify bounds, ownership, grounding, and sanitization</w:t>
+            </w:r>
+          </w:p>
+        </w:tc>
+      </w:tr>
+      <w:tr>
+        <w:trPr>
+          <w:cantSplit/>
+        </w:trPr>
+        <w:tc>
+          <w:tcPr>
+            <w:tcW w:type="dxa" w:w="2016"/>
+            <w:vAlign w:val="center"/>
+          </w:tcPr>
+          <w:p>
+            <w:r>
+              <w:t>AI-T-043 to 045</w:t>
+            </w:r>
+          </w:p>
+        </w:tc>
+        <w:tc>
+          <w:tcPr>
+            <w:tcW w:type="dxa" w:w="7776"/>
+            <w:vAlign w:val="center"/>
+          </w:tcPr>
+          <w:p>
+            <w:r>
+              <w:t>Verify replay, retention, APIs, RBAC, and minimized events</w:t>
+            </w:r>
+          </w:p>
+        </w:tc>
+      </w:tr>
+      <w:tr>
+        <w:trPr>
+          <w:cantSplit/>
+        </w:trPr>
+        <w:tc>
+          <w:tcPr>
+            <w:tcW w:type="dxa" w:w="2016"/>
+            <w:vAlign w:val="center"/>
+            <w:shd w:fill="EAF1F8"/>
+          </w:tcPr>
+          <w:p>
+            <w:r>
+              <w:t>AI-T-046</w:t>
+            </w:r>
+          </w:p>
+        </w:tc>
+        <w:tc>
+          <w:tcPr>
+            <w:tcW w:type="dxa" w:w="7776"/>
+            <w:vAlign w:val="center"/>
+            <w:shd w:fill="EAF1F8"/>
+          </w:tcPr>
+          <w:p>
+            <w:r>
+              <w:t>Apply migration 0063 through hosted Docker integration</w:t>
+            </w:r>
+          </w:p>
+        </w:tc>
+      </w:tr>
     </w:tbl>
     <w:p/>
     <w:p>
@@ -2651,7 +3079,7 @@
         <w:pStyle w:val="Heading1"/>
       </w:pPr>
       <w:r>
-        <w:t>10 Risks and Next Development</w:t>
+        <w:t>11 Risks and Next Development</w:t>
       </w:r>
     </w:p>
     <w:tbl>
@@ -2808,7 +3236,7 @@
           </w:tcPr>
           <w:p>
             <w:r>
-              <w:t>No model or GPU in IX-1 through IX-5</w:t>
+              <w:t>No model or GPU in IX-1 through IX-6</w:t>
             </w:r>
           </w:p>
         </w:tc>
@@ -3033,6 +3461,89 @@
           <w:p>
             <w:r>
               <w:t>Document fixed formula and non-probability meaning</w:t>
+            </w:r>
+          </w:p>
+        </w:tc>
+      </w:tr>
+      <w:tr>
+        <w:trPr>
+          <w:cantSplit/>
+        </w:trPr>
+        <w:tc>
+          <w:tcPr>
+            <w:tcW w:type="dxa" w:w="3168"/>
+            <w:vAlign w:val="center"/>
+          </w:tcPr>
+          <w:p>
+            <w:r>
+              <w:t>Cross-user chat access</w:t>
+            </w:r>
+          </w:p>
+        </w:tc>
+        <w:tc>
+          <w:tcPr>
+            <w:tcW w:type="dxa" w:w="6624"/>
+            <w:vAlign w:val="center"/>
+          </w:tcPr>
+          <w:p>
+            <w:r>
+              <w:t>Owner-scoped non-disclosing retrieval</w:t>
+            </w:r>
+          </w:p>
+        </w:tc>
+      </w:tr>
+      <w:tr>
+        <w:trPr>
+          <w:cantSplit/>
+        </w:trPr>
+        <w:tc>
+          <w:tcPr>
+            <w:tcW w:type="dxa" w:w="3168"/>
+            <w:vAlign w:val="center"/>
+            <w:shd w:fill="EAF1F8"/>
+          </w:tcPr>
+          <w:p>
+            <w:r>
+              <w:t>Stale conversation data</w:t>
+            </w:r>
+          </w:p>
+        </w:tc>
+        <w:tc>
+          <w:tcPr>
+            <w:tcW w:type="dxa" w:w="6624"/>
+            <w:vAlign w:val="center"/>
+            <w:shd w:fill="EAF1F8"/>
+          </w:tcPr>
+          <w:p>
+            <w:r>
+              <w:t>Bounded retention and auditable content purge</w:t>
+            </w:r>
+          </w:p>
+        </w:tc>
+      </w:tr>
+      <w:tr>
+        <w:trPr>
+          <w:cantSplit/>
+        </w:trPr>
+        <w:tc>
+          <w:tcPr>
+            <w:tcW w:type="dxa" w:w="3168"/>
+            <w:vAlign w:val="center"/>
+          </w:tcPr>
+          <w:p>
+            <w:r>
+              <w:t>Unsupported chat claim</w:t>
+            </w:r>
+          </w:p>
+        </w:tc>
+        <w:tc>
+          <w:tcPr>
+            <w:tcW w:type="dxa" w:w="6624"/>
+            <w:vAlign w:val="center"/>
+          </w:tcPr>
+          <w:p>
+            <w:r>
+              <w:t>Request-governed citations and explicit limitations</w:t>
             </w:r>
           </w:p>
         </w:tc>

</xml_diff>

<commit_message>
feat(ai-engine): add grounded internal chat (#103)
</commit_message>
<xml_diff>
--- a/docs/ATEP_Volume_IX_AI_Test_Engineer_Engineering_Workbook.docx
+++ b/docs/ATEP_Volume_IX_AI_Test_Engineer_Engineering_Workbook.docx
@@ -19,12 +19,12 @@
         <w:rPr>
           <w:b/>
         </w:rPr>
-        <w:t>Version 0.5.0  Explainable Root Cause and Risk</w:t>
+        <w:t>Version 0.6.0  Grounded Internal Chat</w:t>
       </w:r>
     </w:p>
     <w:p>
       <w:r>
-        <w:t>This workbook records the governed AI boundary and deterministic analysis worker for ATEP. IX-1 captures analysis intent, IX-2 produces structured advisory results, and IX-3 converts bounded logs into sanitized timelines and anomaly evidence, while IX-4 adds reviewed test suggestions, and IX-5 adds explainable risk evidence without a paid service, model download, network call, or GPU.</w:t>
+        <w:t>This workbook records the governed AI boundary and deterministic analysis worker for ATEP. IX-1 captures analysis intent, IX-2 produces structured advisory results, and IX-3 converts bounded logs into sanitized timelines and anomaly evidence, while IX-4 adds reviewed test suggestions, IX-5 adds explainable risk evidence, and IX-6 adds private grounded conversations without a paid service, model download, network call, or GPU.</w:t>
       </w:r>
     </w:p>
     <w:tbl>
@@ -96,7 +96,7 @@
           </w:tcPr>
           <w:p>
             <w:r>
-              <w:t>IX-1 through IX-5 implemented</w:t>
+              <w:t>IX-1 through IX-6 implemented</w:t>
             </w:r>
           </w:p>
         </w:tc>
@@ -152,7 +152,7 @@
           </w:tcPr>
           <w:p>
             <w:r>
-              <w:t>0057 foundation through 0062 root cause and risk</w:t>
+              <w:t>0057 foundation through 0063 grounded chat</w:t>
             </w:r>
           </w:p>
         </w:tc>
@@ -181,7 +181,7 @@
           </w:tcPr>
           <w:p>
             <w:r>
-              <w:t>IX-6 grounded internal chat</w:t>
+              <w:t>IX-7 cross-platform AI evidence</w:t>
             </w:r>
           </w:p>
         </w:tc>
@@ -468,6 +468,33 @@
           <w:p>
             <w:r>
               <w:t>Evidence ranking, risk score, and prediction evaluation</w:t>
+            </w:r>
+          </w:p>
+        </w:tc>
+      </w:tr>
+      <w:tr>
+        <w:trPr>
+          <w:cantSplit/>
+        </w:trPr>
+        <w:tc>
+          <w:tcPr>
+            <w:tcW w:type="dxa" w:w="2448"/>
+            <w:vAlign w:val="center"/>
+          </w:tcPr>
+          <w:p>
+            <w:r>
+              <w:t>Internal chat</w:t>
+            </w:r>
+          </w:p>
+        </w:tc>
+        <w:tc>
+          <w:tcPr>
+            <w:tcW w:type="dxa" w:w="7344"/>
+            <w:vAlign w:val="center"/>
+          </w:tcPr>
+          <w:p>
+            <w:r>
+              <w:t>Private cited exchanges with bounded retention</w:t>
             </w:r>
           </w:p>
         </w:tc>
@@ -2007,7 +2034,323 @@
         <w:pStyle w:val="Heading1"/>
       </w:pPr>
       <w:r>
-        <w:t>9 Verification Catalogue</w:t>
+        <w:t>9 Grounded Internal Chat</w:t>
+      </w:r>
+    </w:p>
+    <w:p>
+      <w:r>
+        <w:t>IX-6 binds each conversation to an analysis request and its owner. Answers cite only evidence governed by that request, identify the limits of citation and causality, and have no authority to mutate operational state. Sensitive values are sanitized before questions are persisted.</w:t>
+      </w:r>
+    </w:p>
+    <w:tbl>
+      <w:tblPr>
+        <w:tblStyle w:val="TableGrid"/>
+        <w:tblW w:type="auto" w:w="0"/>
+        <w:tblLook w:firstColumn="1" w:firstRow="1" w:lastColumn="0" w:lastRow="0" w:noHBand="0" w:noVBand="1" w:val="04A0"/>
+      </w:tblPr>
+      <w:tblGrid>
+        <w:gridCol w:w="3360"/>
+        <w:gridCol w:w="3360"/>
+        <w:gridCol w:w="3360"/>
+      </w:tblGrid>
+      <w:tr>
+        <w:trPr>
+          <w:tblHeader w:val="true"/>
+        </w:trPr>
+        <w:tc>
+          <w:tcPr>
+            <w:tcW w:type="dxa" w:w="2160"/>
+            <w:shd w:fill="1F4E78"/>
+            <w:vAlign w:val="center"/>
+          </w:tcPr>
+          <w:p>
+            <w:r>
+              <w:rPr>
+                <w:b/>
+                <w:color w:val="FFFFFF"/>
+              </w:rPr>
+              <w:t>Control</w:t>
+            </w:r>
+          </w:p>
+        </w:tc>
+        <w:tc>
+          <w:tcPr>
+            <w:tcW w:type="dxa" w:w="3096"/>
+            <w:shd w:fill="1F4E78"/>
+            <w:vAlign w:val="center"/>
+          </w:tcPr>
+          <w:p>
+            <w:r>
+              <w:rPr>
+                <w:b/>
+                <w:color w:val="FFFFFF"/>
+              </w:rPr>
+              <w:t>Rule</w:t>
+            </w:r>
+          </w:p>
+        </w:tc>
+        <w:tc>
+          <w:tcPr>
+            <w:tcW w:type="dxa" w:w="4536"/>
+            <w:shd w:fill="1F4E78"/>
+            <w:vAlign w:val="center"/>
+          </w:tcPr>
+          <w:p>
+            <w:r>
+              <w:rPr>
+                <w:b/>
+                <w:color w:val="FFFFFF"/>
+              </w:rPr>
+              <w:t>Engineering purpose</w:t>
+            </w:r>
+          </w:p>
+        </w:tc>
+      </w:tr>
+      <w:tr>
+        <w:trPr>
+          <w:cantSplit/>
+        </w:trPr>
+        <w:tc>
+          <w:tcPr>
+            <w:tcW w:type="dxa" w:w="2160"/>
+            <w:vAlign w:val="center"/>
+          </w:tcPr>
+          <w:p>
+            <w:r>
+              <w:t>Ownership</w:t>
+            </w:r>
+          </w:p>
+        </w:tc>
+        <w:tc>
+          <w:tcPr>
+            <w:tcW w:type="dxa" w:w="3096"/>
+            <w:vAlign w:val="center"/>
+          </w:tcPr>
+          <w:p>
+            <w:r>
+              <w:t>Request owner only</w:t>
+            </w:r>
+          </w:p>
+        </w:tc>
+        <w:tc>
+          <w:tcPr>
+            <w:tcW w:type="dxa" w:w="4536"/>
+            <w:vAlign w:val="center"/>
+          </w:tcPr>
+          <w:p>
+            <w:r>
+              <w:t>Prevent cross-user evidence disclosure</w:t>
+            </w:r>
+          </w:p>
+        </w:tc>
+      </w:tr>
+      <w:tr>
+        <w:trPr>
+          <w:cantSplit/>
+        </w:trPr>
+        <w:tc>
+          <w:tcPr>
+            <w:tcW w:type="dxa" w:w="2160"/>
+            <w:vAlign w:val="center"/>
+            <w:shd w:fill="EAF1F8"/>
+          </w:tcPr>
+          <w:p>
+            <w:r>
+              <w:t>Citations</w:t>
+            </w:r>
+          </w:p>
+        </w:tc>
+        <w:tc>
+          <w:tcPr>
+            <w:tcW w:type="dxa" w:w="3096"/>
+            <w:vAlign w:val="center"/>
+            <w:shd w:fill="EAF1F8"/>
+          </w:tcPr>
+          <w:p>
+            <w:r>
+              <w:t>One to ten governed refs</w:t>
+            </w:r>
+          </w:p>
+        </w:tc>
+        <w:tc>
+          <w:tcPr>
+            <w:tcW w:type="dxa" w:w="4536"/>
+            <w:vAlign w:val="center"/>
+            <w:shd w:fill="EAF1F8"/>
+          </w:tcPr>
+          <w:p>
+            <w:r>
+              <w:t>Reject unsupported grounding</w:t>
+            </w:r>
+          </w:p>
+        </w:tc>
+      </w:tr>
+      <w:tr>
+        <w:trPr>
+          <w:cantSplit/>
+        </w:trPr>
+        <w:tc>
+          <w:tcPr>
+            <w:tcW w:type="dxa" w:w="2160"/>
+            <w:vAlign w:val="center"/>
+          </w:tcPr>
+          <w:p>
+            <w:r>
+              <w:t>Conversation</w:t>
+            </w:r>
+          </w:p>
+        </w:tc>
+        <w:tc>
+          <w:tcPr>
+            <w:tcW w:type="dxa" w:w="3096"/>
+            <w:vAlign w:val="center"/>
+          </w:tcPr>
+          <w:p>
+            <w:r>
+              <w:t>50 exchanges maximum</w:t>
+            </w:r>
+          </w:p>
+        </w:tc>
+        <w:tc>
+          <w:tcPr>
+            <w:tcW w:type="dxa" w:w="4536"/>
+            <w:vAlign w:val="center"/>
+          </w:tcPr>
+          <w:p>
+            <w:r>
+              <w:t>Bound storage and processing</w:t>
+            </w:r>
+          </w:p>
+        </w:tc>
+      </w:tr>
+      <w:tr>
+        <w:trPr>
+          <w:cantSplit/>
+        </w:trPr>
+        <w:tc>
+          <w:tcPr>
+            <w:tcW w:type="dxa" w:w="2160"/>
+            <w:vAlign w:val="center"/>
+            <w:shd w:fill="EAF1F8"/>
+          </w:tcPr>
+          <w:p>
+            <w:r>
+              <w:t>Retention</w:t>
+            </w:r>
+          </w:p>
+        </w:tc>
+        <w:tc>
+          <w:tcPr>
+            <w:tcW w:type="dxa" w:w="3096"/>
+            <w:vAlign w:val="center"/>
+            <w:shd w:fill="EAF1F8"/>
+          </w:tcPr>
+          <w:p>
+            <w:r>
+              <w:t>One to 30 days</w:t>
+            </w:r>
+          </w:p>
+        </w:tc>
+        <w:tc>
+          <w:tcPr>
+            <w:tcW w:type="dxa" w:w="4536"/>
+            <w:vAlign w:val="center"/>
+            <w:shd w:fill="EAF1F8"/>
+          </w:tcPr>
+          <w:p>
+            <w:r>
+              <w:t>Limit stored conversational content</w:t>
+            </w:r>
+          </w:p>
+        </w:tc>
+      </w:tr>
+      <w:tr>
+        <w:trPr>
+          <w:cantSplit/>
+        </w:trPr>
+        <w:tc>
+          <w:tcPr>
+            <w:tcW w:type="dxa" w:w="2160"/>
+            <w:vAlign w:val="center"/>
+          </w:tcPr>
+          <w:p>
+            <w:r>
+              <w:t>Sanitization</w:t>
+            </w:r>
+          </w:p>
+        </w:tc>
+        <w:tc>
+          <w:tcPr>
+            <w:tcW w:type="dxa" w:w="3096"/>
+            <w:vAlign w:val="center"/>
+          </w:tcPr>
+          <w:p>
+            <w:r>
+              <w:t>Secrets, email, bearer, VIN</w:t>
+            </w:r>
+          </w:p>
+        </w:tc>
+        <w:tc>
+          <w:tcPr>
+            <w:tcW w:type="dxa" w:w="4536"/>
+            <w:vAlign w:val="center"/>
+          </w:tcPr>
+          <w:p>
+            <w:r>
+              <w:t>Reduce sensitive persistence</w:t>
+            </w:r>
+          </w:p>
+        </w:tc>
+      </w:tr>
+      <w:tr>
+        <w:trPr>
+          <w:cantSplit/>
+        </w:trPr>
+        <w:tc>
+          <w:tcPr>
+            <w:tcW w:type="dxa" w:w="2160"/>
+            <w:vAlign w:val="center"/>
+            <w:shd w:fill="EAF1F8"/>
+          </w:tcPr>
+          <w:p>
+            <w:r>
+              <w:t>Authority</w:t>
+            </w:r>
+          </w:p>
+        </w:tc>
+        <w:tc>
+          <w:tcPr>
+            <w:tcW w:type="dxa" w:w="3096"/>
+            <w:vAlign w:val="center"/>
+            <w:shd w:fill="EAF1F8"/>
+          </w:tcPr>
+          <w:p>
+            <w:r>
+              <w:t>Advisory and read-only</w:t>
+            </w:r>
+          </w:p>
+        </w:tc>
+        <w:tc>
+          <w:tcPr>
+            <w:tcW w:type="dxa" w:w="4536"/>
+            <w:vAlign w:val="center"/>
+            <w:shd w:fill="EAF1F8"/>
+          </w:tcPr>
+          <w:p>
+            <w:r>
+              <w:t>Prevent operational mutation</w:t>
+            </w:r>
+          </w:p>
+        </w:tc>
+      </w:tr>
+    </w:tbl>
+    <w:p/>
+    <w:p>
+      <w:pPr>
+        <w:pStyle w:val="Heading1"/>
+      </w:pPr>
+      <w:r>
+        <w:t>10 Verification Catalogue</w:t>
       </w:r>
     </w:p>
     <w:tbl>
@@ -2644,6 +2987,91 @@
           </w:p>
         </w:tc>
       </w:tr>
+      <w:tr>
+        <w:trPr>
+          <w:cantSplit/>
+        </w:trPr>
+        <w:tc>
+          <w:tcPr>
+            <w:tcW w:type="dxa" w:w="2016"/>
+            <w:vAlign w:val="center"/>
+            <w:shd w:fill="EAF1F8"/>
+          </w:tcPr>
+          <w:p>
+            <w:r>
+              <w:t>AI-T-039 to 042</w:t>
+            </w:r>
+          </w:p>
+        </w:tc>
+        <w:tc>
+          <w:tcPr>
+            <w:tcW w:type="dxa" w:w="7776"/>
+            <w:vAlign w:val="center"/>
+            <w:shd w:fill="EAF1F8"/>
+          </w:tcPr>
+          <w:p>
+            <w:r>
+              <w:t>Verify bounds, ownership, grounding, and sanitization</w:t>
+            </w:r>
+          </w:p>
+        </w:tc>
+      </w:tr>
+      <w:tr>
+        <w:trPr>
+          <w:cantSplit/>
+        </w:trPr>
+        <w:tc>
+          <w:tcPr>
+            <w:tcW w:type="dxa" w:w="2016"/>
+            <w:vAlign w:val="center"/>
+          </w:tcPr>
+          <w:p>
+            <w:r>
+              <w:t>AI-T-043 to 045</w:t>
+            </w:r>
+          </w:p>
+        </w:tc>
+        <w:tc>
+          <w:tcPr>
+            <w:tcW w:type="dxa" w:w="7776"/>
+            <w:vAlign w:val="center"/>
+          </w:tcPr>
+          <w:p>
+            <w:r>
+              <w:t>Verify replay, retention, APIs, RBAC, and minimized events</w:t>
+            </w:r>
+          </w:p>
+        </w:tc>
+      </w:tr>
+      <w:tr>
+        <w:trPr>
+          <w:cantSplit/>
+        </w:trPr>
+        <w:tc>
+          <w:tcPr>
+            <w:tcW w:type="dxa" w:w="2016"/>
+            <w:vAlign w:val="center"/>
+            <w:shd w:fill="EAF1F8"/>
+          </w:tcPr>
+          <w:p>
+            <w:r>
+              <w:t>AI-T-046</w:t>
+            </w:r>
+          </w:p>
+        </w:tc>
+        <w:tc>
+          <w:tcPr>
+            <w:tcW w:type="dxa" w:w="7776"/>
+            <w:vAlign w:val="center"/>
+            <w:shd w:fill="EAF1F8"/>
+          </w:tcPr>
+          <w:p>
+            <w:r>
+              <w:t>Apply migration 0063 through hosted Docker integration</w:t>
+            </w:r>
+          </w:p>
+        </w:tc>
+      </w:tr>
     </w:tbl>
     <w:p/>
     <w:p>
@@ -2651,7 +3079,7 @@
         <w:pStyle w:val="Heading1"/>
       </w:pPr>
       <w:r>
-        <w:t>10 Risks and Next Development</w:t>
+        <w:t>11 Risks and Next Development</w:t>
       </w:r>
     </w:p>
     <w:tbl>
@@ -2808,7 +3236,7 @@
           </w:tcPr>
           <w:p>
             <w:r>
-              <w:t>No model or GPU in IX-1 through IX-5</w:t>
+              <w:t>No model or GPU in IX-1 through IX-6</w:t>
             </w:r>
           </w:p>
         </w:tc>
@@ -3033,6 +3461,89 @@
           <w:p>
             <w:r>
               <w:t>Document fixed formula and non-probability meaning</w:t>
+            </w:r>
+          </w:p>
+        </w:tc>
+      </w:tr>
+      <w:tr>
+        <w:trPr>
+          <w:cantSplit/>
+        </w:trPr>
+        <w:tc>
+          <w:tcPr>
+            <w:tcW w:type="dxa" w:w="3168"/>
+            <w:vAlign w:val="center"/>
+          </w:tcPr>
+          <w:p>
+            <w:r>
+              <w:t>Cross-user chat access</w:t>
+            </w:r>
+          </w:p>
+        </w:tc>
+        <w:tc>
+          <w:tcPr>
+            <w:tcW w:type="dxa" w:w="6624"/>
+            <w:vAlign w:val="center"/>
+          </w:tcPr>
+          <w:p>
+            <w:r>
+              <w:t>Owner-scoped non-disclosing retrieval</w:t>
+            </w:r>
+          </w:p>
+        </w:tc>
+      </w:tr>
+      <w:tr>
+        <w:trPr>
+          <w:cantSplit/>
+        </w:trPr>
+        <w:tc>
+          <w:tcPr>
+            <w:tcW w:type="dxa" w:w="3168"/>
+            <w:vAlign w:val="center"/>
+            <w:shd w:fill="EAF1F8"/>
+          </w:tcPr>
+          <w:p>
+            <w:r>
+              <w:t>Stale conversation data</w:t>
+            </w:r>
+          </w:p>
+        </w:tc>
+        <w:tc>
+          <w:tcPr>
+            <w:tcW w:type="dxa" w:w="6624"/>
+            <w:vAlign w:val="center"/>
+            <w:shd w:fill="EAF1F8"/>
+          </w:tcPr>
+          <w:p>
+            <w:r>
+              <w:t>Bounded retention and auditable content purge</w:t>
+            </w:r>
+          </w:p>
+        </w:tc>
+      </w:tr>
+      <w:tr>
+        <w:trPr>
+          <w:cantSplit/>
+        </w:trPr>
+        <w:tc>
+          <w:tcPr>
+            <w:tcW w:type="dxa" w:w="3168"/>
+            <w:vAlign w:val="center"/>
+          </w:tcPr>
+          <w:p>
+            <w:r>
+              <w:t>Unsupported chat claim</w:t>
+            </w:r>
+          </w:p>
+        </w:tc>
+        <w:tc>
+          <w:tcPr>
+            <w:tcW w:type="dxa" w:w="6624"/>
+            <w:vAlign w:val="center"/>
+          </w:tcPr>
+          <w:p>
+            <w:r>
+              <w:t>Request-governed citations and explicit limitations</w:t>
             </w:r>
           </w:p>
         </w:tc>

</xml_diff>

<commit_message>
feat(ai-engine): add cross-platform evidence projections
</commit_message>
<xml_diff>
--- a/docs/ATEP_Volume_IX_AI_Test_Engineer_Engineering_Workbook.docx
+++ b/docs/ATEP_Volume_IX_AI_Test_Engineer_Engineering_Workbook.docx
@@ -19,12 +19,12 @@
         <w:rPr>
           <w:b/>
         </w:rPr>
-        <w:t>Version 0.6.0  Grounded Internal Chat</w:t>
+        <w:t>Version 0.7.0  Cross Platform AI Evidence</w:t>
       </w:r>
     </w:p>
     <w:p>
       <w:r>
-        <w:t>This workbook records the governed AI boundary and deterministic analysis worker for ATEP. IX-1 captures analysis intent, IX-2 produces structured advisory results, and IX-3 converts bounded logs into sanitized timelines and anomaly evidence, while IX-4 adds reviewed test suggestions, IX-5 adds explainable risk evidence, and IX-6 adds private grounded conversations without a paid service, model download, network call, or GPU.</w:t>
+        <w:t>This workbook records the governed AI boundary and deterministic analysis worker for ATEP. IX-1 captures analysis intent, IX-2 produces structured advisory results, and IX-3 converts bounded logs into sanitized timelines and anomaly evidence, while IX-4 adds reviewed test suggestions, IX-5 adds explainable risk evidence, and IX-6 adds private grounded conversations, and IX-7 completes versioned evidence feeds for CarSystemUI and dashboard consumers without a paid service, model download, network call, or GPU.</w:t>
       </w:r>
     </w:p>
     <w:tbl>
@@ -96,7 +96,7 @@
           </w:tcPr>
           <w:p>
             <w:r>
-              <w:t>IX-1 through IX-6 implemented</w:t>
+              <w:t>Volume IX complete through IX-7</w:t>
             </w:r>
           </w:p>
         </w:tc>
@@ -152,7 +152,7 @@
           </w:tcPr>
           <w:p>
             <w:r>
-              <w:t>0057 foundation through 0063 grounded chat</w:t>
+              <w:t>0057 foundation through 0064 evidence projections</w:t>
             </w:r>
           </w:p>
         </w:tc>
@@ -181,7 +181,7 @@
           </w:tcPr>
           <w:p>
             <w:r>
-              <w:t>IX-7 cross-platform AI evidence</w:t>
+              <w:t>Volume X dashboard consumption</w:t>
             </w:r>
           </w:p>
         </w:tc>
@@ -495,6 +495,35 @@
           <w:p>
             <w:r>
               <w:t>Private cited exchanges with bounded retention</w:t>
+            </w:r>
+          </w:p>
+        </w:tc>
+      </w:tr>
+      <w:tr>
+        <w:trPr>
+          <w:cantSplit/>
+        </w:trPr>
+        <w:tc>
+          <w:tcPr>
+            <w:tcW w:type="dxa" w:w="2448"/>
+            <w:vAlign w:val="center"/>
+            <w:shd w:fill="EAF1F8"/>
+          </w:tcPr>
+          <w:p>
+            <w:r>
+              <w:t>Evidence projections</w:t>
+            </w:r>
+          </w:p>
+        </w:tc>
+        <w:tc>
+          <w:tcPr>
+            <w:tcW w:type="dxa" w:w="7344"/>
+            <w:vAlign w:val="center"/>
+            <w:shd w:fill="EAF1F8"/>
+          </w:tcPr>
+          <w:p>
+            <w:r>
+              <w:t>Versioned read-only cards for vehicle UI and dashboard</w:t>
             </w:r>
           </w:p>
         </w:tc>
@@ -2350,7 +2379,323 @@
         <w:pStyle w:val="Heading1"/>
       </w:pPr>
       <w:r>
-        <w:t>10 Verification Catalogue</w:t>
+        <w:t>10 Cross Platform AI Evidence</w:t>
+      </w:r>
+    </w:p>
+    <w:p>
+      <w:r>
+        <w:t>IX-7 derives immutable client cards from persisted AI sources. The allowlisted contract contains subject, status, severity, bounded explanatory text, and governed citations. It excludes source context, prompts, raw logs, signal collections, and every operational mutation path.</w:t>
+      </w:r>
+    </w:p>
+    <w:tbl>
+      <w:tblPr>
+        <w:tblStyle w:val="TableGrid"/>
+        <w:tblW w:type="auto" w:w="0"/>
+        <w:tblLook w:firstColumn="1" w:firstRow="1" w:lastColumn="0" w:lastRow="0" w:noHBand="0" w:noVBand="1" w:val="04A0"/>
+      </w:tblPr>
+      <w:tblGrid>
+        <w:gridCol w:w="3360"/>
+        <w:gridCol w:w="3360"/>
+        <w:gridCol w:w="3360"/>
+      </w:tblGrid>
+      <w:tr>
+        <w:trPr>
+          <w:tblHeader w:val="true"/>
+        </w:trPr>
+        <w:tc>
+          <w:tcPr>
+            <w:tcW w:type="dxa" w:w="2160"/>
+            <w:shd w:fill="1F4E78"/>
+            <w:vAlign w:val="center"/>
+          </w:tcPr>
+          <w:p>
+            <w:r>
+              <w:rPr>
+                <w:b/>
+                <w:color w:val="FFFFFF"/>
+              </w:rPr>
+              <w:t>Control</w:t>
+            </w:r>
+          </w:p>
+        </w:tc>
+        <w:tc>
+          <w:tcPr>
+            <w:tcW w:type="dxa" w:w="3096"/>
+            <w:shd w:fill="1F4E78"/>
+            <w:vAlign w:val="center"/>
+          </w:tcPr>
+          <w:p>
+            <w:r>
+              <w:rPr>
+                <w:b/>
+                <w:color w:val="FFFFFF"/>
+              </w:rPr>
+              <w:t>Rule</w:t>
+            </w:r>
+          </w:p>
+        </w:tc>
+        <w:tc>
+          <w:tcPr>
+            <w:tcW w:type="dxa" w:w="4536"/>
+            <w:shd w:fill="1F4E78"/>
+            <w:vAlign w:val="center"/>
+          </w:tcPr>
+          <w:p>
+            <w:r>
+              <w:rPr>
+                <w:b/>
+                <w:color w:val="FFFFFF"/>
+              </w:rPr>
+              <w:t>Engineering purpose</w:t>
+            </w:r>
+          </w:p>
+        </w:tc>
+      </w:tr>
+      <w:tr>
+        <w:trPr>
+          <w:cantSplit/>
+        </w:trPr>
+        <w:tc>
+          <w:tcPr>
+            <w:tcW w:type="dxa" w:w="2160"/>
+            <w:vAlign w:val="center"/>
+          </w:tcPr>
+          <w:p>
+            <w:r>
+              <w:t>Consumers</w:t>
+            </w:r>
+          </w:p>
+        </w:tc>
+        <w:tc>
+          <w:tcPr>
+            <w:tcW w:type="dxa" w:w="3096"/>
+            <w:vAlign w:val="center"/>
+          </w:tcPr>
+          <w:p>
+            <w:r>
+              <w:t>CarSystemUI or dashboard</w:t>
+            </w:r>
+          </w:p>
+        </w:tc>
+        <w:tc>
+          <w:tcPr>
+            <w:tcW w:type="dxa" w:w="4536"/>
+            <w:vAlign w:val="center"/>
+          </w:tcPr>
+          <w:p>
+            <w:r>
+              <w:t>Keep client contracts explicit</w:t>
+            </w:r>
+          </w:p>
+        </w:tc>
+      </w:tr>
+      <w:tr>
+        <w:trPr>
+          <w:cantSplit/>
+        </w:trPr>
+        <w:tc>
+          <w:tcPr>
+            <w:tcW w:type="dxa" w:w="2160"/>
+            <w:vAlign w:val="center"/>
+            <w:shd w:fill="EAF1F8"/>
+          </w:tcPr>
+          <w:p>
+            <w:r>
+              <w:t>Sources</w:t>
+            </w:r>
+          </w:p>
+        </w:tc>
+        <w:tc>
+          <w:tcPr>
+            <w:tcW w:type="dxa" w:w="3096"/>
+            <w:vAlign w:val="center"/>
+            <w:shd w:fill="EAF1F8"/>
+          </w:tcPr>
+          <w:p>
+            <w:r>
+              <w:t>Five persisted AI types</w:t>
+            </w:r>
+          </w:p>
+        </w:tc>
+        <w:tc>
+          <w:tcPr>
+            <w:tcW w:type="dxa" w:w="4536"/>
+            <w:vAlign w:val="center"/>
+            <w:shd w:fill="EAF1F8"/>
+          </w:tcPr>
+          <w:p>
+            <w:r>
+              <w:t>Prevent arbitrary client-authored claims</w:t>
+            </w:r>
+          </w:p>
+        </w:tc>
+      </w:tr>
+      <w:tr>
+        <w:trPr>
+          <w:cantSplit/>
+        </w:trPr>
+        <w:tc>
+          <w:tcPr>
+            <w:tcW w:type="dxa" w:w="2160"/>
+            <w:vAlign w:val="center"/>
+          </w:tcPr>
+          <w:p>
+            <w:r>
+              <w:t>Summary</w:t>
+            </w:r>
+          </w:p>
+        </w:tc>
+        <w:tc>
+          <w:tcPr>
+            <w:tcW w:type="dxa" w:w="3096"/>
+            <w:vAlign w:val="center"/>
+          </w:tcPr>
+          <w:p>
+            <w:r>
+              <w:t>1000 characters maximum</w:t>
+            </w:r>
+          </w:p>
+        </w:tc>
+        <w:tc>
+          <w:tcPr>
+            <w:tcW w:type="dxa" w:w="4536"/>
+            <w:vAlign w:val="center"/>
+          </w:tcPr>
+          <w:p>
+            <w:r>
+              <w:t>Bound payload and disclosure</w:t>
+            </w:r>
+          </w:p>
+        </w:tc>
+      </w:tr>
+      <w:tr>
+        <w:trPr>
+          <w:cantSplit/>
+        </w:trPr>
+        <w:tc>
+          <w:tcPr>
+            <w:tcW w:type="dxa" w:w="2160"/>
+            <w:vAlign w:val="center"/>
+            <w:shd w:fill="EAF1F8"/>
+          </w:tcPr>
+          <w:p>
+            <w:r>
+              <w:t>Citations</w:t>
+            </w:r>
+          </w:p>
+        </w:tc>
+        <w:tc>
+          <w:tcPr>
+            <w:tcW w:type="dxa" w:w="3096"/>
+            <w:vAlign w:val="center"/>
+            <w:shd w:fill="EAF1F8"/>
+          </w:tcPr>
+          <w:p>
+            <w:r>
+              <w:t>20 unique refs maximum</w:t>
+            </w:r>
+          </w:p>
+        </w:tc>
+        <w:tc>
+          <w:tcPr>
+            <w:tcW w:type="dxa" w:w="4536"/>
+            <w:vAlign w:val="center"/>
+            <w:shd w:fill="EAF1F8"/>
+          </w:tcPr>
+          <w:p>
+            <w:r>
+              <w:t>Preserve reviewable grounding</w:t>
+            </w:r>
+          </w:p>
+        </w:tc>
+      </w:tr>
+      <w:tr>
+        <w:trPr>
+          <w:cantSplit/>
+        </w:trPr>
+        <w:tc>
+          <w:tcPr>
+            <w:tcW w:type="dxa" w:w="2160"/>
+            <w:vAlign w:val="center"/>
+          </w:tcPr>
+          <w:p>
+            <w:r>
+              <w:t>Contract</w:t>
+            </w:r>
+          </w:p>
+        </w:tc>
+        <w:tc>
+          <w:tcPr>
+            <w:tcW w:type="dxa" w:w="3096"/>
+            <w:vAlign w:val="center"/>
+          </w:tcPr>
+          <w:p>
+            <w:r>
+              <w:t>ai-evidence-v1</w:t>
+            </w:r>
+          </w:p>
+        </w:tc>
+        <w:tc>
+          <w:tcPr>
+            <w:tcW w:type="dxa" w:w="4536"/>
+            <w:vAlign w:val="center"/>
+          </w:tcPr>
+          <w:p>
+            <w:r>
+              <w:t>Support independent client evolution</w:t>
+            </w:r>
+          </w:p>
+        </w:tc>
+      </w:tr>
+      <w:tr>
+        <w:trPr>
+          <w:cantSplit/>
+        </w:trPr>
+        <w:tc>
+          <w:tcPr>
+            <w:tcW w:type="dxa" w:w="2160"/>
+            <w:vAlign w:val="center"/>
+            <w:shd w:fill="EAF1F8"/>
+          </w:tcPr>
+          <w:p>
+            <w:r>
+              <w:t>Lifecycle</w:t>
+            </w:r>
+          </w:p>
+        </w:tc>
+        <w:tc>
+          <w:tcPr>
+            <w:tcW w:type="dxa" w:w="3096"/>
+            <w:vAlign w:val="center"/>
+            <w:shd w:fill="EAF1F8"/>
+          </w:tcPr>
+          <w:p>
+            <w:r>
+              <w:t>Immutable snapshot</w:t>
+            </w:r>
+          </w:p>
+        </w:tc>
+        <w:tc>
+          <w:tcPr>
+            <w:tcW w:type="dxa" w:w="4536"/>
+            <w:vAlign w:val="center"/>
+            <w:shd w:fill="EAF1F8"/>
+          </w:tcPr>
+          <w:p>
+            <w:r>
+              <w:t>Preserve historical evidence</w:t>
+            </w:r>
+          </w:p>
+        </w:tc>
+      </w:tr>
+    </w:tbl>
+    <w:p/>
+    <w:p>
+      <w:pPr>
+        <w:pStyle w:val="Heading1"/>
+      </w:pPr>
+      <w:r>
+        <w:t>11 Verification Catalogue</w:t>
       </w:r>
     </w:p>
     <w:tbl>
@@ -3072,6 +3417,89 @@
           </w:p>
         </w:tc>
       </w:tr>
+      <w:tr>
+        <w:trPr>
+          <w:cantSplit/>
+        </w:trPr>
+        <w:tc>
+          <w:tcPr>
+            <w:tcW w:type="dxa" w:w="2016"/>
+            <w:vAlign w:val="center"/>
+          </w:tcPr>
+          <w:p>
+            <w:r>
+              <w:t>AI-T-047 to 049</w:t>
+            </w:r>
+          </w:p>
+        </w:tc>
+        <w:tc>
+          <w:tcPr>
+            <w:tcW w:type="dxa" w:w="7776"/>
+            <w:vAlign w:val="center"/>
+          </w:tcPr>
+          <w:p>
+            <w:r>
+              <w:t>Verify sources, derivation, bounds, and private ownership</w:t>
+            </w:r>
+          </w:p>
+        </w:tc>
+      </w:tr>
+      <w:tr>
+        <w:trPr>
+          <w:cantSplit/>
+        </w:trPr>
+        <w:tc>
+          <w:tcPr>
+            <w:tcW w:type="dxa" w:w="2016"/>
+            <w:vAlign w:val="center"/>
+            <w:shd w:fill="EAF1F8"/>
+          </w:tcPr>
+          <w:p>
+            <w:r>
+              <w:t>AI-T-050 to 051</w:t>
+            </w:r>
+          </w:p>
+        </w:tc>
+        <w:tc>
+          <w:tcPr>
+            <w:tcW w:type="dxa" w:w="7776"/>
+            <w:vAlign w:val="center"/>
+            <w:shd w:fill="EAF1F8"/>
+          </w:tcPr>
+          <w:p>
+            <w:r>
+              <w:t>Verify replay, filters, RBAC, and minimized evidence</w:t>
+            </w:r>
+          </w:p>
+        </w:tc>
+      </w:tr>
+      <w:tr>
+        <w:trPr>
+          <w:cantSplit/>
+        </w:trPr>
+        <w:tc>
+          <w:tcPr>
+            <w:tcW w:type="dxa" w:w="2016"/>
+            <w:vAlign w:val="center"/>
+          </w:tcPr>
+          <w:p>
+            <w:r>
+              <w:t>AI-T-052</w:t>
+            </w:r>
+          </w:p>
+        </w:tc>
+        <w:tc>
+          <w:tcPr>
+            <w:tcW w:type="dxa" w:w="7776"/>
+            <w:vAlign w:val="center"/>
+          </w:tcPr>
+          <w:p>
+            <w:r>
+              <w:t>Apply migration 0064 and both client feeds through Docker</w:t>
+            </w:r>
+          </w:p>
+        </w:tc>
+      </w:tr>
     </w:tbl>
     <w:p/>
     <w:p>
@@ -3079,7 +3507,7 @@
         <w:pStyle w:val="Heading1"/>
       </w:pPr>
       <w:r>
-        <w:t>11 Risks and Next Development</w:t>
+        <w:t>12 Risks and Next Development</w:t>
       </w:r>
     </w:p>
     <w:tbl>
@@ -3236,7 +3664,7 @@
           </w:tcPr>
           <w:p>
             <w:r>
-              <w:t>No model or GPU in IX-1 through IX-6</w:t>
+              <w:t>No model or GPU in IX-1 through IX-7</w:t>
             </w:r>
           </w:p>
         </w:tc>
@@ -3548,6 +3976,91 @@
           </w:p>
         </w:tc>
       </w:tr>
+      <w:tr>
+        <w:trPr>
+          <w:cantSplit/>
+        </w:trPr>
+        <w:tc>
+          <w:tcPr>
+            <w:tcW w:type="dxa" w:w="3168"/>
+            <w:vAlign w:val="center"/>
+            <w:shd w:fill="EAF1F8"/>
+          </w:tcPr>
+          <w:p>
+            <w:r>
+              <w:t>Client data overexposure</w:t>
+            </w:r>
+          </w:p>
+        </w:tc>
+        <w:tc>
+          <w:tcPr>
+            <w:tcW w:type="dxa" w:w="6624"/>
+            <w:vAlign w:val="center"/>
+            <w:shd w:fill="EAF1F8"/>
+          </w:tcPr>
+          <w:p>
+            <w:r>
+              <w:t>Allowlisted immutable projection contract</w:t>
+            </w:r>
+          </w:p>
+        </w:tc>
+      </w:tr>
+      <w:tr>
+        <w:trPr>
+          <w:cantSplit/>
+        </w:trPr>
+        <w:tc>
+          <w:tcPr>
+            <w:tcW w:type="dxa" w:w="3168"/>
+            <w:vAlign w:val="center"/>
+          </w:tcPr>
+          <w:p>
+            <w:r>
+              <w:t>Private chat projection</w:t>
+            </w:r>
+          </w:p>
+        </w:tc>
+        <w:tc>
+          <w:tcPr>
+            <w:tcW w:type="dxa" w:w="6624"/>
+            <w:vAlign w:val="center"/>
+          </w:tcPr>
+          <w:p>
+            <w:r>
+              <w:t>Originating owner verification</w:t>
+            </w:r>
+          </w:p>
+        </w:tc>
+      </w:tr>
+      <w:tr>
+        <w:trPr>
+          <w:cantSplit/>
+        </w:trPr>
+        <w:tc>
+          <w:tcPr>
+            <w:tcW w:type="dxa" w:w="3168"/>
+            <w:vAlign w:val="center"/>
+            <w:shd w:fill="EAF1F8"/>
+          </w:tcPr>
+          <w:p>
+            <w:r>
+              <w:t>Client contract drift</w:t>
+            </w:r>
+          </w:p>
+        </w:tc>
+        <w:tc>
+          <w:tcPr>
+            <w:tcW w:type="dxa" w:w="6624"/>
+            <w:vAlign w:val="center"/>
+            <w:shd w:fill="EAF1F8"/>
+          </w:tcPr>
+          <w:p>
+            <w:r>
+              <w:t>Independent ai-evidence-v1 version</w:t>
+            </w:r>
+          </w:p>
+        </w:tc>
+      </w:tr>
     </w:tbl>
     <w:p/>
     <w:sectPr>
@@ -3925,7 +4438,7 @@
     <w:rsid w:val="00FC693F"/>
     <w:rPr>
       <w:rFonts w:ascii="Aptos" w:hAnsi="Aptos"/>
-      <w:sz w:val="20"/>
+      <w:sz w:val="19"/>
     </w:rPr>
   </w:style>
   <w:style w:type="paragraph" w:styleId="Header">

</xml_diff>

<commit_message>
feat(ai-engine): add cross-platform evidence projections (#104)
</commit_message>
<xml_diff>
--- a/docs/ATEP_Volume_IX_AI_Test_Engineer_Engineering_Workbook.docx
+++ b/docs/ATEP_Volume_IX_AI_Test_Engineer_Engineering_Workbook.docx
@@ -19,12 +19,12 @@
         <w:rPr>
           <w:b/>
         </w:rPr>
-        <w:t>Version 0.6.0  Grounded Internal Chat</w:t>
+        <w:t>Version 0.7.0  Cross Platform AI Evidence</w:t>
       </w:r>
     </w:p>
     <w:p>
       <w:r>
-        <w:t>This workbook records the governed AI boundary and deterministic analysis worker for ATEP. IX-1 captures analysis intent, IX-2 produces structured advisory results, and IX-3 converts bounded logs into sanitized timelines and anomaly evidence, while IX-4 adds reviewed test suggestions, IX-5 adds explainable risk evidence, and IX-6 adds private grounded conversations without a paid service, model download, network call, or GPU.</w:t>
+        <w:t>This workbook records the governed AI boundary and deterministic analysis worker for ATEP. IX-1 captures analysis intent, IX-2 produces structured advisory results, and IX-3 converts bounded logs into sanitized timelines and anomaly evidence, while IX-4 adds reviewed test suggestions, IX-5 adds explainable risk evidence, and IX-6 adds private grounded conversations, and IX-7 completes versioned evidence feeds for CarSystemUI and dashboard consumers without a paid service, model download, network call, or GPU.</w:t>
       </w:r>
     </w:p>
     <w:tbl>
@@ -96,7 +96,7 @@
           </w:tcPr>
           <w:p>
             <w:r>
-              <w:t>IX-1 through IX-6 implemented</w:t>
+              <w:t>Volume IX complete through IX-7</w:t>
             </w:r>
           </w:p>
         </w:tc>
@@ -152,7 +152,7 @@
           </w:tcPr>
           <w:p>
             <w:r>
-              <w:t>0057 foundation through 0063 grounded chat</w:t>
+              <w:t>0057 foundation through 0064 evidence projections</w:t>
             </w:r>
           </w:p>
         </w:tc>
@@ -181,7 +181,7 @@
           </w:tcPr>
           <w:p>
             <w:r>
-              <w:t>IX-7 cross-platform AI evidence</w:t>
+              <w:t>Volume X dashboard consumption</w:t>
             </w:r>
           </w:p>
         </w:tc>
@@ -495,6 +495,35 @@
           <w:p>
             <w:r>
               <w:t>Private cited exchanges with bounded retention</w:t>
+            </w:r>
+          </w:p>
+        </w:tc>
+      </w:tr>
+      <w:tr>
+        <w:trPr>
+          <w:cantSplit/>
+        </w:trPr>
+        <w:tc>
+          <w:tcPr>
+            <w:tcW w:type="dxa" w:w="2448"/>
+            <w:vAlign w:val="center"/>
+            <w:shd w:fill="EAF1F8"/>
+          </w:tcPr>
+          <w:p>
+            <w:r>
+              <w:t>Evidence projections</w:t>
+            </w:r>
+          </w:p>
+        </w:tc>
+        <w:tc>
+          <w:tcPr>
+            <w:tcW w:type="dxa" w:w="7344"/>
+            <w:vAlign w:val="center"/>
+            <w:shd w:fill="EAF1F8"/>
+          </w:tcPr>
+          <w:p>
+            <w:r>
+              <w:t>Versioned read-only cards for vehicle UI and dashboard</w:t>
             </w:r>
           </w:p>
         </w:tc>
@@ -2350,7 +2379,323 @@
         <w:pStyle w:val="Heading1"/>
       </w:pPr>
       <w:r>
-        <w:t>10 Verification Catalogue</w:t>
+        <w:t>10 Cross Platform AI Evidence</w:t>
+      </w:r>
+    </w:p>
+    <w:p>
+      <w:r>
+        <w:t>IX-7 derives immutable client cards from persisted AI sources. The allowlisted contract contains subject, status, severity, bounded explanatory text, and governed citations. It excludes source context, prompts, raw logs, signal collections, and every operational mutation path.</w:t>
+      </w:r>
+    </w:p>
+    <w:tbl>
+      <w:tblPr>
+        <w:tblStyle w:val="TableGrid"/>
+        <w:tblW w:type="auto" w:w="0"/>
+        <w:tblLook w:firstColumn="1" w:firstRow="1" w:lastColumn="0" w:lastRow="0" w:noHBand="0" w:noVBand="1" w:val="04A0"/>
+      </w:tblPr>
+      <w:tblGrid>
+        <w:gridCol w:w="3360"/>
+        <w:gridCol w:w="3360"/>
+        <w:gridCol w:w="3360"/>
+      </w:tblGrid>
+      <w:tr>
+        <w:trPr>
+          <w:tblHeader w:val="true"/>
+        </w:trPr>
+        <w:tc>
+          <w:tcPr>
+            <w:tcW w:type="dxa" w:w="2160"/>
+            <w:shd w:fill="1F4E78"/>
+            <w:vAlign w:val="center"/>
+          </w:tcPr>
+          <w:p>
+            <w:r>
+              <w:rPr>
+                <w:b/>
+                <w:color w:val="FFFFFF"/>
+              </w:rPr>
+              <w:t>Control</w:t>
+            </w:r>
+          </w:p>
+        </w:tc>
+        <w:tc>
+          <w:tcPr>
+            <w:tcW w:type="dxa" w:w="3096"/>
+            <w:shd w:fill="1F4E78"/>
+            <w:vAlign w:val="center"/>
+          </w:tcPr>
+          <w:p>
+            <w:r>
+              <w:rPr>
+                <w:b/>
+                <w:color w:val="FFFFFF"/>
+              </w:rPr>
+              <w:t>Rule</w:t>
+            </w:r>
+          </w:p>
+        </w:tc>
+        <w:tc>
+          <w:tcPr>
+            <w:tcW w:type="dxa" w:w="4536"/>
+            <w:shd w:fill="1F4E78"/>
+            <w:vAlign w:val="center"/>
+          </w:tcPr>
+          <w:p>
+            <w:r>
+              <w:rPr>
+                <w:b/>
+                <w:color w:val="FFFFFF"/>
+              </w:rPr>
+              <w:t>Engineering purpose</w:t>
+            </w:r>
+          </w:p>
+        </w:tc>
+      </w:tr>
+      <w:tr>
+        <w:trPr>
+          <w:cantSplit/>
+        </w:trPr>
+        <w:tc>
+          <w:tcPr>
+            <w:tcW w:type="dxa" w:w="2160"/>
+            <w:vAlign w:val="center"/>
+          </w:tcPr>
+          <w:p>
+            <w:r>
+              <w:t>Consumers</w:t>
+            </w:r>
+          </w:p>
+        </w:tc>
+        <w:tc>
+          <w:tcPr>
+            <w:tcW w:type="dxa" w:w="3096"/>
+            <w:vAlign w:val="center"/>
+          </w:tcPr>
+          <w:p>
+            <w:r>
+              <w:t>CarSystemUI or dashboard</w:t>
+            </w:r>
+          </w:p>
+        </w:tc>
+        <w:tc>
+          <w:tcPr>
+            <w:tcW w:type="dxa" w:w="4536"/>
+            <w:vAlign w:val="center"/>
+          </w:tcPr>
+          <w:p>
+            <w:r>
+              <w:t>Keep client contracts explicit</w:t>
+            </w:r>
+          </w:p>
+        </w:tc>
+      </w:tr>
+      <w:tr>
+        <w:trPr>
+          <w:cantSplit/>
+        </w:trPr>
+        <w:tc>
+          <w:tcPr>
+            <w:tcW w:type="dxa" w:w="2160"/>
+            <w:vAlign w:val="center"/>
+            <w:shd w:fill="EAF1F8"/>
+          </w:tcPr>
+          <w:p>
+            <w:r>
+              <w:t>Sources</w:t>
+            </w:r>
+          </w:p>
+        </w:tc>
+        <w:tc>
+          <w:tcPr>
+            <w:tcW w:type="dxa" w:w="3096"/>
+            <w:vAlign w:val="center"/>
+            <w:shd w:fill="EAF1F8"/>
+          </w:tcPr>
+          <w:p>
+            <w:r>
+              <w:t>Five persisted AI types</w:t>
+            </w:r>
+          </w:p>
+        </w:tc>
+        <w:tc>
+          <w:tcPr>
+            <w:tcW w:type="dxa" w:w="4536"/>
+            <w:vAlign w:val="center"/>
+            <w:shd w:fill="EAF1F8"/>
+          </w:tcPr>
+          <w:p>
+            <w:r>
+              <w:t>Prevent arbitrary client-authored claims</w:t>
+            </w:r>
+          </w:p>
+        </w:tc>
+      </w:tr>
+      <w:tr>
+        <w:trPr>
+          <w:cantSplit/>
+        </w:trPr>
+        <w:tc>
+          <w:tcPr>
+            <w:tcW w:type="dxa" w:w="2160"/>
+            <w:vAlign w:val="center"/>
+          </w:tcPr>
+          <w:p>
+            <w:r>
+              <w:t>Summary</w:t>
+            </w:r>
+          </w:p>
+        </w:tc>
+        <w:tc>
+          <w:tcPr>
+            <w:tcW w:type="dxa" w:w="3096"/>
+            <w:vAlign w:val="center"/>
+          </w:tcPr>
+          <w:p>
+            <w:r>
+              <w:t>1000 characters maximum</w:t>
+            </w:r>
+          </w:p>
+        </w:tc>
+        <w:tc>
+          <w:tcPr>
+            <w:tcW w:type="dxa" w:w="4536"/>
+            <w:vAlign w:val="center"/>
+          </w:tcPr>
+          <w:p>
+            <w:r>
+              <w:t>Bound payload and disclosure</w:t>
+            </w:r>
+          </w:p>
+        </w:tc>
+      </w:tr>
+      <w:tr>
+        <w:trPr>
+          <w:cantSplit/>
+        </w:trPr>
+        <w:tc>
+          <w:tcPr>
+            <w:tcW w:type="dxa" w:w="2160"/>
+            <w:vAlign w:val="center"/>
+            <w:shd w:fill="EAF1F8"/>
+          </w:tcPr>
+          <w:p>
+            <w:r>
+              <w:t>Citations</w:t>
+            </w:r>
+          </w:p>
+        </w:tc>
+        <w:tc>
+          <w:tcPr>
+            <w:tcW w:type="dxa" w:w="3096"/>
+            <w:vAlign w:val="center"/>
+            <w:shd w:fill="EAF1F8"/>
+          </w:tcPr>
+          <w:p>
+            <w:r>
+              <w:t>20 unique refs maximum</w:t>
+            </w:r>
+          </w:p>
+        </w:tc>
+        <w:tc>
+          <w:tcPr>
+            <w:tcW w:type="dxa" w:w="4536"/>
+            <w:vAlign w:val="center"/>
+            <w:shd w:fill="EAF1F8"/>
+          </w:tcPr>
+          <w:p>
+            <w:r>
+              <w:t>Preserve reviewable grounding</w:t>
+            </w:r>
+          </w:p>
+        </w:tc>
+      </w:tr>
+      <w:tr>
+        <w:trPr>
+          <w:cantSplit/>
+        </w:trPr>
+        <w:tc>
+          <w:tcPr>
+            <w:tcW w:type="dxa" w:w="2160"/>
+            <w:vAlign w:val="center"/>
+          </w:tcPr>
+          <w:p>
+            <w:r>
+              <w:t>Contract</w:t>
+            </w:r>
+          </w:p>
+        </w:tc>
+        <w:tc>
+          <w:tcPr>
+            <w:tcW w:type="dxa" w:w="3096"/>
+            <w:vAlign w:val="center"/>
+          </w:tcPr>
+          <w:p>
+            <w:r>
+              <w:t>ai-evidence-v1</w:t>
+            </w:r>
+          </w:p>
+        </w:tc>
+        <w:tc>
+          <w:tcPr>
+            <w:tcW w:type="dxa" w:w="4536"/>
+            <w:vAlign w:val="center"/>
+          </w:tcPr>
+          <w:p>
+            <w:r>
+              <w:t>Support independent client evolution</w:t>
+            </w:r>
+          </w:p>
+        </w:tc>
+      </w:tr>
+      <w:tr>
+        <w:trPr>
+          <w:cantSplit/>
+        </w:trPr>
+        <w:tc>
+          <w:tcPr>
+            <w:tcW w:type="dxa" w:w="2160"/>
+            <w:vAlign w:val="center"/>
+            <w:shd w:fill="EAF1F8"/>
+          </w:tcPr>
+          <w:p>
+            <w:r>
+              <w:t>Lifecycle</w:t>
+            </w:r>
+          </w:p>
+        </w:tc>
+        <w:tc>
+          <w:tcPr>
+            <w:tcW w:type="dxa" w:w="3096"/>
+            <w:vAlign w:val="center"/>
+            <w:shd w:fill="EAF1F8"/>
+          </w:tcPr>
+          <w:p>
+            <w:r>
+              <w:t>Immutable snapshot</w:t>
+            </w:r>
+          </w:p>
+        </w:tc>
+        <w:tc>
+          <w:tcPr>
+            <w:tcW w:type="dxa" w:w="4536"/>
+            <w:vAlign w:val="center"/>
+            <w:shd w:fill="EAF1F8"/>
+          </w:tcPr>
+          <w:p>
+            <w:r>
+              <w:t>Preserve historical evidence</w:t>
+            </w:r>
+          </w:p>
+        </w:tc>
+      </w:tr>
+    </w:tbl>
+    <w:p/>
+    <w:p>
+      <w:pPr>
+        <w:pStyle w:val="Heading1"/>
+      </w:pPr>
+      <w:r>
+        <w:t>11 Verification Catalogue</w:t>
       </w:r>
     </w:p>
     <w:tbl>
@@ -3072,6 +3417,89 @@
           </w:p>
         </w:tc>
       </w:tr>
+      <w:tr>
+        <w:trPr>
+          <w:cantSplit/>
+        </w:trPr>
+        <w:tc>
+          <w:tcPr>
+            <w:tcW w:type="dxa" w:w="2016"/>
+            <w:vAlign w:val="center"/>
+          </w:tcPr>
+          <w:p>
+            <w:r>
+              <w:t>AI-T-047 to 049</w:t>
+            </w:r>
+          </w:p>
+        </w:tc>
+        <w:tc>
+          <w:tcPr>
+            <w:tcW w:type="dxa" w:w="7776"/>
+            <w:vAlign w:val="center"/>
+          </w:tcPr>
+          <w:p>
+            <w:r>
+              <w:t>Verify sources, derivation, bounds, and private ownership</w:t>
+            </w:r>
+          </w:p>
+        </w:tc>
+      </w:tr>
+      <w:tr>
+        <w:trPr>
+          <w:cantSplit/>
+        </w:trPr>
+        <w:tc>
+          <w:tcPr>
+            <w:tcW w:type="dxa" w:w="2016"/>
+            <w:vAlign w:val="center"/>
+            <w:shd w:fill="EAF1F8"/>
+          </w:tcPr>
+          <w:p>
+            <w:r>
+              <w:t>AI-T-050 to 051</w:t>
+            </w:r>
+          </w:p>
+        </w:tc>
+        <w:tc>
+          <w:tcPr>
+            <w:tcW w:type="dxa" w:w="7776"/>
+            <w:vAlign w:val="center"/>
+            <w:shd w:fill="EAF1F8"/>
+          </w:tcPr>
+          <w:p>
+            <w:r>
+              <w:t>Verify replay, filters, RBAC, and minimized evidence</w:t>
+            </w:r>
+          </w:p>
+        </w:tc>
+      </w:tr>
+      <w:tr>
+        <w:trPr>
+          <w:cantSplit/>
+        </w:trPr>
+        <w:tc>
+          <w:tcPr>
+            <w:tcW w:type="dxa" w:w="2016"/>
+            <w:vAlign w:val="center"/>
+          </w:tcPr>
+          <w:p>
+            <w:r>
+              <w:t>AI-T-052</w:t>
+            </w:r>
+          </w:p>
+        </w:tc>
+        <w:tc>
+          <w:tcPr>
+            <w:tcW w:type="dxa" w:w="7776"/>
+            <w:vAlign w:val="center"/>
+          </w:tcPr>
+          <w:p>
+            <w:r>
+              <w:t>Apply migration 0064 and both client feeds through Docker</w:t>
+            </w:r>
+          </w:p>
+        </w:tc>
+      </w:tr>
     </w:tbl>
     <w:p/>
     <w:p>
@@ -3079,7 +3507,7 @@
         <w:pStyle w:val="Heading1"/>
       </w:pPr>
       <w:r>
-        <w:t>11 Risks and Next Development</w:t>
+        <w:t>12 Risks and Next Development</w:t>
       </w:r>
     </w:p>
     <w:tbl>
@@ -3236,7 +3664,7 @@
           </w:tcPr>
           <w:p>
             <w:r>
-              <w:t>No model or GPU in IX-1 through IX-6</w:t>
+              <w:t>No model or GPU in IX-1 through IX-7</w:t>
             </w:r>
           </w:p>
         </w:tc>
@@ -3548,6 +3976,91 @@
           </w:p>
         </w:tc>
       </w:tr>
+      <w:tr>
+        <w:trPr>
+          <w:cantSplit/>
+        </w:trPr>
+        <w:tc>
+          <w:tcPr>
+            <w:tcW w:type="dxa" w:w="3168"/>
+            <w:vAlign w:val="center"/>
+            <w:shd w:fill="EAF1F8"/>
+          </w:tcPr>
+          <w:p>
+            <w:r>
+              <w:t>Client data overexposure</w:t>
+            </w:r>
+          </w:p>
+        </w:tc>
+        <w:tc>
+          <w:tcPr>
+            <w:tcW w:type="dxa" w:w="6624"/>
+            <w:vAlign w:val="center"/>
+            <w:shd w:fill="EAF1F8"/>
+          </w:tcPr>
+          <w:p>
+            <w:r>
+              <w:t>Allowlisted immutable projection contract</w:t>
+            </w:r>
+          </w:p>
+        </w:tc>
+      </w:tr>
+      <w:tr>
+        <w:trPr>
+          <w:cantSplit/>
+        </w:trPr>
+        <w:tc>
+          <w:tcPr>
+            <w:tcW w:type="dxa" w:w="3168"/>
+            <w:vAlign w:val="center"/>
+          </w:tcPr>
+          <w:p>
+            <w:r>
+              <w:t>Private chat projection</w:t>
+            </w:r>
+          </w:p>
+        </w:tc>
+        <w:tc>
+          <w:tcPr>
+            <w:tcW w:type="dxa" w:w="6624"/>
+            <w:vAlign w:val="center"/>
+          </w:tcPr>
+          <w:p>
+            <w:r>
+              <w:t>Originating owner verification</w:t>
+            </w:r>
+          </w:p>
+        </w:tc>
+      </w:tr>
+      <w:tr>
+        <w:trPr>
+          <w:cantSplit/>
+        </w:trPr>
+        <w:tc>
+          <w:tcPr>
+            <w:tcW w:type="dxa" w:w="3168"/>
+            <w:vAlign w:val="center"/>
+            <w:shd w:fill="EAF1F8"/>
+          </w:tcPr>
+          <w:p>
+            <w:r>
+              <w:t>Client contract drift</w:t>
+            </w:r>
+          </w:p>
+        </w:tc>
+        <w:tc>
+          <w:tcPr>
+            <w:tcW w:type="dxa" w:w="6624"/>
+            <w:vAlign w:val="center"/>
+            <w:shd w:fill="EAF1F8"/>
+          </w:tcPr>
+          <w:p>
+            <w:r>
+              <w:t>Independent ai-evidence-v1 version</w:t>
+            </w:r>
+          </w:p>
+        </w:tc>
+      </w:tr>
     </w:tbl>
     <w:p/>
     <w:sectPr>
@@ -3925,7 +4438,7 @@
     <w:rsid w:val="00FC693F"/>
     <w:rPr>
       <w:rFonts w:ascii="Aptos" w:hAnsi="Aptos"/>
-      <w:sz w:val="20"/>
+      <w:sz w:val="19"/>
     </w:rPr>
   </w:style>
   <w:style w:type="paragraph" w:styleId="Header">

</xml_diff>